<commit_message>
Use the late team files: 180 notes, 182 slides, Farghal & Shunnaq notes
- Handbook: a few examples from the 180 notes and 182 slides (Ch 7, 8,
  11, 16, 21); Farghal & Shunnaq cited in Ch 11, 14-16 and updated to the
  2011 edition the team used; terminologist definition aligned with the
  slides; contributor name corrected to Loulwah Bin Saeed
- Final and Contributions reports updated with what was received, what
  is still missing, and new items to confirm

Co-Authored-By: Claude Opus 5.5 <noreply@anthropic.com>
Claude-Session: https://claude.ai/code/session_01VkNWz9zCVkDAANuF8jpQYy
</commit_message>
<xml_diff>
--- a/Handbook-Contributions-Report.docx
+++ b/Handbook-Contributions-Report.docx
@@ -341,7 +341,24 @@
                 <w:sz w:val="19"/>
                 <w:szCs w:val="19"/>
               </w:rPr>
-              <w:t xml:space="preserve">First draft; plan and recommendations; Text Analysis Model; terminology selection (with Masooma)</w:t>
+              <w:t xml:space="preserve">First draft; plan and recommendations; 180 course notes; Translation 1 notes; notes on Farghal &amp; Shunnaq; Text Analysis Model; </w:t>
+            </w:r>
+            <w:r>
+              <w:rPr>
+                <w:rFonts w:ascii="Arial" w:cs="Arial" w:hAnsi="Arial"/>
+                <w:sz w:val="19"/>
+                <w:szCs w:val="20"/>
+                <w:rtl/>
+              </w:rPr>
+              <w:t xml:space="preserve">الترجمة: ماهيتها وكيفيتها</w:t>
+            </w:r>
+            <w:r>
+              <w:rPr>
+                <w:rFonts w:ascii="Arial" w:cs="Arial" w:eastAsia="Arial" w:hAnsi="Arial"/>
+                <w:sz w:val="19"/>
+                <w:szCs w:val="19"/>
+              </w:rPr>
+              <w:t xml:space="preserve">; terminology selection (with Masooma)</w:t>
             </w:r>
           </w:p>
         </w:tc>
@@ -466,7 +483,7 @@
                 <w:sz w:val="19"/>
                 <w:szCs w:val="19"/>
               </w:rPr>
-              <w:t xml:space="preserve">Terminology chapter (selected with Samiuallah)</w:t>
+              <w:t xml:space="preserve">Terminology slides (182) and the chapter selected from them with Samiuallah; the idea of an opening chapter of tips</w:t>
             </w:r>
           </w:p>
         </w:tc>
@@ -561,7 +578,7 @@
                 <w:sz w:val="19"/>
                 <w:szCs w:val="19"/>
               </w:rPr>
-              <w:t xml:space="preserve">Loulwah Saeed</w:t>
+              <w:t xml:space="preserve">Loulwah Bin Saeed</w:t>
             </w:r>
           </w:p>
         </w:tc>
@@ -999,15 +1016,49 @@
         <w:rPr>
           <w:rFonts w:ascii="Arial" w:cs="Arial" w:eastAsia="Arial" w:hAnsi="Arial"/>
         </w:rPr>
-        <w:t xml:space="preserve">I left out 51 items. Some were wrong or unclear (“Principles = Foundations”, “mule” as a synonym of “horse”) and would confuse a beginner. The figure of “74 fields” for the Jordanian academy could not be confirmed. A few examples were not neutral, such as a news agency described as biased, or a Qur’anic verse offered as the equivalent of an English proverb. The invented words (tribocracy, puppycracy) are not real English. Some exercise items were dropped only for space and could be used in a later exercise set.</w:t>
-      </w:r>
-    </w:p>
-    <w:p>
-      <w:pPr>
-        <w:pStyle w:val="Heading2"/>
-      </w:pPr>
-      <w:r>
-        <w:t xml:space="preserve">3.2 Plan and recommendations</w:t>
+        <w:t xml:space="preserve">His 180 notes, Translation 1 notes and notes on Farghal &amp; Shunnaq reached me after the draft. They turned out to be its sources, so almost all of their content was already in the handbook. I added a few examples from them (</w:t>
+      </w:r>
+      <w:r>
+        <w:rPr>
+          <w:rFonts w:ascii="Arial" w:cs="Arial" w:eastAsia="Arial" w:hAnsi="Arial"/>
+          <w:i/>
+          <w:iCs/>
+        </w:rPr>
+        <w:t xml:space="preserve">weak coffee</w:t>
+      </w:r>
+      <w:r>
+        <w:rPr>
+          <w:rFonts w:ascii="Arial" w:cs="Arial" w:eastAsia="Arial" w:hAnsi="Arial"/>
+        </w:rPr>
+        <w:t xml:space="preserve">, </w:t>
+      </w:r>
+      <w:r>
+        <w:rPr>
+          <w:rFonts w:ascii="Arial" w:cs="Arial" w:eastAsia="Arial" w:hAnsi="Arial"/>
+          <w:i/>
+          <w:iCs/>
+        </w:rPr>
+        <w:t xml:space="preserve">a rough sea</w:t>
+      </w:r>
+      <w:r>
+        <w:rPr>
+          <w:rFonts w:ascii="Arial" w:cs="Arial" w:eastAsia="Arial" w:hAnsi="Arial"/>
+        </w:rPr>
+        <w:t xml:space="preserve">, </w:t>
+      </w:r>
+      <w:r>
+        <w:rPr>
+          <w:rFonts w:ascii="Arial" w:cs="Arial" w:eastAsia="Arial" w:hAnsi="Arial"/>
+          <w:i/>
+          <w:iCs/>
+        </w:rPr>
+        <w:t xml:space="preserve">to be in the red</w:t>
+      </w:r>
+      <w:r>
+        <w:rPr>
+          <w:rFonts w:ascii="Arial" w:cs="Arial" w:eastAsia="Arial" w:hAnsi="Arial"/>
+        </w:rPr>
+        <w:t xml:space="preserve">), and cited Farghal &amp; Shunnaq in the chapters that follow the book (Chapters 9, 11, 14, 15 and 16), using the 2011 edition the team worked from. The draft’s numbered exercises also come from this book.</w:t>
       </w:r>
     </w:p>
     <w:p>
@@ -1019,7 +1070,15 @@
         <w:rPr>
           <w:rFonts w:ascii="Arial" w:cs="Arial" w:eastAsia="Arial" w:hAnsi="Arial"/>
         </w:rPr>
-        <w:t xml:space="preserve">Most of the plan was followed: the order from easy to hard, the missing strategies and types of translation, the seven procedures, the tips at the start, and the chapters on analysis, commentary, dictionaries, terminology, machine translation, genres, common mistakes and the risk matrix.</w:t>
+        <w:t xml:space="preserve">I left out 51 items. Some were wrong or unclear (“Principles = Foundations”, “mule” as a synonym of “horse”) and would confuse a beginner. The figure of “74 fields” for the Jordanian academy could not be confirmed. A few examples were not neutral, such as a news agency described as biased, or a Qur’anic verse offered as the equivalent of an English proverb. The invented words (tribocracy, puppycracy) are not real English. Some exercise items were dropped only for space and could be used in a later exercise set.</w:t>
+      </w:r>
+    </w:p>
+    <w:p>
+      <w:pPr>
+        <w:pStyle w:val="Heading2"/>
+      </w:pPr>
+      <w:r>
+        <w:t xml:space="preserve">3.2 Plan and recommendations</w:t>
       </w:r>
     </w:p>
     <w:p>
@@ -1031,7 +1090,19 @@
         <w:rPr>
           <w:rFonts w:ascii="Arial" w:cs="Arial" w:eastAsia="Arial" w:hAnsi="Arial"/>
         </w:rPr>
-        <w:t xml:space="preserve">Some requests were only partly met. The glossary covers the terms listed at the end of each chapter but not every term mentioned in the text. News is taught through headlines rather than a full article, and the relational model appears as three practical questions in Chapter 19. The practice section, the checklists and the note on future editions were written and later removed (Section 7). Six requests could not be done because the material never reached me: the examples from “the book”, the 180, 182, 386 and Analysis texts, the text </w:t>
+        <w:t xml:space="preserve">Most of the plan was followed: the order from easy to hard, the missing strategies and types of translation, the seven procedures, the tips at the start, and the chapters on analysis, commentary, dictionaries, terminology, machine translation, genres, common mistakes and the risk matrix.</w:t>
+      </w:r>
+    </w:p>
+    <w:p>
+      <w:pPr>
+        <w:spacing w:after="140" w:line="300"/>
+        <w:jc w:val="both"/>
+      </w:pPr>
+      <w:r>
+        <w:rPr>
+          <w:rFonts w:ascii="Arial" w:cs="Arial" w:eastAsia="Arial" w:hAnsi="Arial"/>
+        </w:rPr>
+        <w:t xml:space="preserve">Some requests were only partly met. The glossary covers the terms listed at the end of each chapter but not every term mentioned in the text. News is taught through headlines rather than a full article, and the relational model appears as three practical questions in Chapter 19. The practice section, the checklists and the note on future editions were written and later removed (Section 7). A few requests could not be done: “the book” is not yet published, the 386 and Analysis texts did not reach me, and the checklist for the supervisor’s framework was not written. The text </w:t>
       </w:r>
       <w:r>
         <w:rPr>
@@ -1039,13 +1110,41 @@
           <w:szCs w:val="23"/>
           <w:rtl/>
         </w:rPr>
-        <w:t xml:space="preserve">الترجمة: ماهيتها</w:t>
-      </w:r>
-      <w:r>
-        <w:rPr>
-          <w:rFonts w:ascii="Arial" w:cs="Arial" w:eastAsia="Arial" w:hAnsi="Arial"/>
-        </w:rPr>
-        <w:t xml:space="preserve"> and Dr Abdullah’s framework.</w:t>
+        <w:t xml:space="preserve">الترجمة: ماهيتها وكيفيتها</w:t>
+      </w:r>
+      <w:r>
+        <w:rPr>
+          <w:rFonts w:ascii="Arial" w:cs="Arial" w:eastAsia="Arial" w:hAnsi="Arial"/>
+        </w:rPr>
+        <w:t xml:space="preserve"> arrived late; it names no author, so it cannot be cited, and I took only two idioms from it (</w:t>
+      </w:r>
+      <w:r>
+        <w:rPr>
+          <w:rFonts w:ascii="Arial" w:cs="Arial" w:eastAsia="Arial" w:hAnsi="Arial"/>
+          <w:i/>
+          <w:iCs/>
+        </w:rPr>
+        <w:t xml:space="preserve">He looks blue</w:t>
+      </w:r>
+      <w:r>
+        <w:rPr>
+          <w:rFonts w:ascii="Arial" w:cs="Arial" w:eastAsia="Arial" w:hAnsi="Arial"/>
+        </w:rPr>
+        <w:t xml:space="preserve">, </w:t>
+      </w:r>
+      <w:r>
+        <w:rPr>
+          <w:rFonts w:ascii="Arial" w:cs="Arial" w:eastAsia="Arial" w:hAnsi="Arial"/>
+          <w:i/>
+          <w:iCs/>
+        </w:rPr>
+        <w:t xml:space="preserve">I will go bananas</w:t>
+      </w:r>
+      <w:r>
+        <w:rPr>
+          <w:rFonts w:ascii="Arial" w:cs="Arial" w:eastAsia="Arial" w:hAnsi="Arial"/>
+        </w:rPr>
+        <w:t xml:space="preserve">).</w:t>
       </w:r>
     </w:p>
     <w:p>
@@ -1085,7 +1184,7 @@
         <w:rPr>
           <w:rFonts w:ascii="Arial" w:cs="Arial" w:eastAsia="Arial" w:hAnsi="Arial"/>
         </w:rPr>
-        <w:t xml:space="preserve">Chapter 21 is built on the terminology chapter. It keeps the definition of terminology, the difference between a translator and a terminologist, why terms need to be managed, short forms, what makes a good term, the Arabic language academies, how to translate a term, term lists, termbases, and the rule of one term for one idea.</w:t>
+        <w:t xml:space="preserve">Chapter 21 is built on the terminology chapter, which was selected from Masooma’s course slides. It keeps the definition of terminology, the difference between a translator and a terminologist, why terms need to be managed, short forms, what makes a good term, the Arabic language academies, how to translate a term, term lists, termbases, and the rule of one term for one idea.</w:t>
       </w:r>
     </w:p>
     <w:p>
@@ -1097,15 +1196,105 @@
         <w:rPr>
           <w:rFonts w:ascii="Arial" w:cs="Arial" w:eastAsia="Arial" w:hAnsi="Arial"/>
         </w:rPr>
-        <w:t xml:space="preserve">I corrected the definition of a terminologist and a few historical details, then cut the history and schools of terminology, the categories of terms, most of the nine naming rules and the standardisation bodies, since beginners do not need them. The academies’ detailed methods were removed because I could not find a source for them. Because the chapter cited no sources, I added them, together with UNTERM, Arabterm, a sample term list and medical examples.</w:t>
-      </w:r>
-    </w:p>
-    <w:p>
-      <w:pPr>
-        <w:pStyle w:val="Heading1"/>
-      </w:pPr>
-      <w:r>
-        <w:t xml:space="preserve">5. Loulwah Saeed</w:t>
+        <w:t xml:space="preserve">I corrected the definition of a terminologist and a few historical details, then cut the history and schools of terminology, the categories of terms, most of the nine naming rules and the standardisation bodies, since beginners do not need them. The academies’ detailed methods were also left out as too detailed; I first thought they had no source, but they come from her slides. When the slides reached me, I checked Chapter 21 against them and added a few of their examples: </w:t>
+      </w:r>
+      <w:r>
+        <w:rPr>
+          <w:rFonts w:ascii="Arial" w:cs="Arial" w:hAnsi="Arial"/>
+          <w:szCs w:val="23"/>
+          <w:rtl/>
+        </w:rPr>
+        <w:t xml:space="preserve">عقارب الساعة</w:t>
+      </w:r>
+      <w:r>
+        <w:rPr>
+          <w:rFonts w:ascii="Arial" w:cs="Arial" w:eastAsia="Arial" w:hAnsi="Arial"/>
+        </w:rPr>
+        <w:t xml:space="preserve">, </w:t>
+      </w:r>
+      <w:r>
+        <w:rPr>
+          <w:rFonts w:ascii="Arial" w:cs="Arial" w:eastAsia="Arial" w:hAnsi="Arial"/>
+          <w:i/>
+          <w:iCs/>
+        </w:rPr>
+        <w:t xml:space="preserve">a throbbing headache</w:t>
+      </w:r>
+      <w:r>
+        <w:rPr>
+          <w:rFonts w:ascii="Arial" w:cs="Arial" w:eastAsia="Arial" w:hAnsi="Arial"/>
+        </w:rPr>
+        <w:t xml:space="preserve">, </w:t>
+      </w:r>
+      <w:r>
+        <w:rPr>
+          <w:rFonts w:ascii="Arial" w:cs="Arial" w:hAnsi="Arial"/>
+          <w:szCs w:val="23"/>
+          <w:rtl/>
+        </w:rPr>
+        <w:t xml:space="preserve">الاستمطار</w:t>
+      </w:r>
+      <w:r>
+        <w:rPr>
+          <w:rFonts w:ascii="Arial" w:cs="Arial" w:eastAsia="Arial" w:hAnsi="Arial"/>
+        </w:rPr>
+        <w:t xml:space="preserve">, </w:t>
+      </w:r>
+      <w:r>
+        <w:rPr>
+          <w:rFonts w:ascii="Arial" w:cs="Arial" w:hAnsi="Arial"/>
+          <w:szCs w:val="23"/>
+          <w:rtl/>
+        </w:rPr>
+        <w:t xml:space="preserve">قطار</w:t>
+      </w:r>
+      <w:r>
+        <w:rPr>
+          <w:rFonts w:ascii="Arial" w:cs="Arial" w:eastAsia="Arial" w:hAnsi="Arial"/>
+        </w:rPr>
+        <w:t xml:space="preserve">, affixes such as </w:t>
+      </w:r>
+      <w:r>
+        <w:rPr>
+          <w:rFonts w:ascii="Arial" w:cs="Arial" w:eastAsia="Arial" w:hAnsi="Arial"/>
+          <w:i/>
+          <w:iCs/>
+        </w:rPr>
+        <w:t xml:space="preserve">manageable</w:t>
+      </w:r>
+      <w:r>
+        <w:rPr>
+          <w:rFonts w:ascii="Arial" w:cs="Arial" w:eastAsia="Arial" w:hAnsi="Arial"/>
+        </w:rPr>
+        <w:t xml:space="preserve"> and </w:t>
+      </w:r>
+      <w:r>
+        <w:rPr>
+          <w:rFonts w:ascii="Arial" w:cs="Arial" w:eastAsia="Arial" w:hAnsi="Arial"/>
+          <w:i/>
+          <w:iCs/>
+        </w:rPr>
+        <w:t xml:space="preserve">antibiotic</w:t>
+      </w:r>
+      <w:r>
+        <w:rPr>
+          <w:rFonts w:ascii="Arial" w:cs="Arial" w:eastAsia="Arial" w:hAnsi="Arial"/>
+        </w:rPr>
+        <w:t xml:space="preserve">, and the redundant term </w:t>
+      </w:r>
+      <w:r>
+        <w:rPr>
+          <w:rFonts w:ascii="Arial" w:cs="Arial" w:hAnsi="Arial"/>
+          <w:szCs w:val="23"/>
+          <w:rtl/>
+        </w:rPr>
+        <w:t xml:space="preserve">التطرّف الراديكالي</w:t>
+      </w:r>
+      <w:r>
+        <w:rPr>
+          <w:rFonts w:ascii="Arial" w:cs="Arial" w:eastAsia="Arial" w:hAnsi="Arial"/>
+        </w:rPr>
+        <w:t xml:space="preserve">. The chapter itself cited no sources, so I added them, together with UNTERM, Arabterm, a sample term list and medical examples.</w:t>
       </w:r>
     </w:p>
     <w:p>
@@ -1117,7 +1306,43 @@
         <w:rPr>
           <w:rFonts w:ascii="Arial" w:cs="Arial" w:eastAsia="Arial" w:hAnsi="Arial"/>
         </w:rPr>
-        <w:t xml:space="preserve">Chapters 26 and 27 come mainly from the audiovisual translation notes: why the field matters, its main types, dubbing, the idea that purpose comes first, subtitles, the link between words, images and sound, language variety, cultural references, subtitling strategies and taboo language.</w:t>
+        <w:t xml:space="preserve">Chapter 2, “Tips, advice and preparation”, follows her suggestion of an opening chapter that prepares students before they start. Several idioms on her list, such as </w:t>
+      </w:r>
+      <w:r>
+        <w:rPr>
+          <w:rFonts w:ascii="Arial" w:cs="Arial" w:eastAsia="Arial" w:hAnsi="Arial"/>
+          <w:i/>
+          <w:iCs/>
+        </w:rPr>
+        <w:t xml:space="preserve">spill the beans</w:t>
+      </w:r>
+      <w:r>
+        <w:rPr>
+          <w:rFonts w:ascii="Arial" w:cs="Arial" w:eastAsia="Arial" w:hAnsi="Arial"/>
+        </w:rPr>
+        <w:t xml:space="preserve"> and </w:t>
+      </w:r>
+      <w:r>
+        <w:rPr>
+          <w:rFonts w:ascii="Arial" w:cs="Arial" w:eastAsia="Arial" w:hAnsi="Arial"/>
+          <w:i/>
+          <w:iCs/>
+        </w:rPr>
+        <w:t xml:space="preserve">raining cats and dogs</w:t>
+      </w:r>
+      <w:r>
+        <w:rPr>
+          <w:rFonts w:ascii="Arial" w:cs="Arial" w:eastAsia="Arial" w:hAnsi="Arial"/>
+        </w:rPr>
+        <w:t xml:space="preserve">, are already in Chapter 8; most of the others are American slang, so I did not add them.</w:t>
+      </w:r>
+    </w:p>
+    <w:p>
+      <w:pPr>
+        <w:pStyle w:val="Heading1"/>
+      </w:pPr>
+      <w:r>
+        <w:t xml:space="preserve">5. Loulwah Bin Saeed</w:t>
       </w:r>
     </w:p>
     <w:p>
@@ -1129,7 +1354,7 @@
         <w:rPr>
           <w:rFonts w:ascii="Arial" w:cs="Arial" w:eastAsia="Arial" w:hAnsi="Arial"/>
         </w:rPr>
-        <w:t xml:space="preserve">I merged the two lists of subtitling strategies into one, corrected the spelling of Vermeer, Díaz Cintas and Remael, and changed the line length to the usual 37 to 39 characters (up to 42 on streaming platforms). The history of the field, three of the four theories, the summary on the Arab world and the YouTube links were not used: the theory goes beyond what a beginner needs, and links stop working in print. I added subtitle timing, subtitles for the deaf and hard of hearing, a five-step method, a worked example and rules for Arabic subtitles.</w:t>
+        <w:t xml:space="preserve">Chapters 26 and 27 come mainly from the audiovisual translation notes: why the field matters, its main types, dubbing, the idea that purpose comes first, subtitles, the link between words, images and sound, language variety, cultural references, subtitling strategies and taboo language.</w:t>
       </w:r>
     </w:p>
     <w:p>
@@ -1141,7 +1366,19 @@
         <w:rPr>
           <w:rFonts w:ascii="Arial" w:cs="Arial" w:eastAsia="Arial" w:hAnsi="Arial"/>
         </w:rPr>
-        <w:t xml:space="preserve">The notes on machine translation and dictionaries and the Principles of Translation notes did not reach me, so Chapters 10, 13, 20 and 22 were written from published sources.</w:t>
+        <w:t xml:space="preserve">I merged the two lists of subtitling strategies into one, corrected the spelling of Vermeer, Díaz Cintas and Remael, and changed the line length to the usual 37 to 39 characters (up to 42 on streaming platforms). The history of the field, three of the four theories, the summary on the Arab world and the YouTube links were not used: the theory goes beyond what a beginner needs, and links stop working in print. I added subtitle timing, subtitles for the deaf and hard of hearing, a five-step method, a worked example and rules for Arabic subtitles.</w:t>
+      </w:r>
+    </w:p>
+    <w:p>
+      <w:pPr>
+        <w:spacing w:after="140" w:line="300"/>
+        <w:jc w:val="both"/>
+      </w:pPr>
+      <w:r>
+        <w:rPr>
+          <w:rFonts w:ascii="Arial" w:cs="Arial" w:eastAsia="Arial" w:hAnsi="Arial"/>
+        </w:rPr>
+        <w:t xml:space="preserve">Loulwah posted the audiovisual files herself, which confirms they are her notes. Her other notes were lost, and her Principles of Translation notes did not reach me, so Chapters 10, 13, 20 and 22 were written from published sources. Her idiom list could not be used without corrections, and Chapter 8 already covers the common idioms.</w:t>
       </w:r>
     </w:p>
     <w:p>
@@ -1503,7 +1740,7 @@
                 <w:sz w:val="19"/>
                 <w:szCs w:val="19"/>
               </w:rPr>
-              <w:t xml:space="preserve">Not needed in a first edition.</w:t>
+              <w:t xml:space="preserve">A printed book cannot keep being updated; the website carries later material instead.</w:t>
             </w:r>
           </w:p>
         </w:tc>
@@ -1910,7 +2147,24 @@
           <w:rFonts w:ascii="Arial" w:cs="Arial" w:eastAsia="Arial" w:hAnsi="Arial"/>
           <w:color w:val="C00000"/>
         </w:rPr>
-        <w:t xml:space="preserve">That the audiovisual notes are Loulwah’s.</w:t>
+        <w:t xml:space="preserve">Whether to list all four contributors alphabetically, as the framework agreed, and whether to name the academic supervisor, Abdullah Bezea.</w:t>
+      </w:r>
+    </w:p>
+    <w:p>
+      <w:pPr>
+        <w:pStyle w:val="ListParagraph"/>
+        <w:numPr>
+          <w:ilvl w:val="0"/>
+          <w:numId w:val="2"/>
+        </w:numPr>
+        <w:spacing w:after="80" w:line="290"/>
+      </w:pPr>
+      <w:r>
+        <w:rPr>
+          <w:rFonts w:ascii="Arial" w:cs="Arial" w:eastAsia="Arial" w:hAnsi="Arial"/>
+          <w:color w:val="C00000"/>
+        </w:rPr>
+        <w:t xml:space="preserve">The club’s official name: the handbook says “Guild Professional Club”; the team’s main document says “The Professional English Club: Guild”.</w:t>
       </w:r>
     </w:p>
     <w:p>

</xml_diff>

<commit_message>
Chapter 21: guided steps from Shaikha's terminology class notes
- Multi-word terms, researching a new field, checking a term's parts
  against context, confirming equivalents in original Arabic texts,
  one-sentence definitions, and terms with two accepted names
- Reports credit these to Shaikha's terminology class notes; removed
  the reference to university rules from the report checklists

Co-Authored-By: Claude Opus 5.5 <noreply@anthropic.com>
Claude-Session: https://claude.ai/code/session_01VkNWz9zCVkDAANuF8jpQYy
</commit_message>
<xml_diff>
--- a/Handbook-Contributions-Report.docx
+++ b/Handbook-Contributions-Report.docx
@@ -733,7 +733,7 @@
                 <w:sz w:val="19"/>
                 <w:szCs w:val="19"/>
               </w:rPr>
-              <w:t xml:space="preserve">My study notes; structure, editing, covers, layout, website</w:t>
+              <w:t xml:space="preserve">My study notes; my terminology class notes; structure, editing, covers, layout, website</w:t>
             </w:r>
           </w:p>
         </w:tc>
@@ -763,7 +763,7 @@
                 <w:sz w:val="19"/>
                 <w:szCs w:val="19"/>
               </w:rPr>
-              <w:t xml:space="preserve">12 chapters (see Section 6)</w:t>
+              <w:t xml:space="preserve">12 chapters, and Chapter 21 (see Section 6)</w:t>
             </w:r>
           </w:p>
         </w:tc>
@@ -793,7 +793,7 @@
                 <w:sz w:val="19"/>
                 <w:szCs w:val="19"/>
               </w:rPr>
-              <w:t xml:space="preserve">All</w:t>
+              <w:t xml:space="preserve">Used selectively, to keep the book at beginner level</w:t>
             </w:r>
           </w:p>
         </w:tc>
@@ -1455,6 +1455,88 @@
           <w:rFonts w:ascii="Arial" w:cs="Arial" w:eastAsia="Arial" w:hAnsi="Arial"/>
         </w:rPr>
         <w:t xml:space="preserve">. Where the team’s material had gaps, I added sections from published sources, among them the seven procedures, communicative translation, explicitation and implicitation, genres, dictionaries, common mistakes and the risk matrix. I also designed the two covers, the layout, the QR code and the team’s website.</w:t>
+      </w:r>
+    </w:p>
+    <w:p>
+      <w:pPr>
+        <w:spacing w:after="140" w:line="300"/>
+        <w:jc w:val="both"/>
+      </w:pPr>
+      <w:r>
+        <w:rPr>
+          <w:rFonts w:ascii="Arial" w:cs="Arial" w:eastAsia="Arial" w:hAnsi="Arial"/>
+        </w:rPr>
+        <w:t xml:space="preserve">I also went through the slides of the terminology course I took and extracted the practical steps a beginner needs, which now guide Chapter 21: a term can be several words (</w:t>
+      </w:r>
+      <w:r>
+        <w:rPr>
+          <w:rFonts w:ascii="Arial" w:cs="Arial" w:eastAsia="Arial" w:hAnsi="Arial"/>
+          <w:i/>
+          <w:iCs/>
+        </w:rPr>
+        <w:t xml:space="preserve">network security</w:t>
+      </w:r>
+      <w:r>
+        <w:rPr>
+          <w:rFonts w:ascii="Arial" w:cs="Arial" w:eastAsia="Arial" w:hAnsi="Arial"/>
+        </w:rPr>
+        <w:t xml:space="preserve">); read a short introduction to a new field, and ask the client or a specialist when the meaning is unclear; do not trust a term’s parts alone (</w:t>
+      </w:r>
+      <w:r>
+        <w:rPr>
+          <w:rFonts w:ascii="Arial" w:cs="Arial" w:eastAsia="Arial" w:hAnsi="Arial"/>
+          <w:i/>
+          <w:iCs/>
+        </w:rPr>
+        <w:t xml:space="preserve">blackboard</w:t>
+      </w:r>
+      <w:r>
+        <w:rPr>
+          <w:rFonts w:ascii="Arial" w:cs="Arial" w:eastAsia="Arial" w:hAnsi="Arial"/>
+        </w:rPr>
+        <w:t xml:space="preserve">); confirm an equivalent in a text written in Arabic, not in a translation; write a one-sentence definition (</w:t>
+      </w:r>
+      <w:r>
+        <w:rPr>
+          <w:rFonts w:ascii="Arial" w:cs="Arial" w:eastAsia="Arial" w:hAnsi="Arial"/>
+          <w:i/>
+          <w:iCs/>
+        </w:rPr>
+        <w:t xml:space="preserve">thermometer</w:t>
+      </w:r>
+      <w:r>
+        <w:rPr>
+          <w:rFonts w:ascii="Arial" w:cs="Arial" w:eastAsia="Arial" w:hAnsi="Arial"/>
+        </w:rPr>
+        <w:t xml:space="preserve">); and choose one of two accepted names (</w:t>
+      </w:r>
+      <w:r>
+        <w:rPr>
+          <w:rFonts w:ascii="Arial" w:cs="Arial" w:eastAsia="Arial" w:hAnsi="Arial"/>
+          <w:i/>
+          <w:iCs/>
+        </w:rPr>
+        <w:t xml:space="preserve">aerial</w:t>
+      </w:r>
+      <w:r>
+        <w:rPr>
+          <w:rFonts w:ascii="Arial" w:cs="Arial" w:eastAsia="Arial" w:hAnsi="Arial"/>
+        </w:rPr>
+        <w:t xml:space="preserve"> / </w:t>
+      </w:r>
+      <w:r>
+        <w:rPr>
+          <w:rFonts w:ascii="Arial" w:cs="Arial" w:eastAsia="Arial" w:hAnsi="Arial"/>
+          <w:i/>
+          <w:iCs/>
+        </w:rPr>
+        <w:t xml:space="preserve">antenna</w:t>
+      </w:r>
+      <w:r>
+        <w:rPr>
+          <w:rFonts w:ascii="Arial" w:cs="Arial" w:eastAsia="Arial" w:hAnsi="Arial"/>
+        </w:rPr>
+        <w:t xml:space="preserve">). I left out the theory, the history of the field and the detailed record formats, which a beginner does not need.</w:t>
       </w:r>
     </w:p>
     <w:p>

</xml_diff>

<commit_message>
Lasting edition: new order, guided path, Did you know boxes, closing section
- Dictionaries chapter moved into Part 1 (now Chapter 3); all chapter
  numbers and cross-references updated in the handbook and reports
- Every Remember box ends with Next; new closing section, Your journey
  continues; stronger Start here opening
- Ten Did you know? boxes with well-documented facts; one dated example
  replaced; contents page tightened
- Contributions Report rewritten by member (added, edited, removed and
  why), with Shaikhah Alkhaledi's work named and itemised

Co-Authored-By: Claude Opus 5.5 <noreply@anthropic.com>
Claude-Session: https://claude.ai/code/session_01VkNWz9zCVkDAANuF8jpQYy
</commit_message>
<xml_diff>
--- a/Handbook-Contributions-Report.docx
+++ b/Handbook-Contributions-Report.docx
@@ -127,7 +127,7 @@
         <w:rPr>
           <w:rFonts w:ascii="Arial" w:cs="Arial" w:eastAsia="Arial" w:hAnsi="Arial"/>
         </w:rPr>
-        <w:t xml:space="preserve">This report explains how each member’s material was used in the handbook, what I changed, what I left out and why. A point-by-point record is kept in the Appendix: The Team’s Documents, for anyone who wants the detail.</w:t>
+        <w:t xml:space="preserve">This report records, for each member of the Translation Team, what was taken into the handbook, what was edited, and what was left out and why. The point-by-point record is in the Appendix: The Team’s Documents.</w:t>
       </w:r>
     </w:p>
     <w:tbl>
@@ -143,9 +143,8 @@
         </w:tblBorders>
       </w:tblPr>
       <w:tblGrid>
-        <w:gridCol w:w="1633"/>
-        <w:gridCol w:w="2721"/>
-        <w:gridCol w:w="1996"/>
+        <w:gridCol w:w="1814"/>
+        <w:gridCol w:w="4536"/>
         <w:gridCol w:w="2721"/>
       </w:tblGrid>
       <w:tr>
@@ -154,7 +153,7 @@
         </w:trPr>
         <w:tc>
           <w:tcPr>
-            <w:tcW w:type="dxa" w:w="1633"/>
+            <w:tcW w:type="dxa" w:w="1814"/>
             <w:tcBorders>
               <w:top w:val="single" w:color="000000" w:sz="4"/>
               <w:left w:val="single" w:color="000000" w:sz="4"/>
@@ -186,7 +185,7 @@
         </w:tc>
         <w:tc>
           <w:tcPr>
-            <w:tcW w:type="dxa" w:w="2721"/>
+            <w:tcW w:type="dxa" w:w="4536"/>
             <w:tcBorders>
               <w:top w:val="single" w:color="000000" w:sz="4"/>
               <w:left w:val="single" w:color="000000" w:sz="4"/>
@@ -218,7 +217,7 @@
         </w:tc>
         <w:tc>
           <w:tcPr>
-            <w:tcW w:type="dxa" w:w="1996"/>
+            <w:tcW w:type="dxa" w:w="2721"/>
             <w:tcBorders>
               <w:top w:val="single" w:color="000000" w:sz="4"/>
               <w:left w:val="single" w:color="000000" w:sz="4"/>
@@ -245,38 +244,6 @@
                 <w:szCs w:val="19"/>
               </w:rPr>
               <w:t xml:space="preserve">Where it is used</w:t>
-            </w:r>
-          </w:p>
-        </w:tc>
-        <w:tc>
-          <w:tcPr>
-            <w:tcW w:type="dxa" w:w="2721"/>
-            <w:tcBorders>
-              <w:top w:val="single" w:color="000000" w:sz="4"/>
-              <w:left w:val="single" w:color="000000" w:sz="4"/>
-              <w:bottom w:val="single" w:color="000000" w:sz="4"/>
-              <w:right w:val="single" w:color="000000" w:sz="4"/>
-            </w:tcBorders>
-            <w:tcMar>
-              <w:top w:type="dxa" w:w="60"/>
-              <w:left w:type="dxa" w:w="100"/>
-              <w:bottom w:type="dxa" w:w="60"/>
-              <w:right w:type="dxa" w:w="100"/>
-            </w:tcMar>
-          </w:tcPr>
-          <w:p>
-            <w:pPr>
-              <w:spacing w:after="0" w:line="260"/>
-            </w:pPr>
-            <w:r>
-              <w:rPr>
-                <w:rFonts w:ascii="Arial" w:cs="Arial" w:eastAsia="Arial" w:hAnsi="Arial"/>
-                <w:b/>
-                <w:bCs/>
-                <w:sz w:val="19"/>
-                <w:szCs w:val="19"/>
-              </w:rPr>
-              <w:t xml:space="preserve">How much was used</w:t>
             </w:r>
           </w:p>
         </w:tc>
@@ -287,31 +254,61 @@
         </w:trPr>
         <w:tc>
           <w:tcPr>
-            <w:tcW w:type="dxa" w:w="1633"/>
-            <w:tcBorders>
-              <w:top w:val="single" w:color="000000" w:sz="4"/>
-              <w:left w:val="single" w:color="000000" w:sz="4"/>
-              <w:bottom w:val="single" w:color="000000" w:sz="4"/>
-              <w:right w:val="single" w:color="000000" w:sz="4"/>
-            </w:tcBorders>
-            <w:tcMar>
-              <w:top w:type="dxa" w:w="60"/>
-              <w:left w:type="dxa" w:w="100"/>
-              <w:bottom w:type="dxa" w:w="60"/>
-              <w:right w:type="dxa" w:w="100"/>
-            </w:tcMar>
-          </w:tcPr>
-          <w:p>
-            <w:pPr>
-              <w:spacing w:after="0" w:line="260"/>
-            </w:pPr>
-            <w:r>
-              <w:rPr>
-                <w:rFonts w:ascii="Arial" w:cs="Arial" w:eastAsia="Arial" w:hAnsi="Arial"/>
-                <w:sz w:val="19"/>
-                <w:szCs w:val="19"/>
-              </w:rPr>
-              <w:t xml:space="preserve">Samiuallah Mohammad</w:t>
+            <w:tcW w:type="dxa" w:w="1814"/>
+            <w:tcBorders>
+              <w:top w:val="single" w:color="000000" w:sz="4"/>
+              <w:left w:val="single" w:color="000000" w:sz="4"/>
+              <w:bottom w:val="single" w:color="000000" w:sz="4"/>
+              <w:right w:val="single" w:color="000000" w:sz="4"/>
+            </w:tcBorders>
+            <w:tcMar>
+              <w:top w:type="dxa" w:w="60"/>
+              <w:left w:type="dxa" w:w="100"/>
+              <w:bottom w:type="dxa" w:w="60"/>
+              <w:right w:type="dxa" w:w="100"/>
+            </w:tcMar>
+          </w:tcPr>
+          <w:p>
+            <w:pPr>
+              <w:spacing w:after="0" w:line="260"/>
+            </w:pPr>
+            <w:r>
+              <w:rPr>
+                <w:rFonts w:ascii="Arial" w:cs="Arial" w:eastAsia="Arial" w:hAnsi="Arial"/>
+                <w:sz w:val="19"/>
+                <w:szCs w:val="19"/>
+              </w:rPr>
+              <w:t xml:space="preserve">Loulwah Bin Saeed</w:t>
+            </w:r>
+          </w:p>
+        </w:tc>
+        <w:tc>
+          <w:tcPr>
+            <w:tcW w:type="dxa" w:w="4536"/>
+            <w:tcBorders>
+              <w:top w:val="single" w:color="000000" w:sz="4"/>
+              <w:left w:val="single" w:color="000000" w:sz="4"/>
+              <w:bottom w:val="single" w:color="000000" w:sz="4"/>
+              <w:right w:val="single" w:color="000000" w:sz="4"/>
+            </w:tcBorders>
+            <w:tcMar>
+              <w:top w:type="dxa" w:w="60"/>
+              <w:left w:type="dxa" w:w="100"/>
+              <w:bottom w:type="dxa" w:w="60"/>
+              <w:right w:type="dxa" w:w="100"/>
+            </w:tcMar>
+          </w:tcPr>
+          <w:p>
+            <w:pPr>
+              <w:spacing w:after="0" w:line="260"/>
+            </w:pPr>
+            <w:r>
+              <w:rPr>
+                <w:rFonts w:ascii="Arial" w:cs="Arial" w:eastAsia="Arial" w:hAnsi="Arial"/>
+                <w:sz w:val="19"/>
+                <w:szCs w:val="19"/>
+              </w:rPr>
+              <w:t xml:space="preserve">Audiovisual translation notes (Intro to AVT, AVT 2); idiom notes; the suggestion to include dictionaries</w:t>
             </w:r>
           </w:p>
         </w:tc>
@@ -341,84 +338,7 @@
                 <w:sz w:val="19"/>
                 <w:szCs w:val="19"/>
               </w:rPr>
-              <w:t xml:space="preserve">First draft; plan and recommendations; 180 course notes; Translation 1 notes; notes on Farghal &amp; Shunnaq; Text Analysis Model; </w:t>
-            </w:r>
-            <w:r>
-              <w:rPr>
-                <w:rFonts w:ascii="Arial" w:cs="Arial" w:hAnsi="Arial"/>
-                <w:sz w:val="19"/>
-                <w:szCs w:val="20"/>
-                <w:rtl/>
-              </w:rPr>
-              <w:t xml:space="preserve">الترجمة: ماهيتها وكيفيتها</w:t>
-            </w:r>
-            <w:r>
-              <w:rPr>
-                <w:rFonts w:ascii="Arial" w:cs="Arial" w:eastAsia="Arial" w:hAnsi="Arial"/>
-                <w:sz w:val="19"/>
-                <w:szCs w:val="19"/>
-              </w:rPr>
-              <w:t xml:space="preserve">; terminology selection (with Masooma)</w:t>
-            </w:r>
-          </w:p>
-        </w:tc>
-        <w:tc>
-          <w:tcPr>
-            <w:tcW w:type="dxa" w:w="1996"/>
-            <w:tcBorders>
-              <w:top w:val="single" w:color="000000" w:sz="4"/>
-              <w:left w:val="single" w:color="000000" w:sz="4"/>
-              <w:bottom w:val="single" w:color="000000" w:sz="4"/>
-              <w:right w:val="single" w:color="000000" w:sz="4"/>
-            </w:tcBorders>
-            <w:tcMar>
-              <w:top w:type="dxa" w:w="60"/>
-              <w:left w:type="dxa" w:w="100"/>
-              <w:bottom w:type="dxa" w:w="60"/>
-              <w:right w:type="dxa" w:w="100"/>
-            </w:tcMar>
-          </w:tcPr>
-          <w:p>
-            <w:pPr>
-              <w:spacing w:after="0" w:line="260"/>
-            </w:pPr>
-            <w:r>
-              <w:rPr>
-                <w:rFonts w:ascii="Arial" w:cs="Arial" w:eastAsia="Arial" w:hAnsi="Arial"/>
-                <w:sz w:val="19"/>
-                <w:szCs w:val="19"/>
-              </w:rPr>
-              <w:t xml:space="preserve">Most chapters, the chapter order, Chapters 17 and 25</w:t>
-            </w:r>
-          </w:p>
-        </w:tc>
-        <w:tc>
-          <w:tcPr>
-            <w:tcW w:type="dxa" w:w="2721"/>
-            <w:tcBorders>
-              <w:top w:val="single" w:color="000000" w:sz="4"/>
-              <w:left w:val="single" w:color="000000" w:sz="4"/>
-              <w:bottom w:val="single" w:color="000000" w:sz="4"/>
-              <w:right w:val="single" w:color="000000" w:sz="4"/>
-            </w:tcBorders>
-            <w:tcMar>
-              <w:top w:type="dxa" w:w="60"/>
-              <w:left w:type="dxa" w:w="100"/>
-              <w:bottom w:type="dxa" w:w="60"/>
-              <w:right w:type="dxa" w:w="100"/>
-            </w:tcMar>
-          </w:tcPr>
-          <w:p>
-            <w:pPr>
-              <w:spacing w:after="0" w:line="260"/>
-            </w:pPr>
-            <w:r>
-              <w:rPr>
-                <w:rFonts w:ascii="Arial" w:cs="Arial" w:eastAsia="Arial" w:hAnsi="Arial"/>
-                <w:sz w:val="19"/>
-                <w:szCs w:val="19"/>
-              </w:rPr>
-              <w:t xml:space="preserve">Draft: 156 of 175 points. Plan: 21 of 38 requests done, 7 in part, 4 done and later removed, 6 not done. Model: used in full, in simpler form.</w:t>
+              <w:t xml:space="preserve">Chapters 3, 26 and 27</w:t>
             </w:r>
           </w:p>
         </w:tc>
@@ -429,7 +349,7 @@
         </w:trPr>
         <w:tc>
           <w:tcPr>
-            <w:tcW w:type="dxa" w:w="1633"/>
+            <w:tcW w:type="dxa" w:w="1814"/>
             <w:tcBorders>
               <w:top w:val="single" w:color="000000" w:sz="4"/>
               <w:left w:val="single" w:color="000000" w:sz="4"/>
@@ -459,6 +379,36 @@
         </w:tc>
         <w:tc>
           <w:tcPr>
+            <w:tcW w:type="dxa" w:w="4536"/>
+            <w:tcBorders>
+              <w:top w:val="single" w:color="000000" w:sz="4"/>
+              <w:left w:val="single" w:color="000000" w:sz="4"/>
+              <w:bottom w:val="single" w:color="000000" w:sz="4"/>
+              <w:right w:val="single" w:color="000000" w:sz="4"/>
+            </w:tcBorders>
+            <w:tcMar>
+              <w:top w:type="dxa" w:w="60"/>
+              <w:left w:type="dxa" w:w="100"/>
+              <w:bottom w:type="dxa" w:w="60"/>
+              <w:right w:type="dxa" w:w="100"/>
+            </w:tcMar>
+          </w:tcPr>
+          <w:p>
+            <w:pPr>
+              <w:spacing w:after="0" w:line="260"/>
+            </w:pPr>
+            <w:r>
+              <w:rPr>
+                <w:rFonts w:ascii="Arial" w:cs="Arial" w:eastAsia="Arial" w:hAnsi="Arial"/>
+                <w:sz w:val="19"/>
+                <w:szCs w:val="19"/>
+              </w:rPr>
+              <w:t xml:space="preserve">Terminology slides (182); the terminology material selected from them with Samiuallah Mohammad; idiom list; the idea of an opening chapter of tips</w:t>
+            </w:r>
+          </w:p>
+        </w:tc>
+        <w:tc>
+          <w:tcPr>
             <w:tcW w:type="dxa" w:w="2721"/>
             <w:tcBorders>
               <w:top w:val="single" w:color="000000" w:sz="4"/>
@@ -483,67 +433,7 @@
                 <w:sz w:val="19"/>
                 <w:szCs w:val="19"/>
               </w:rPr>
-              <w:t xml:space="preserve">Terminology slides (182) and the chapter selected from them with Samiuallah; the idea of an opening chapter of tips</w:t>
-            </w:r>
-          </w:p>
-        </w:tc>
-        <w:tc>
-          <w:tcPr>
-            <w:tcW w:type="dxa" w:w="1996"/>
-            <w:tcBorders>
-              <w:top w:val="single" w:color="000000" w:sz="4"/>
-              <w:left w:val="single" w:color="000000" w:sz="4"/>
-              <w:bottom w:val="single" w:color="000000" w:sz="4"/>
-              <w:right w:val="single" w:color="000000" w:sz="4"/>
-            </w:tcBorders>
-            <w:tcMar>
-              <w:top w:type="dxa" w:w="60"/>
-              <w:left w:type="dxa" w:w="100"/>
-              <w:bottom w:type="dxa" w:w="60"/>
-              <w:right w:type="dxa" w:w="100"/>
-            </w:tcMar>
-          </w:tcPr>
-          <w:p>
-            <w:pPr>
-              <w:spacing w:after="0" w:line="260"/>
-            </w:pPr>
-            <w:r>
-              <w:rPr>
-                <w:rFonts w:ascii="Arial" w:cs="Arial" w:eastAsia="Arial" w:hAnsi="Arial"/>
-                <w:sz w:val="19"/>
-                <w:szCs w:val="19"/>
-              </w:rPr>
-              <w:t xml:space="preserve">Chapter 21</w:t>
-            </w:r>
-          </w:p>
-        </w:tc>
-        <w:tc>
-          <w:tcPr>
-            <w:tcW w:type="dxa" w:w="2721"/>
-            <w:tcBorders>
-              <w:top w:val="single" w:color="000000" w:sz="4"/>
-              <w:left w:val="single" w:color="000000" w:sz="4"/>
-              <w:bottom w:val="single" w:color="000000" w:sz="4"/>
-              <w:right w:val="single" w:color="000000" w:sz="4"/>
-            </w:tcBorders>
-            <w:tcMar>
-              <w:top w:type="dxa" w:w="60"/>
-              <w:left w:type="dxa" w:w="100"/>
-              <w:bottom w:type="dxa" w:w="60"/>
-              <w:right w:type="dxa" w:w="100"/>
-            </w:tcMar>
-          </w:tcPr>
-          <w:p>
-            <w:pPr>
-              <w:spacing w:after="0" w:line="260"/>
-            </w:pPr>
-            <w:r>
-              <w:rPr>
-                <w:rFonts w:ascii="Arial" w:cs="Arial" w:eastAsia="Arial" w:hAnsi="Arial"/>
-                <w:sz w:val="19"/>
-                <w:szCs w:val="19"/>
-              </w:rPr>
-              <w:t xml:space="preserve">25 of 43 points</w:t>
+              <w:t xml:space="preserve">Chapters 2, 12, 17 and 21</w:t>
             </w:r>
           </w:p>
         </w:tc>
@@ -554,31 +444,78 @@
         </w:trPr>
         <w:tc>
           <w:tcPr>
-            <w:tcW w:type="dxa" w:w="1633"/>
-            <w:tcBorders>
-              <w:top w:val="single" w:color="000000" w:sz="4"/>
-              <w:left w:val="single" w:color="000000" w:sz="4"/>
-              <w:bottom w:val="single" w:color="000000" w:sz="4"/>
-              <w:right w:val="single" w:color="000000" w:sz="4"/>
-            </w:tcBorders>
-            <w:tcMar>
-              <w:top w:type="dxa" w:w="60"/>
-              <w:left w:type="dxa" w:w="100"/>
-              <w:bottom w:type="dxa" w:w="60"/>
-              <w:right w:type="dxa" w:w="100"/>
-            </w:tcMar>
-          </w:tcPr>
-          <w:p>
-            <w:pPr>
-              <w:spacing w:after="0" w:line="260"/>
-            </w:pPr>
-            <w:r>
-              <w:rPr>
-                <w:rFonts w:ascii="Arial" w:cs="Arial" w:eastAsia="Arial" w:hAnsi="Arial"/>
-                <w:sz w:val="19"/>
-                <w:szCs w:val="19"/>
-              </w:rPr>
-              <w:t xml:space="preserve">Loulwah Bin Saeed</w:t>
+            <w:tcW w:type="dxa" w:w="1814"/>
+            <w:tcBorders>
+              <w:top w:val="single" w:color="000000" w:sz="4"/>
+              <w:left w:val="single" w:color="000000" w:sz="4"/>
+              <w:bottom w:val="single" w:color="000000" w:sz="4"/>
+              <w:right w:val="single" w:color="000000" w:sz="4"/>
+            </w:tcBorders>
+            <w:tcMar>
+              <w:top w:type="dxa" w:w="60"/>
+              <w:left w:type="dxa" w:w="100"/>
+              <w:bottom w:type="dxa" w:w="60"/>
+              <w:right w:type="dxa" w:w="100"/>
+            </w:tcMar>
+          </w:tcPr>
+          <w:p>
+            <w:pPr>
+              <w:spacing w:after="0" w:line="260"/>
+            </w:pPr>
+            <w:r>
+              <w:rPr>
+                <w:rFonts w:ascii="Arial" w:cs="Arial" w:eastAsia="Arial" w:hAnsi="Arial"/>
+                <w:sz w:val="19"/>
+                <w:szCs w:val="19"/>
+              </w:rPr>
+              <w:t xml:space="preserve">Samiuallah Mohammad</w:t>
+            </w:r>
+          </w:p>
+        </w:tc>
+        <w:tc>
+          <w:tcPr>
+            <w:tcW w:type="dxa" w:w="4536"/>
+            <w:tcBorders>
+              <w:top w:val="single" w:color="000000" w:sz="4"/>
+              <w:left w:val="single" w:color="000000" w:sz="4"/>
+              <w:bottom w:val="single" w:color="000000" w:sz="4"/>
+              <w:right w:val="single" w:color="000000" w:sz="4"/>
+            </w:tcBorders>
+            <w:tcMar>
+              <w:top w:type="dxa" w:w="60"/>
+              <w:left w:type="dxa" w:w="100"/>
+              <w:bottom w:type="dxa" w:w="60"/>
+              <w:right w:type="dxa" w:w="100"/>
+            </w:tcMar>
+          </w:tcPr>
+          <w:p>
+            <w:pPr>
+              <w:spacing w:after="0" w:line="260"/>
+            </w:pPr>
+            <w:r>
+              <w:rPr>
+                <w:rFonts w:ascii="Arial" w:cs="Arial" w:eastAsia="Arial" w:hAnsi="Arial"/>
+                <w:sz w:val="19"/>
+                <w:szCs w:val="19"/>
+              </w:rPr>
+              <w:t xml:space="preserve">First draft; plan and recommendations; 180 course notes; Translation 1 notes; notes on Farghal &amp; Shunnaq; Text Analysis Model; </w:t>
+            </w:r>
+            <w:r>
+              <w:rPr>
+                <w:rFonts w:ascii="Arial" w:cs="Arial" w:hAnsi="Arial"/>
+                <w:sz w:val="19"/>
+                <w:szCs w:val="20"/>
+                <w:rtl/>
+              </w:rPr>
+              <w:t xml:space="preserve">الترجمة: ماهيتها وكيفيتها</w:t>
+            </w:r>
+            <w:r>
+              <w:rPr>
+                <w:rFonts w:ascii="Arial" w:cs="Arial" w:eastAsia="Arial" w:hAnsi="Arial"/>
+                <w:sz w:val="19"/>
+                <w:szCs w:val="19"/>
+              </w:rPr>
+              <w:t xml:space="preserve">; framework and main documents</w:t>
             </w:r>
           </w:p>
         </w:tc>
@@ -608,67 +545,7 @@
                 <w:sz w:val="19"/>
                 <w:szCs w:val="19"/>
               </w:rPr>
-              <w:t xml:space="preserve">Audiovisual translation notes (Intro to AVT, AVT 2)</w:t>
-            </w:r>
-          </w:p>
-        </w:tc>
-        <w:tc>
-          <w:tcPr>
-            <w:tcW w:type="dxa" w:w="1996"/>
-            <w:tcBorders>
-              <w:top w:val="single" w:color="000000" w:sz="4"/>
-              <w:left w:val="single" w:color="000000" w:sz="4"/>
-              <w:bottom w:val="single" w:color="000000" w:sz="4"/>
-              <w:right w:val="single" w:color="000000" w:sz="4"/>
-            </w:tcBorders>
-            <w:tcMar>
-              <w:top w:type="dxa" w:w="60"/>
-              <w:left w:type="dxa" w:w="100"/>
-              <w:bottom w:type="dxa" w:w="60"/>
-              <w:right w:type="dxa" w:w="100"/>
-            </w:tcMar>
-          </w:tcPr>
-          <w:p>
-            <w:pPr>
-              <w:spacing w:after="0" w:line="260"/>
-            </w:pPr>
-            <w:r>
-              <w:rPr>
-                <w:rFonts w:ascii="Arial" w:cs="Arial" w:eastAsia="Arial" w:hAnsi="Arial"/>
-                <w:sz w:val="19"/>
-                <w:szCs w:val="19"/>
-              </w:rPr>
-              <w:t xml:space="preserve">Chapters 26 and 27</w:t>
-            </w:r>
-          </w:p>
-        </w:tc>
-        <w:tc>
-          <w:tcPr>
-            <w:tcW w:type="dxa" w:w="2721"/>
-            <w:tcBorders>
-              <w:top w:val="single" w:color="000000" w:sz="4"/>
-              <w:left w:val="single" w:color="000000" w:sz="4"/>
-              <w:bottom w:val="single" w:color="000000" w:sz="4"/>
-              <w:right w:val="single" w:color="000000" w:sz="4"/>
-            </w:tcBorders>
-            <w:tcMar>
-              <w:top w:type="dxa" w:w="60"/>
-              <w:left w:type="dxa" w:w="100"/>
-              <w:bottom w:type="dxa" w:w="60"/>
-              <w:right w:type="dxa" w:w="100"/>
-            </w:tcMar>
-          </w:tcPr>
-          <w:p>
-            <w:pPr>
-              <w:spacing w:after="0" w:line="260"/>
-            </w:pPr>
-            <w:r>
-              <w:rPr>
-                <w:rFonts w:ascii="Arial" w:cs="Arial" w:eastAsia="Arial" w:hAnsi="Arial"/>
-                <w:sz w:val="19"/>
-                <w:szCs w:val="19"/>
-              </w:rPr>
-              <w:t xml:space="preserve">43 of 62 points</w:t>
+              <w:t xml:space="preserve">Most chapters from 1 to 25, and the order of the book</w:t>
             </w:r>
           </w:p>
         </w:tc>
@@ -679,7 +556,7 @@
         </w:trPr>
         <w:tc>
           <w:tcPr>
-            <w:tcW w:type="dxa" w:w="1633"/>
+            <w:tcW w:type="dxa" w:w="1814"/>
             <w:tcBorders>
               <w:top w:val="single" w:color="000000" w:sz="4"/>
               <w:left w:val="single" w:color="000000" w:sz="4"/>
@@ -709,6 +586,36 @@
         </w:tc>
         <w:tc>
           <w:tcPr>
+            <w:tcW w:type="dxa" w:w="4536"/>
+            <w:tcBorders>
+              <w:top w:val="single" w:color="000000" w:sz="4"/>
+              <w:left w:val="single" w:color="000000" w:sz="4"/>
+              <w:bottom w:val="single" w:color="000000" w:sz="4"/>
+              <w:right w:val="single" w:color="000000" w:sz="4"/>
+            </w:tcBorders>
+            <w:tcMar>
+              <w:top w:type="dxa" w:w="60"/>
+              <w:left w:type="dxa" w:w="100"/>
+              <w:bottom w:type="dxa" w:w="60"/>
+              <w:right w:type="dxa" w:w="100"/>
+            </w:tcMar>
+          </w:tcPr>
+          <w:p>
+            <w:pPr>
+              <w:spacing w:after="0" w:line="260"/>
+            </w:pPr>
+            <w:r>
+              <w:rPr>
+                <w:rFonts w:ascii="Arial" w:cs="Arial" w:eastAsia="Arial" w:hAnsi="Arial"/>
+                <w:sz w:val="19"/>
+                <w:szCs w:val="19"/>
+              </w:rPr>
+              <w:t xml:space="preserve">Editing and structure; study notes; terminology class notes; framework draft; covers, layout, QR code and website</w:t>
+            </w:r>
+          </w:p>
+        </w:tc>
+        <w:tc>
+          <w:tcPr>
             <w:tcW w:type="dxa" w:w="2721"/>
             <w:tcBorders>
               <w:top w:val="single" w:color="000000" w:sz="4"/>
@@ -733,67 +640,7 @@
                 <w:sz w:val="19"/>
                 <w:szCs w:val="19"/>
               </w:rPr>
-              <w:t xml:space="preserve">My study notes; my terminology class notes; structure, editing, covers, layout, website</w:t>
-            </w:r>
-          </w:p>
-        </w:tc>
-        <w:tc>
-          <w:tcPr>
-            <w:tcW w:type="dxa" w:w="1996"/>
-            <w:tcBorders>
-              <w:top w:val="single" w:color="000000" w:sz="4"/>
-              <w:left w:val="single" w:color="000000" w:sz="4"/>
-              <w:bottom w:val="single" w:color="000000" w:sz="4"/>
-              <w:right w:val="single" w:color="000000" w:sz="4"/>
-            </w:tcBorders>
-            <w:tcMar>
-              <w:top w:type="dxa" w:w="60"/>
-              <w:left w:type="dxa" w:w="100"/>
-              <w:bottom w:type="dxa" w:w="60"/>
-              <w:right w:type="dxa" w:w="100"/>
-            </w:tcMar>
-          </w:tcPr>
-          <w:p>
-            <w:pPr>
-              <w:spacing w:after="0" w:line="260"/>
-            </w:pPr>
-            <w:r>
-              <w:rPr>
-                <w:rFonts w:ascii="Arial" w:cs="Arial" w:eastAsia="Arial" w:hAnsi="Arial"/>
-                <w:sz w:val="19"/>
-                <w:szCs w:val="19"/>
-              </w:rPr>
-              <w:t xml:space="preserve">12 chapters, and Chapter 21 (see Section 6)</w:t>
-            </w:r>
-          </w:p>
-        </w:tc>
-        <w:tc>
-          <w:tcPr>
-            <w:tcW w:type="dxa" w:w="2721"/>
-            <w:tcBorders>
-              <w:top w:val="single" w:color="000000" w:sz="4"/>
-              <w:left w:val="single" w:color="000000" w:sz="4"/>
-              <w:bottom w:val="single" w:color="000000" w:sz="4"/>
-              <w:right w:val="single" w:color="000000" w:sz="4"/>
-            </w:tcBorders>
-            <w:tcMar>
-              <w:top w:type="dxa" w:w="60"/>
-              <w:left w:type="dxa" w:w="100"/>
-              <w:bottom w:type="dxa" w:w="60"/>
-              <w:right w:type="dxa" w:w="100"/>
-            </w:tcMar>
-          </w:tcPr>
-          <w:p>
-            <w:pPr>
-              <w:spacing w:after="0" w:line="260"/>
-            </w:pPr>
-            <w:r>
-              <w:rPr>
-                <w:rFonts w:ascii="Arial" w:cs="Arial" w:eastAsia="Arial" w:hAnsi="Arial"/>
-                <w:sz w:val="19"/>
-                <w:szCs w:val="19"/>
-              </w:rPr>
-              <w:t xml:space="preserve">Used selectively, to keep the book at beginner level</w:t>
+              <w:t xml:space="preserve">The whole book; her notes in Chapters 1, 4, 6–9, 14, 17, 19, 21, 22 and 26</w:t>
             </w:r>
           </w:p>
         </w:tc>
@@ -809,7 +656,7 @@
         <w:pStyle w:val="Heading1"/>
       </w:pPr>
       <w:r>
-        <w:t xml:space="preserve">2. How I decided what to keep</w:t>
+        <w:t xml:space="preserve">2. How the decisions were made</w:t>
       </w:r>
     </w:p>
     <w:p>
@@ -821,7 +668,7 @@
         <w:rPr>
           <w:rFonts w:ascii="Arial" w:cs="Arial" w:eastAsia="Arial" w:hAnsi="Arial"/>
         </w:rPr>
-        <w:t xml:space="preserve">The handbook is for students who have never studied translation, so I asked the same question of every point: does a beginner need this, and is it correct? In practice this meant that:</w:t>
+        <w:t xml:space="preserve">Every point was judged by the same two questions: does a beginner need this, and is it correct? In practice:</w:t>
       </w:r>
     </w:p>
     <w:p>
@@ -837,7 +684,7 @@
         <w:rPr>
           <w:rFonts w:ascii="Arial" w:cs="Arial" w:eastAsia="Arial" w:hAnsi="Arial"/>
         </w:rPr>
-        <w:t xml:space="preserve">each idea is explained with an example before it is given a name;</w:t>
+        <w:t xml:space="preserve">each idea is explained with an example before it is named, in numbered steps;</w:t>
       </w:r>
     </w:p>
     <w:p>
@@ -853,7 +700,7 @@
         <w:rPr>
           <w:rFonts w:ascii="Arial" w:cs="Arial" w:eastAsia="Arial" w:hAnsi="Arial"/>
         </w:rPr>
-        <w:t xml:space="preserve">each topic appears once, in the chapter where it belongs, even when several documents covered it;</w:t>
+        <w:t xml:space="preserve">each topic appears once, in the chapter where it belongs, even when several members covered it;</w:t>
       </w:r>
     </w:p>
     <w:p>
@@ -869,7 +716,7 @@
         <w:rPr>
           <w:rFonts w:ascii="Arial" w:cs="Arial" w:eastAsia="Arial" w:hAnsi="Arial"/>
         </w:rPr>
-        <w:t xml:space="preserve">anything I could not check was taken out rather than printed;</w:t>
+        <w:t xml:space="preserve">anything that could not be checked was left out rather than printed;</w:t>
       </w:r>
     </w:p>
     <w:p>
@@ -885,7 +732,7 @@
         <w:rPr>
           <w:rFonts w:ascii="Arial" w:cs="Arial" w:eastAsia="Arial" w:hAnsi="Arial"/>
         </w:rPr>
-        <w:t xml:space="preserve">examples that took a political or religious position were rewritten or dropped;</w:t>
+        <w:t xml:space="preserve">examples that took a political or religious position were rewritten or left out;</w:t>
       </w:r>
     </w:p>
     <w:p>
@@ -901,7 +748,7 @@
         <w:rPr>
           <w:rFonts w:ascii="Arial" w:cs="Arial" w:eastAsia="Arial" w:hAnsi="Arial"/>
         </w:rPr>
-        <w:t xml:space="preserve">history and specialist theory were cut to keep the book under 100 pages;</w:t>
+        <w:t xml:space="preserve">history and specialist theory were kept to a minimum;</w:t>
       </w:r>
     </w:p>
     <w:p>
@@ -938,7 +785,220 @@
         <w:pStyle w:val="Heading2"/>
       </w:pPr>
       <w:r>
-        <w:t xml:space="preserve">3.1 First draft</w:t>
+        <w:t xml:space="preserve">3.1 Added to the handbook</w:t>
+      </w:r>
+    </w:p>
+    <w:p>
+      <w:pPr>
+        <w:pStyle w:val="ListParagraph"/>
+        <w:numPr>
+          <w:ilvl w:val="0"/>
+          <w:numId w:val="2"/>
+        </w:numPr>
+        <w:spacing w:after="80" w:line="290"/>
+      </w:pPr>
+      <w:r>
+        <w:rPr>
+          <w:rFonts w:ascii="Arial" w:cs="Arial" w:eastAsia="Arial" w:hAnsi="Arial"/>
+          <w:b/>
+          <w:bCs/>
+        </w:rPr>
+        <w:t xml:space="preserve">From the first draft</w:t>
+      </w:r>
+      <w:r>
+        <w:rPr>
+          <w:rFonts w:ascii="Arial" w:cs="Arial" w:eastAsia="Arial" w:hAnsi="Arial"/>
+        </w:rPr>
+        <w:t xml:space="preserve">, rewritten for beginners: the definitions; the differences between English and Arabic (Chapter 4); form and meaning, types of meaning and context (Chapters 5–7); collocation and idioms (Chapters 8–9); equivalence, literal and free translation, metaphor and the strategies (Chapters 10–12 and 14); cultural approximation, descriptive translation and lexical creation (Chapters 15–17); text analysis with the KUNA example (Chapter 18); post-editing (Chapter 22); commentary (Chapter 25); and many exercise items.</w:t>
+      </w:r>
+    </w:p>
+    <w:p>
+      <w:pPr>
+        <w:pStyle w:val="ListParagraph"/>
+        <w:numPr>
+          <w:ilvl w:val="0"/>
+          <w:numId w:val="2"/>
+        </w:numPr>
+        <w:spacing w:after="80" w:line="290"/>
+      </w:pPr>
+      <w:r>
+        <w:rPr>
+          <w:rFonts w:ascii="Arial" w:cs="Arial" w:eastAsia="Arial" w:hAnsi="Arial"/>
+          <w:b/>
+          <w:bCs/>
+        </w:rPr>
+        <w:t xml:space="preserve">From the plan and recommendations</w:t>
+      </w:r>
+      <w:r>
+        <w:rPr>
+          <w:rFonts w:ascii="Arial" w:cs="Arial" w:eastAsia="Arial" w:hAnsi="Arial"/>
+        </w:rPr>
+        <w:t xml:space="preserve">: the order from easy to hard; the missing strategies and types of translation; the seven procedures; the tips at the start; and the chapters on analysis, commentary, dictionaries, terminology, machine translation, genres, common mistakes and the risk matrix.</w:t>
+      </w:r>
+    </w:p>
+    <w:p>
+      <w:pPr>
+        <w:pStyle w:val="ListParagraph"/>
+        <w:numPr>
+          <w:ilvl w:val="0"/>
+          <w:numId w:val="2"/>
+        </w:numPr>
+        <w:spacing w:after="80" w:line="290"/>
+      </w:pPr>
+      <w:r>
+        <w:rPr>
+          <w:rFonts w:ascii="Arial" w:cs="Arial" w:eastAsia="Arial" w:hAnsi="Arial"/>
+          <w:b/>
+          <w:bCs/>
+        </w:rPr>
+        <w:t xml:space="preserve">From the 180 notes, Translation 1 notes and Farghal &amp; Shunnaq notes</w:t>
+      </w:r>
+      <w:r>
+        <w:rPr>
+          <w:rFonts w:ascii="Arial" w:cs="Arial" w:eastAsia="Arial" w:hAnsi="Arial"/>
+        </w:rPr>
+        <w:t xml:space="preserve">, which are the sources of the draft: the examples </w:t>
+      </w:r>
+      <w:r>
+        <w:rPr>
+          <w:rFonts w:ascii="Arial" w:cs="Arial" w:eastAsia="Arial" w:hAnsi="Arial"/>
+          <w:i/>
+          <w:iCs/>
+        </w:rPr>
+        <w:t xml:space="preserve">weak coffee</w:t>
+      </w:r>
+      <w:r>
+        <w:rPr>
+          <w:rFonts w:ascii="Arial" w:cs="Arial" w:eastAsia="Arial" w:hAnsi="Arial"/>
+        </w:rPr>
+        <w:t xml:space="preserve">, </w:t>
+      </w:r>
+      <w:r>
+        <w:rPr>
+          <w:rFonts w:ascii="Arial" w:cs="Arial" w:eastAsia="Arial" w:hAnsi="Arial"/>
+          <w:i/>
+          <w:iCs/>
+        </w:rPr>
+        <w:t xml:space="preserve">a rough sea</w:t>
+      </w:r>
+      <w:r>
+        <w:rPr>
+          <w:rFonts w:ascii="Arial" w:cs="Arial" w:eastAsia="Arial" w:hAnsi="Arial"/>
+        </w:rPr>
+        <w:t xml:space="preserve"> (Chapter 8) and </w:t>
+      </w:r>
+      <w:r>
+        <w:rPr>
+          <w:rFonts w:ascii="Arial" w:cs="Arial" w:eastAsia="Arial" w:hAnsi="Arial"/>
+          <w:i/>
+          <w:iCs/>
+        </w:rPr>
+        <w:t xml:space="preserve">to be in the red</w:t>
+      </w:r>
+      <w:r>
+        <w:rPr>
+          <w:rFonts w:ascii="Arial" w:cs="Arial" w:eastAsia="Arial" w:hAnsi="Arial"/>
+        </w:rPr>
+        <w:t xml:space="preserve"> (Chapter 9); and the citation of Farghal &amp; Shunnaq in Chapters 4, 10, 12 and 15–17, in the 2011 edition the team used. The draft’s numbered exercises also come from this book.</w:t>
+      </w:r>
+    </w:p>
+    <w:p>
+      <w:pPr>
+        <w:pStyle w:val="ListParagraph"/>
+        <w:numPr>
+          <w:ilvl w:val="0"/>
+          <w:numId w:val="2"/>
+        </w:numPr>
+        <w:spacing w:after="80" w:line="290"/>
+      </w:pPr>
+      <w:r>
+        <w:rPr>
+          <w:rFonts w:ascii="Arial" w:cs="Arial" w:eastAsia="Arial" w:hAnsi="Arial"/>
+          <w:b/>
+          <w:bCs/>
+        </w:rPr>
+        <w:t xml:space="preserve">From the Text Analysis Model</w:t>
+      </w:r>
+      <w:r>
+        <w:rPr>
+          <w:rFonts w:ascii="Arial" w:cs="Arial" w:eastAsia="Arial" w:hAnsi="Arial"/>
+        </w:rPr>
+        <w:t xml:space="preserve">: the linguistic and external levels (Chapter 18, Step 3), the use of the analysis in the commentary (Chapter 25), and the model as a quality check (Chapter 18, linked to Chapter 23). Fairclough (2003), on which the model is based, was added to the References.</w:t>
+      </w:r>
+    </w:p>
+    <w:p>
+      <w:pPr>
+        <w:pStyle w:val="ListParagraph"/>
+        <w:numPr>
+          <w:ilvl w:val="0"/>
+          <w:numId w:val="2"/>
+        </w:numPr>
+        <w:spacing w:after="80" w:line="290"/>
+      </w:pPr>
+      <w:r>
+        <w:rPr>
+          <w:rFonts w:ascii="Arial" w:cs="Arial" w:eastAsia="Arial" w:hAnsi="Arial"/>
+          <w:b/>
+          <w:bCs/>
+        </w:rPr>
+        <w:t xml:space="preserve">From </w:t>
+      </w:r>
+      <w:r>
+        <w:rPr>
+          <w:rFonts w:ascii="Arial" w:cs="Arial" w:hAnsi="Arial"/>
+          <w:b/>
+          <w:bCs/>
+          <w:szCs w:val="23"/>
+          <w:rtl/>
+        </w:rPr>
+        <w:t xml:space="preserve">الترجمة: ماهيتها وكيفيتها</w:t>
+      </w:r>
+      <w:r>
+        <w:rPr>
+          <w:rFonts w:ascii="Arial" w:cs="Arial" w:eastAsia="Arial" w:hAnsi="Arial"/>
+        </w:rPr>
+        <w:t xml:space="preserve">: the idioms </w:t>
+      </w:r>
+      <w:r>
+        <w:rPr>
+          <w:rFonts w:ascii="Arial" w:cs="Arial" w:eastAsia="Arial" w:hAnsi="Arial"/>
+          <w:i/>
+          <w:iCs/>
+        </w:rPr>
+        <w:t xml:space="preserve">He looks blue</w:t>
+      </w:r>
+      <w:r>
+        <w:rPr>
+          <w:rFonts w:ascii="Arial" w:cs="Arial" w:eastAsia="Arial" w:hAnsi="Arial"/>
+        </w:rPr>
+        <w:t xml:space="preserve"> and </w:t>
+      </w:r>
+      <w:r>
+        <w:rPr>
+          <w:rFonts w:ascii="Arial" w:cs="Arial" w:eastAsia="Arial" w:hAnsi="Arial"/>
+          <w:i/>
+          <w:iCs/>
+        </w:rPr>
+        <w:t xml:space="preserve">I will go bananas</w:t>
+      </w:r>
+      <w:r>
+        <w:rPr>
+          <w:rFonts w:ascii="Arial" w:cs="Arial" w:eastAsia="Arial" w:hAnsi="Arial"/>
+        </w:rPr>
+        <w:t xml:space="preserve"> (Chapter 9).</w:t>
+      </w:r>
+    </w:p>
+    <w:p>
+      <w:pPr>
+        <w:spacing w:after="60"/>
+      </w:pPr>
+    </w:p>
+    <w:p>
+      <w:pPr>
+        <w:pStyle w:val="Heading2"/>
+      </w:pPr>
+      <w:r>
+        <w:t xml:space="preserve">3.2 Edited</w:t>
       </w:r>
     </w:p>
     <w:p>
@@ -950,19 +1010,7 @@
         <w:rPr>
           <w:rFonts w:ascii="Arial" w:cs="Arial" w:eastAsia="Arial" w:hAnsi="Arial"/>
         </w:rPr>
-        <w:t xml:space="preserve">The draft gave the book its scope, and most of it is in the handbook in rewritten form: the definitions, the differences between English and Arabic, form and meaning, types of meaning, context, collocation, idioms, equivalence, literal and free translation, metaphor, the strategies, cultural approximation, descriptive translation, lexical creation, text analysis with the KUNA example, commentary, post-editing and many of the exercise items.</w:t>
-      </w:r>
-    </w:p>
-    <w:p>
-      <w:pPr>
-        <w:spacing w:after="140" w:line="300"/>
-        <w:jc w:val="both"/>
-      </w:pPr>
-      <w:r>
-        <w:rPr>
-          <w:rFonts w:ascii="Arial" w:cs="Arial" w:eastAsia="Arial" w:hAnsi="Arial"/>
-        </w:rPr>
-        <w:t xml:space="preserve">I merged topics that appeared in more than one place and wrote the empty sections (terminology, machine translation, the glossary and the references). I also corrected some errors, for example the Arabic given for “died”, the translation of “kick the bucket” and “mark my words”, “Bush’s puppy” (the press said “poodle”), the rule on Arabic word order, and two examples translated wrongly (</w:t>
+        <w:t xml:space="preserve">Topics repeated in several places were merged, and the empty sections (terminology, machine translation, glossary, references) were written in full. Errors were corrected: the Arabic for “died”; “kick the bucket” (given with an insulting phrase); “mark my words”; “Bush’s puppy” (the press said “poodle”); the rule on Arabic word order; </w:t>
       </w:r>
       <w:r>
         <w:rPr>
@@ -976,7 +1024,7 @@
         <w:rPr>
           <w:rFonts w:ascii="Arial" w:cs="Arial" w:eastAsia="Arial" w:hAnsi="Arial"/>
         </w:rPr>
-        <w:t xml:space="preserve"> given as </w:t>
+        <w:t xml:space="preserve"> translated as </w:t>
       </w:r>
       <w:r>
         <w:rPr>
@@ -990,7 +1038,7 @@
         <w:rPr>
           <w:rFonts w:ascii="Arial" w:cs="Arial" w:eastAsia="Arial" w:hAnsi="Arial"/>
         </w:rPr>
-        <w:t xml:space="preserve">, and </w:t>
+        <w:t xml:space="preserve">; and </w:t>
       </w:r>
       <w:r>
         <w:rPr>
@@ -1004,73 +1052,7 @@
         <w:rPr>
           <w:rFonts w:ascii="Arial" w:cs="Arial" w:eastAsia="Arial" w:hAnsi="Arial"/>
         </w:rPr>
-        <w:t xml:space="preserve"> as a minister rather than a ministry). Colloquial Arabic was replaced with formal Arabic.</w:t>
-      </w:r>
-    </w:p>
-    <w:p>
-      <w:pPr>
-        <w:spacing w:after="140" w:line="300"/>
-        <w:jc w:val="both"/>
-      </w:pPr>
-      <w:r>
-        <w:rPr>
-          <w:rFonts w:ascii="Arial" w:cs="Arial" w:eastAsia="Arial" w:hAnsi="Arial"/>
-        </w:rPr>
-        <w:t xml:space="preserve">His 180 notes, Translation 1 notes and notes on Farghal &amp; Shunnaq reached me after the draft. They turned out to be its sources, so almost all of their content was already in the handbook. I added a few examples from them (</w:t>
-      </w:r>
-      <w:r>
-        <w:rPr>
-          <w:rFonts w:ascii="Arial" w:cs="Arial" w:eastAsia="Arial" w:hAnsi="Arial"/>
-          <w:i/>
-          <w:iCs/>
-        </w:rPr>
-        <w:t xml:space="preserve">weak coffee</w:t>
-      </w:r>
-      <w:r>
-        <w:rPr>
-          <w:rFonts w:ascii="Arial" w:cs="Arial" w:eastAsia="Arial" w:hAnsi="Arial"/>
-        </w:rPr>
-        <w:t xml:space="preserve">, </w:t>
-      </w:r>
-      <w:r>
-        <w:rPr>
-          <w:rFonts w:ascii="Arial" w:cs="Arial" w:eastAsia="Arial" w:hAnsi="Arial"/>
-          <w:i/>
-          <w:iCs/>
-        </w:rPr>
-        <w:t xml:space="preserve">a rough sea</w:t>
-      </w:r>
-      <w:r>
-        <w:rPr>
-          <w:rFonts w:ascii="Arial" w:cs="Arial" w:eastAsia="Arial" w:hAnsi="Arial"/>
-        </w:rPr>
-        <w:t xml:space="preserve">, </w:t>
-      </w:r>
-      <w:r>
-        <w:rPr>
-          <w:rFonts w:ascii="Arial" w:cs="Arial" w:eastAsia="Arial" w:hAnsi="Arial"/>
-          <w:i/>
-          <w:iCs/>
-        </w:rPr>
-        <w:t xml:space="preserve">to be in the red</w:t>
-      </w:r>
-      <w:r>
-        <w:rPr>
-          <w:rFonts w:ascii="Arial" w:cs="Arial" w:eastAsia="Arial" w:hAnsi="Arial"/>
-        </w:rPr>
-        <w:t xml:space="preserve">), and cited Farghal &amp; Shunnaq in the chapters that follow the book (Chapters 9, 11, 14, 15 and 16), using the 2011 edition the team worked from. The draft’s numbered exercises also come from this book.</w:t>
-      </w:r>
-    </w:p>
-    <w:p>
-      <w:pPr>
-        <w:spacing w:after="140" w:line="300"/>
-        <w:jc w:val="both"/>
-      </w:pPr>
-      <w:r>
-        <w:rPr>
-          <w:rFonts w:ascii="Arial" w:cs="Arial" w:eastAsia="Arial" w:hAnsi="Arial"/>
-        </w:rPr>
-        <w:t xml:space="preserve">I left out 51 items. Some were wrong or unclear (“Principles = Foundations”, “mule” as a synonym of “horse”) and would confuse a beginner. The figure of “74 fields” for the Jordanian academy could not be confirmed. A few examples were not neutral, such as a news agency described as biased, or a Qur’anic verse offered as the equivalent of an English proverb. The invented words (tribocracy, puppycracy) are not real English. Some exercise items were dropped only for space and could be used in a later exercise set.</w:t>
+        <w:t xml:space="preserve"> translated as a minister rather than a ministry. Colloquial Arabic was replaced with formal Arabic.</w:t>
       </w:r>
     </w:p>
     <w:p>
@@ -1078,31 +1060,792 @@
         <w:pStyle w:val="Heading2"/>
       </w:pPr>
       <w:r>
-        <w:t xml:space="preserve">3.2 Plan and recommendations</w:t>
-      </w:r>
-    </w:p>
-    <w:p>
-      <w:pPr>
-        <w:spacing w:after="140" w:line="300"/>
-        <w:jc w:val="both"/>
-      </w:pPr>
-      <w:r>
-        <w:rPr>
-          <w:rFonts w:ascii="Arial" w:cs="Arial" w:eastAsia="Arial" w:hAnsi="Arial"/>
-        </w:rPr>
-        <w:t xml:space="preserve">Most of the plan was followed: the order from easy to hard, the missing strategies and types of translation, the seven procedures, the tips at the start, and the chapters on analysis, commentary, dictionaries, terminology, machine translation, genres, common mistakes and the risk matrix.</w:t>
-      </w:r>
-    </w:p>
-    <w:p>
-      <w:pPr>
-        <w:spacing w:after="140" w:line="300"/>
-        <w:jc w:val="both"/>
-      </w:pPr>
-      <w:r>
-        <w:rPr>
-          <w:rFonts w:ascii="Arial" w:cs="Arial" w:eastAsia="Arial" w:hAnsi="Arial"/>
-        </w:rPr>
-        <w:t xml:space="preserve">Some requests were only partly met. The glossary covers the terms listed at the end of each chapter but not every term mentioned in the text. News is taught through headlines rather than a full article, and the relational model appears as three practical questions in Chapter 19. The practice section, the checklists and the note on future editions were written and later removed (Section 7). A few requests could not be done: “the book” is not yet published, the 386 and Analysis texts did not reach me, and the checklist for the supervisor’s framework was not written. The text </w:t>
+        <w:t xml:space="preserve">3.3 Removed, and why</w:t>
+      </w:r>
+    </w:p>
+    <w:tbl>
+      <w:tblPr>
+        <w:tblW w:type="dxa" w:w="9071"/>
+        <w:tblBorders>
+          <w:top w:val="single" w:color="auto" w:sz="4"/>
+          <w:left w:val="single" w:color="auto" w:sz="4"/>
+          <w:bottom w:val="single" w:color="auto" w:sz="4"/>
+          <w:right w:val="single" w:color="auto" w:sz="4"/>
+          <w:insideH w:val="single" w:color="auto" w:sz="4"/>
+          <w:insideV w:val="single" w:color="auto" w:sz="4"/>
+        </w:tblBorders>
+      </w:tblPr>
+      <w:tblGrid>
+        <w:gridCol w:w="4989"/>
+        <w:gridCol w:w="4082"/>
+      </w:tblGrid>
+      <w:tr>
+        <w:trPr>
+          <w:tblHeader/>
+        </w:trPr>
+        <w:tc>
+          <w:tcPr>
+            <w:tcW w:type="dxa" w:w="4989"/>
+            <w:tcBorders>
+              <w:top w:val="single" w:color="000000" w:sz="4"/>
+              <w:left w:val="single" w:color="000000" w:sz="4"/>
+              <w:bottom w:val="single" w:color="000000" w:sz="4"/>
+              <w:right w:val="single" w:color="000000" w:sz="4"/>
+            </w:tcBorders>
+            <w:tcMar>
+              <w:top w:type="dxa" w:w="60"/>
+              <w:left w:type="dxa" w:w="100"/>
+              <w:bottom w:type="dxa" w:w="60"/>
+              <w:right w:type="dxa" w:w="100"/>
+            </w:tcMar>
+          </w:tcPr>
+          <w:p>
+            <w:pPr>
+              <w:spacing w:after="0" w:line="260"/>
+            </w:pPr>
+            <w:r>
+              <w:rPr>
+                <w:rFonts w:ascii="Arial" w:cs="Arial" w:eastAsia="Arial" w:hAnsi="Arial"/>
+                <w:b/>
+                <w:bCs/>
+                <w:sz w:val="19"/>
+                <w:szCs w:val="19"/>
+              </w:rPr>
+              <w:t xml:space="preserve">Removed</w:t>
+            </w:r>
+          </w:p>
+        </w:tc>
+        <w:tc>
+          <w:tcPr>
+            <w:tcW w:type="dxa" w:w="4082"/>
+            <w:tcBorders>
+              <w:top w:val="single" w:color="000000" w:sz="4"/>
+              <w:left w:val="single" w:color="000000" w:sz="4"/>
+              <w:bottom w:val="single" w:color="000000" w:sz="4"/>
+              <w:right w:val="single" w:color="000000" w:sz="4"/>
+            </w:tcBorders>
+            <w:tcMar>
+              <w:top w:type="dxa" w:w="60"/>
+              <w:left w:type="dxa" w:w="100"/>
+              <w:bottom w:type="dxa" w:w="60"/>
+              <w:right w:type="dxa" w:w="100"/>
+            </w:tcMar>
+          </w:tcPr>
+          <w:p>
+            <w:pPr>
+              <w:spacing w:after="0" w:line="260"/>
+            </w:pPr>
+            <w:r>
+              <w:rPr>
+                <w:rFonts w:ascii="Arial" w:cs="Arial" w:eastAsia="Arial" w:hAnsi="Arial"/>
+                <w:b/>
+                <w:bCs/>
+                <w:sz w:val="19"/>
+                <w:szCs w:val="19"/>
+              </w:rPr>
+              <w:t xml:space="preserve">Why</w:t>
+            </w:r>
+          </w:p>
+        </w:tc>
+      </w:tr>
+      <w:tr>
+        <w:trPr>
+          <w:cantSplit/>
+        </w:trPr>
+        <w:tc>
+          <w:tcPr>
+            <w:tcW w:type="dxa" w:w="4989"/>
+            <w:tcBorders>
+              <w:top w:val="single" w:color="000000" w:sz="4"/>
+              <w:left w:val="single" w:color="000000" w:sz="4"/>
+              <w:bottom w:val="single" w:color="000000" w:sz="4"/>
+              <w:right w:val="single" w:color="000000" w:sz="4"/>
+            </w:tcBorders>
+            <w:tcMar>
+              <w:top w:type="dxa" w:w="60"/>
+              <w:left w:type="dxa" w:w="100"/>
+              <w:bottom w:type="dxa" w:w="60"/>
+              <w:right w:type="dxa" w:w="100"/>
+            </w:tcMar>
+          </w:tcPr>
+          <w:p>
+            <w:pPr>
+              <w:spacing w:after="0" w:line="260"/>
+            </w:pPr>
+            <w:r>
+              <w:rPr>
+                <w:rFonts w:ascii="Arial" w:cs="Arial" w:eastAsia="Arial" w:hAnsi="Arial"/>
+                <w:sz w:val="19"/>
+                <w:szCs w:val="19"/>
+              </w:rPr>
+              <w:t xml:space="preserve">Unclear or wrong statements (“Principles = Foundations”, “mule” as a synonym of “horse”, “translation also means to politicize”)</w:t>
+            </w:r>
+          </w:p>
+        </w:tc>
+        <w:tc>
+          <w:tcPr>
+            <w:tcW w:type="dxa" w:w="4082"/>
+            <w:tcBorders>
+              <w:top w:val="single" w:color="000000" w:sz="4"/>
+              <w:left w:val="single" w:color="000000" w:sz="4"/>
+              <w:bottom w:val="single" w:color="000000" w:sz="4"/>
+              <w:right w:val="single" w:color="000000" w:sz="4"/>
+            </w:tcBorders>
+            <w:tcMar>
+              <w:top w:type="dxa" w:w="60"/>
+              <w:left w:type="dxa" w:w="100"/>
+              <w:bottom w:type="dxa" w:w="60"/>
+              <w:right w:type="dxa" w:w="100"/>
+            </w:tcMar>
+          </w:tcPr>
+          <w:p>
+            <w:pPr>
+              <w:spacing w:after="0" w:line="260"/>
+            </w:pPr>
+            <w:r>
+              <w:rPr>
+                <w:rFonts w:ascii="Arial" w:cs="Arial" w:eastAsia="Arial" w:hAnsi="Arial"/>
+                <w:sz w:val="19"/>
+                <w:szCs w:val="19"/>
+              </w:rPr>
+              <w:t xml:space="preserve">They would confuse a beginner.</w:t>
+            </w:r>
+          </w:p>
+        </w:tc>
+      </w:tr>
+      <w:tr>
+        <w:trPr>
+          <w:cantSplit/>
+        </w:trPr>
+        <w:tc>
+          <w:tcPr>
+            <w:tcW w:type="dxa" w:w="4989"/>
+            <w:tcBorders>
+              <w:top w:val="single" w:color="000000" w:sz="4"/>
+              <w:left w:val="single" w:color="000000" w:sz="4"/>
+              <w:bottom w:val="single" w:color="000000" w:sz="4"/>
+              <w:right w:val="single" w:color="000000" w:sz="4"/>
+            </w:tcBorders>
+            <w:tcMar>
+              <w:top w:type="dxa" w:w="60"/>
+              <w:left w:type="dxa" w:w="100"/>
+              <w:bottom w:type="dxa" w:w="60"/>
+              <w:right w:type="dxa" w:w="100"/>
+            </w:tcMar>
+          </w:tcPr>
+          <w:p>
+            <w:pPr>
+              <w:spacing w:after="0" w:line="260"/>
+            </w:pPr>
+            <w:r>
+              <w:rPr>
+                <w:rFonts w:ascii="Arial" w:cs="Arial" w:eastAsia="Arial" w:hAnsi="Arial"/>
+                <w:sz w:val="19"/>
+                <w:szCs w:val="19"/>
+              </w:rPr>
+              <w:t xml:space="preserve">The figure of “74 fields” for the Jordanian academy</w:t>
+            </w:r>
+          </w:p>
+        </w:tc>
+        <w:tc>
+          <w:tcPr>
+            <w:tcW w:type="dxa" w:w="4082"/>
+            <w:tcBorders>
+              <w:top w:val="single" w:color="000000" w:sz="4"/>
+              <w:left w:val="single" w:color="000000" w:sz="4"/>
+              <w:bottom w:val="single" w:color="000000" w:sz="4"/>
+              <w:right w:val="single" w:color="000000" w:sz="4"/>
+            </w:tcBorders>
+            <w:tcMar>
+              <w:top w:type="dxa" w:w="60"/>
+              <w:left w:type="dxa" w:w="100"/>
+              <w:bottom w:type="dxa" w:w="60"/>
+              <w:right w:type="dxa" w:w="100"/>
+            </w:tcMar>
+          </w:tcPr>
+          <w:p>
+            <w:pPr>
+              <w:spacing w:after="0" w:line="260"/>
+            </w:pPr>
+            <w:r>
+              <w:rPr>
+                <w:rFonts w:ascii="Arial" w:cs="Arial" w:eastAsia="Arial" w:hAnsi="Arial"/>
+                <w:sz w:val="19"/>
+                <w:szCs w:val="19"/>
+              </w:rPr>
+              <w:t xml:space="preserve">No source confirms it.</w:t>
+            </w:r>
+          </w:p>
+        </w:tc>
+      </w:tr>
+      <w:tr>
+        <w:trPr>
+          <w:cantSplit/>
+        </w:trPr>
+        <w:tc>
+          <w:tcPr>
+            <w:tcW w:type="dxa" w:w="4989"/>
+            <w:tcBorders>
+              <w:top w:val="single" w:color="000000" w:sz="4"/>
+              <w:left w:val="single" w:color="000000" w:sz="4"/>
+              <w:bottom w:val="single" w:color="000000" w:sz="4"/>
+              <w:right w:val="single" w:color="000000" w:sz="4"/>
+            </w:tcBorders>
+            <w:tcMar>
+              <w:top w:type="dxa" w:w="60"/>
+              <w:left w:type="dxa" w:w="100"/>
+              <w:bottom w:type="dxa" w:w="60"/>
+              <w:right w:type="dxa" w:w="100"/>
+            </w:tcMar>
+          </w:tcPr>
+          <w:p>
+            <w:pPr>
+              <w:spacing w:after="0" w:line="260"/>
+            </w:pPr>
+            <w:r>
+              <w:rPr>
+                <w:rFonts w:ascii="Arial" w:cs="Arial" w:eastAsia="Arial" w:hAnsi="Arial"/>
+                <w:sz w:val="19"/>
+                <w:szCs w:val="19"/>
+              </w:rPr>
+              <w:t xml:space="preserve">A news agency described as biased; a Qur’anic verse given as the equivalent of an English proverb; the Clinton impeachment example</w:t>
+            </w:r>
+          </w:p>
+        </w:tc>
+        <w:tc>
+          <w:tcPr>
+            <w:tcW w:type="dxa" w:w="4082"/>
+            <w:tcBorders>
+              <w:top w:val="single" w:color="000000" w:sz="4"/>
+              <w:left w:val="single" w:color="000000" w:sz="4"/>
+              <w:bottom w:val="single" w:color="000000" w:sz="4"/>
+              <w:right w:val="single" w:color="000000" w:sz="4"/>
+            </w:tcBorders>
+            <w:tcMar>
+              <w:top w:type="dxa" w:w="60"/>
+              <w:left w:type="dxa" w:w="100"/>
+              <w:bottom w:type="dxa" w:w="60"/>
+              <w:right w:type="dxa" w:w="100"/>
+            </w:tcMar>
+          </w:tcPr>
+          <w:p>
+            <w:pPr>
+              <w:spacing w:after="0" w:line="260"/>
+            </w:pPr>
+            <w:r>
+              <w:rPr>
+                <w:rFonts w:ascii="Arial" w:cs="Arial" w:eastAsia="Arial" w:hAnsi="Arial"/>
+                <w:sz w:val="19"/>
+                <w:szCs w:val="19"/>
+              </w:rPr>
+              <w:t xml:space="preserve">Not neutral enough for a club publication.</w:t>
+            </w:r>
+          </w:p>
+        </w:tc>
+      </w:tr>
+      <w:tr>
+        <w:trPr>
+          <w:cantSplit/>
+        </w:trPr>
+        <w:tc>
+          <w:tcPr>
+            <w:tcW w:type="dxa" w:w="4989"/>
+            <w:tcBorders>
+              <w:top w:val="single" w:color="000000" w:sz="4"/>
+              <w:left w:val="single" w:color="000000" w:sz="4"/>
+              <w:bottom w:val="single" w:color="000000" w:sz="4"/>
+              <w:right w:val="single" w:color="000000" w:sz="4"/>
+            </w:tcBorders>
+            <w:tcMar>
+              <w:top w:type="dxa" w:w="60"/>
+              <w:left w:type="dxa" w:w="100"/>
+              <w:bottom w:type="dxa" w:w="60"/>
+              <w:right w:type="dxa" w:w="100"/>
+            </w:tcMar>
+          </w:tcPr>
+          <w:p>
+            <w:pPr>
+              <w:spacing w:after="0" w:line="260"/>
+            </w:pPr>
+            <w:r>
+              <w:rPr>
+                <w:rFonts w:ascii="Arial" w:cs="Arial" w:eastAsia="Arial" w:hAnsi="Arial"/>
+                <w:sz w:val="19"/>
+                <w:szCs w:val="19"/>
+              </w:rPr>
+              <w:t xml:space="preserve">Invented words (tribocracy, puppycracy)</w:t>
+            </w:r>
+          </w:p>
+        </w:tc>
+        <w:tc>
+          <w:tcPr>
+            <w:tcW w:type="dxa" w:w="4082"/>
+            <w:tcBorders>
+              <w:top w:val="single" w:color="000000" w:sz="4"/>
+              <w:left w:val="single" w:color="000000" w:sz="4"/>
+              <w:bottom w:val="single" w:color="000000" w:sz="4"/>
+              <w:right w:val="single" w:color="000000" w:sz="4"/>
+            </w:tcBorders>
+            <w:tcMar>
+              <w:top w:type="dxa" w:w="60"/>
+              <w:left w:type="dxa" w:w="100"/>
+              <w:bottom w:type="dxa" w:w="60"/>
+              <w:right w:type="dxa" w:w="100"/>
+            </w:tcMar>
+          </w:tcPr>
+          <w:p>
+            <w:pPr>
+              <w:spacing w:after="0" w:line="260"/>
+            </w:pPr>
+            <w:r>
+              <w:rPr>
+                <w:rFonts w:ascii="Arial" w:cs="Arial" w:eastAsia="Arial" w:hAnsi="Arial"/>
+                <w:sz w:val="19"/>
+                <w:szCs w:val="19"/>
+              </w:rPr>
+              <w:t xml:space="preserve">Not real English.</w:t>
+            </w:r>
+          </w:p>
+        </w:tc>
+      </w:tr>
+      <w:tr>
+        <w:trPr>
+          <w:cantSplit/>
+        </w:trPr>
+        <w:tc>
+          <w:tcPr>
+            <w:tcW w:type="dxa" w:w="4989"/>
+            <w:tcBorders>
+              <w:top w:val="single" w:color="000000" w:sz="4"/>
+              <w:left w:val="single" w:color="000000" w:sz="4"/>
+              <w:bottom w:val="single" w:color="000000" w:sz="4"/>
+              <w:right w:val="single" w:color="000000" w:sz="4"/>
+            </w:tcBorders>
+            <w:tcMar>
+              <w:top w:type="dxa" w:w="60"/>
+              <w:left w:type="dxa" w:w="100"/>
+              <w:bottom w:type="dxa" w:w="60"/>
+              <w:right w:type="dxa" w:w="100"/>
+            </w:tcMar>
+          </w:tcPr>
+          <w:p>
+            <w:pPr>
+              <w:spacing w:after="0" w:line="260"/>
+            </w:pPr>
+            <w:r>
+              <w:rPr>
+                <w:rFonts w:ascii="Arial" w:cs="Arial" w:eastAsia="Arial" w:hAnsi="Arial"/>
+                <w:sz w:val="19"/>
+                <w:szCs w:val="19"/>
+              </w:rPr>
+              <w:t xml:space="preserve">Some exercise items (</w:t>
+            </w:r>
+            <w:r>
+              <w:rPr>
+                <w:rFonts w:ascii="Arial" w:cs="Arial" w:eastAsia="Arial" w:hAnsi="Arial"/>
+                <w:i/>
+                <w:iCs/>
+                <w:sz w:val="19"/>
+                <w:szCs w:val="19"/>
+              </w:rPr>
+              <w:t xml:space="preserve">a readable book</w:t>
+            </w:r>
+            <w:r>
+              <w:rPr>
+                <w:rFonts w:ascii="Arial" w:cs="Arial" w:eastAsia="Arial" w:hAnsi="Arial"/>
+                <w:sz w:val="19"/>
+                <w:szCs w:val="19"/>
+              </w:rPr>
+              <w:t xml:space="preserve">, </w:t>
+            </w:r>
+            <w:r>
+              <w:rPr>
+                <w:rFonts w:ascii="Arial" w:cs="Arial" w:eastAsia="Arial" w:hAnsi="Arial"/>
+                <w:i/>
+                <w:iCs/>
+                <w:sz w:val="19"/>
+                <w:szCs w:val="19"/>
+              </w:rPr>
+              <w:t xml:space="preserve">addled egg</w:t>
+            </w:r>
+            <w:r>
+              <w:rPr>
+                <w:rFonts w:ascii="Arial" w:cs="Arial" w:eastAsia="Arial" w:hAnsi="Arial"/>
+                <w:sz w:val="19"/>
+                <w:szCs w:val="19"/>
+              </w:rPr>
+              <w:t xml:space="preserve">)</w:t>
+            </w:r>
+          </w:p>
+        </w:tc>
+        <w:tc>
+          <w:tcPr>
+            <w:tcW w:type="dxa" w:w="4082"/>
+            <w:tcBorders>
+              <w:top w:val="single" w:color="000000" w:sz="4"/>
+              <w:left w:val="single" w:color="000000" w:sz="4"/>
+              <w:bottom w:val="single" w:color="000000" w:sz="4"/>
+              <w:right w:val="single" w:color="000000" w:sz="4"/>
+            </w:tcBorders>
+            <w:tcMar>
+              <w:top w:type="dxa" w:w="60"/>
+              <w:left w:type="dxa" w:w="100"/>
+              <w:bottom w:type="dxa" w:w="60"/>
+              <w:right w:type="dxa" w:w="100"/>
+            </w:tcMar>
+          </w:tcPr>
+          <w:p>
+            <w:pPr>
+              <w:spacing w:after="0" w:line="260"/>
+            </w:pPr>
+            <w:r>
+              <w:rPr>
+                <w:rFonts w:ascii="Arial" w:cs="Arial" w:eastAsia="Arial" w:hAnsi="Arial"/>
+                <w:sz w:val="19"/>
+                <w:szCs w:val="19"/>
+              </w:rPr>
+              <w:t xml:space="preserve">Left out for space; they can form a later exercise set.</w:t>
+            </w:r>
+          </w:p>
+        </w:tc>
+      </w:tr>
+      <w:tr>
+        <w:trPr>
+          <w:cantSplit/>
+        </w:trPr>
+        <w:tc>
+          <w:tcPr>
+            <w:tcW w:type="dxa" w:w="4989"/>
+            <w:tcBorders>
+              <w:top w:val="single" w:color="000000" w:sz="4"/>
+              <w:left w:val="single" w:color="000000" w:sz="4"/>
+              <w:bottom w:val="single" w:color="000000" w:sz="4"/>
+              <w:right w:val="single" w:color="000000" w:sz="4"/>
+            </w:tcBorders>
+            <w:tcMar>
+              <w:top w:type="dxa" w:w="60"/>
+              <w:left w:type="dxa" w:w="100"/>
+              <w:bottom w:type="dxa" w:w="60"/>
+              <w:right w:type="dxa" w:w="100"/>
+            </w:tcMar>
+          </w:tcPr>
+          <w:p>
+            <w:pPr>
+              <w:spacing w:after="0" w:line="260"/>
+            </w:pPr>
+            <w:r>
+              <w:rPr>
+                <w:rFonts w:ascii="Arial" w:cs="Arial" w:eastAsia="Arial" w:hAnsi="Arial"/>
+                <w:sz w:val="19"/>
+                <w:szCs w:val="19"/>
+              </w:rPr>
+              <w:t xml:space="preserve">The practice section and the answer key at the end</w:t>
+            </w:r>
+          </w:p>
+        </w:tc>
+        <w:tc>
+          <w:tcPr>
+            <w:tcW w:type="dxa" w:w="4082"/>
+            <w:tcBorders>
+              <w:top w:val="single" w:color="000000" w:sz="4"/>
+              <w:left w:val="single" w:color="000000" w:sz="4"/>
+              <w:bottom w:val="single" w:color="000000" w:sz="4"/>
+              <w:right w:val="single" w:color="000000" w:sz="4"/>
+            </w:tcBorders>
+            <w:tcMar>
+              <w:top w:type="dxa" w:w="60"/>
+              <w:left w:type="dxa" w:w="100"/>
+              <w:bottom w:type="dxa" w:w="60"/>
+              <w:right w:type="dxa" w:w="100"/>
+            </w:tcMar>
+          </w:tcPr>
+          <w:p>
+            <w:pPr>
+              <w:spacing w:after="0" w:line="260"/>
+            </w:pPr>
+            <w:r>
+              <w:rPr>
+                <w:rFonts w:ascii="Arial" w:cs="Arial" w:eastAsia="Arial" w:hAnsi="Arial"/>
+                <w:sz w:val="19"/>
+                <w:szCs w:val="19"/>
+              </w:rPr>
+              <w:t xml:space="preserve">The book stays short; each chapter keeps its questions with answers.</w:t>
+            </w:r>
+          </w:p>
+        </w:tc>
+      </w:tr>
+      <w:tr>
+        <w:trPr>
+          <w:cantSplit/>
+        </w:trPr>
+        <w:tc>
+          <w:tcPr>
+            <w:tcW w:type="dxa" w:w="4989"/>
+            <w:tcBorders>
+              <w:top w:val="single" w:color="000000" w:sz="4"/>
+              <w:left w:val="single" w:color="000000" w:sz="4"/>
+              <w:bottom w:val="single" w:color="000000" w:sz="4"/>
+              <w:right w:val="single" w:color="000000" w:sz="4"/>
+            </w:tcBorders>
+            <w:tcMar>
+              <w:top w:type="dxa" w:w="60"/>
+              <w:left w:type="dxa" w:w="100"/>
+              <w:bottom w:type="dxa" w:w="60"/>
+              <w:right w:type="dxa" w:w="100"/>
+            </w:tcMar>
+          </w:tcPr>
+          <w:p>
+            <w:pPr>
+              <w:spacing w:after="0" w:line="260"/>
+            </w:pPr>
+            <w:r>
+              <w:rPr>
+                <w:rFonts w:ascii="Arial" w:cs="Arial" w:eastAsia="Arial" w:hAnsi="Arial"/>
+                <w:sz w:val="19"/>
+                <w:szCs w:val="19"/>
+              </w:rPr>
+              <w:t xml:space="preserve">The abbreviations at the start of the book</w:t>
+            </w:r>
+          </w:p>
+        </w:tc>
+        <w:tc>
+          <w:tcPr>
+            <w:tcW w:type="dxa" w:w="4082"/>
+            <w:tcBorders>
+              <w:top w:val="single" w:color="000000" w:sz="4"/>
+              <w:left w:val="single" w:color="000000" w:sz="4"/>
+              <w:bottom w:val="single" w:color="000000" w:sz="4"/>
+              <w:right w:val="single" w:color="000000" w:sz="4"/>
+            </w:tcBorders>
+            <w:tcMar>
+              <w:top w:type="dxa" w:w="60"/>
+              <w:left w:type="dxa" w:w="100"/>
+              <w:bottom w:type="dxa" w:w="60"/>
+              <w:right w:type="dxa" w:w="100"/>
+            </w:tcMar>
+          </w:tcPr>
+          <w:p>
+            <w:pPr>
+              <w:spacing w:after="0" w:line="260"/>
+            </w:pPr>
+            <w:r>
+              <w:rPr>
+                <w:rFonts w:ascii="Arial" w:cs="Arial" w:eastAsia="Arial" w:hAnsi="Arial"/>
+                <w:sz w:val="19"/>
+                <w:szCs w:val="19"/>
+              </w:rPr>
+              <w:t xml:space="preserve">Moved to the back, next to the glossary, so that the opening pages lead straight into the first lesson.</w:t>
+            </w:r>
+          </w:p>
+        </w:tc>
+      </w:tr>
+      <w:tr>
+        <w:trPr>
+          <w:cantSplit/>
+        </w:trPr>
+        <w:tc>
+          <w:tcPr>
+            <w:tcW w:type="dxa" w:w="4989"/>
+            <w:tcBorders>
+              <w:top w:val="single" w:color="000000" w:sz="4"/>
+              <w:left w:val="single" w:color="000000" w:sz="4"/>
+              <w:bottom w:val="single" w:color="000000" w:sz="4"/>
+              <w:right w:val="single" w:color="000000" w:sz="4"/>
+            </w:tcBorders>
+            <w:tcMar>
+              <w:top w:type="dxa" w:w="60"/>
+              <w:left w:type="dxa" w:w="100"/>
+              <w:bottom w:type="dxa" w:w="60"/>
+              <w:right w:type="dxa" w:w="100"/>
+            </w:tcMar>
+          </w:tcPr>
+          <w:p>
+            <w:pPr>
+              <w:spacing w:after="0" w:line="260"/>
+            </w:pPr>
+            <w:r>
+              <w:rPr>
+                <w:rFonts w:ascii="Arial" w:cs="Arial" w:eastAsia="Arial" w:hAnsi="Arial"/>
+                <w:sz w:val="19"/>
+                <w:szCs w:val="19"/>
+              </w:rPr>
+              <w:t xml:space="preserve">Advanced parts of the Text Analysis Model (blending, frame-modification, re-modelling, Al-ta’reed, monitoring, intrinsic and extrinsic managing)</w:t>
+            </w:r>
+          </w:p>
+        </w:tc>
+        <w:tc>
+          <w:tcPr>
+            <w:tcW w:type="dxa" w:w="4082"/>
+            <w:tcBorders>
+              <w:top w:val="single" w:color="000000" w:sz="4"/>
+              <w:left w:val="single" w:color="000000" w:sz="4"/>
+              <w:bottom w:val="single" w:color="000000" w:sz="4"/>
+              <w:right w:val="single" w:color="000000" w:sz="4"/>
+            </w:tcBorders>
+            <w:tcMar>
+              <w:top w:type="dxa" w:w="60"/>
+              <w:left w:type="dxa" w:w="100"/>
+              <w:bottom w:type="dxa" w:w="60"/>
+              <w:right w:type="dxa" w:w="100"/>
+            </w:tcMar>
+          </w:tcPr>
+          <w:p>
+            <w:pPr>
+              <w:spacing w:after="0" w:line="260"/>
+            </w:pPr>
+            <w:r>
+              <w:rPr>
+                <w:rFonts w:ascii="Arial" w:cs="Arial" w:eastAsia="Arial" w:hAnsi="Arial"/>
+                <w:sz w:val="19"/>
+                <w:szCs w:val="19"/>
+              </w:rPr>
+              <w:t xml:space="preserve">Too advanced for a first handbook.</w:t>
+            </w:r>
+          </w:p>
+        </w:tc>
+      </w:tr>
+      <w:tr>
+        <w:trPr>
+          <w:cantSplit/>
+        </w:trPr>
+        <w:tc>
+          <w:tcPr>
+            <w:tcW w:type="dxa" w:w="4989"/>
+            <w:tcBorders>
+              <w:top w:val="single" w:color="000000" w:sz="4"/>
+              <w:left w:val="single" w:color="000000" w:sz="4"/>
+              <w:bottom w:val="single" w:color="000000" w:sz="4"/>
+              <w:right w:val="single" w:color="000000" w:sz="4"/>
+            </w:tcBorders>
+            <w:tcMar>
+              <w:top w:type="dxa" w:w="60"/>
+              <w:left w:type="dxa" w:w="100"/>
+              <w:bottom w:type="dxa" w:w="60"/>
+              <w:right w:type="dxa" w:w="100"/>
+            </w:tcMar>
+          </w:tcPr>
+          <w:p>
+            <w:pPr>
+              <w:spacing w:after="0" w:line="260"/>
+            </w:pPr>
+            <w:r>
+              <w:rPr>
+                <w:rFonts w:ascii="Arial" w:cs="Arial" w:eastAsia="Arial" w:hAnsi="Arial"/>
+                <w:sz w:val="19"/>
+                <w:szCs w:val="19"/>
+              </w:rPr>
+              <w:t xml:space="preserve">Citing </w:t>
+            </w:r>
+            <w:r>
+              <w:rPr>
+                <w:rFonts w:ascii="Arial" w:cs="Arial" w:hAnsi="Arial"/>
+                <w:sz w:val="19"/>
+                <w:szCs w:val="20"/>
+                <w:rtl/>
+              </w:rPr>
+              <w:t xml:space="preserve">الترجمة: ماهيتها وكيفيتها</w:t>
+            </w:r>
+          </w:p>
+        </w:tc>
+        <w:tc>
+          <w:tcPr>
+            <w:tcW w:type="dxa" w:w="4082"/>
+            <w:tcBorders>
+              <w:top w:val="single" w:color="000000" w:sz="4"/>
+              <w:left w:val="single" w:color="000000" w:sz="4"/>
+              <w:bottom w:val="single" w:color="000000" w:sz="4"/>
+              <w:right w:val="single" w:color="000000" w:sz="4"/>
+            </w:tcBorders>
+            <w:tcMar>
+              <w:top w:type="dxa" w:w="60"/>
+              <w:left w:type="dxa" w:w="100"/>
+              <w:bottom w:type="dxa" w:w="60"/>
+              <w:right w:type="dxa" w:w="100"/>
+            </w:tcMar>
+          </w:tcPr>
+          <w:p>
+            <w:pPr>
+              <w:spacing w:after="0" w:line="260"/>
+            </w:pPr>
+            <w:r>
+              <w:rPr>
+                <w:rFonts w:ascii="Arial" w:cs="Arial" w:eastAsia="Arial" w:hAnsi="Arial"/>
+                <w:sz w:val="19"/>
+                <w:szCs w:val="19"/>
+              </w:rPr>
+              <w:t xml:space="preserve">No author is named on any page, so it cannot be listed in the References.</w:t>
+            </w:r>
+          </w:p>
+        </w:tc>
+      </w:tr>
+    </w:tbl>
+    <w:p>
+      <w:pPr>
+        <w:spacing w:after="160"/>
+      </w:pPr>
+    </w:p>
+    <w:p>
+      <w:pPr>
+        <w:pStyle w:val="Heading1"/>
+      </w:pPr>
+      <w:r>
+        <w:t xml:space="preserve">4. Masooma Almesri</w:t>
+      </w:r>
+    </w:p>
+    <w:p>
+      <w:pPr>
+        <w:pStyle w:val="Heading2"/>
+      </w:pPr>
+      <w:r>
+        <w:t xml:space="preserve">4.1 Added to the handbook</w:t>
+      </w:r>
+    </w:p>
+    <w:p>
+      <w:pPr>
+        <w:pStyle w:val="ListParagraph"/>
+        <w:numPr>
+          <w:ilvl w:val="0"/>
+          <w:numId w:val="2"/>
+        </w:numPr>
+        <w:spacing w:after="80" w:line="290"/>
+      </w:pPr>
+      <w:r>
+        <w:rPr>
+          <w:rFonts w:ascii="Arial" w:cs="Arial" w:eastAsia="Arial" w:hAnsi="Arial"/>
+          <w:b/>
+          <w:bCs/>
+        </w:rPr>
+        <w:t xml:space="preserve">From the terminology material selected with Samiuallah Mohammad</w:t>
+      </w:r>
+      <w:r>
+        <w:rPr>
+          <w:rFonts w:ascii="Arial" w:cs="Arial" w:eastAsia="Arial" w:hAnsi="Arial"/>
+        </w:rPr>
+        <w:t xml:space="preserve">, the core of Chapter 21: the definition of terminology; the translator and the terminologist; why terms must be managed; short forms; what makes a good term; the Arabic language academies; how to translate a term; term lists; termbases; one term for one idea.</w:t>
+      </w:r>
+    </w:p>
+    <w:p>
+      <w:pPr>
+        <w:pStyle w:val="ListParagraph"/>
+        <w:numPr>
+          <w:ilvl w:val="0"/>
+          <w:numId w:val="2"/>
+        </w:numPr>
+        <w:spacing w:after="80" w:line="290"/>
+      </w:pPr>
+      <w:r>
+        <w:rPr>
+          <w:rFonts w:ascii="Arial" w:cs="Arial" w:eastAsia="Arial" w:hAnsi="Arial"/>
+          <w:b/>
+          <w:bCs/>
+        </w:rPr>
+        <w:t xml:space="preserve">From her 182 slides</w:t>
+      </w:r>
+      <w:r>
+        <w:rPr>
+          <w:rFonts w:ascii="Arial" w:cs="Arial" w:eastAsia="Arial" w:hAnsi="Arial"/>
+        </w:rPr>
+        <w:t xml:space="preserve">: </w:t>
       </w:r>
       <w:r>
         <w:rPr>
@@ -1110,13 +1853,13 @@
           <w:szCs w:val="23"/>
           <w:rtl/>
         </w:rPr>
-        <w:t xml:space="preserve">الترجمة: ماهيتها وكيفيتها</w:t>
-      </w:r>
-      <w:r>
-        <w:rPr>
-          <w:rFonts w:ascii="Arial" w:cs="Arial" w:eastAsia="Arial" w:hAnsi="Arial"/>
-        </w:rPr>
-        <w:t xml:space="preserve"> arrived late; it names no author, so it cannot be cited, and I took only two idioms from it (</w:t>
+        <w:t xml:space="preserve">عقارب الساعة</w:t>
+      </w:r>
+      <w:r>
+        <w:rPr>
+          <w:rFonts w:ascii="Arial" w:cs="Arial" w:eastAsia="Arial" w:hAnsi="Arial"/>
+        </w:rPr>
+        <w:t xml:space="preserve"> and </w:t>
       </w:r>
       <w:r>
         <w:rPr>
@@ -1124,79 +1867,13 @@
           <w:i/>
           <w:iCs/>
         </w:rPr>
-        <w:t xml:space="preserve">He looks blue</w:t>
-      </w:r>
-      <w:r>
-        <w:rPr>
-          <w:rFonts w:ascii="Arial" w:cs="Arial" w:eastAsia="Arial" w:hAnsi="Arial"/>
-        </w:rPr>
-        <w:t xml:space="preserve">, </w:t>
-      </w:r>
-      <w:r>
-        <w:rPr>
-          <w:rFonts w:ascii="Arial" w:cs="Arial" w:eastAsia="Arial" w:hAnsi="Arial"/>
-          <w:i/>
-          <w:iCs/>
-        </w:rPr>
-        <w:t xml:space="preserve">I will go bananas</w:t>
-      </w:r>
-      <w:r>
-        <w:rPr>
-          <w:rFonts w:ascii="Arial" w:cs="Arial" w:eastAsia="Arial" w:hAnsi="Arial"/>
-        </w:rPr>
-        <w:t xml:space="preserve">).</w:t>
-      </w:r>
-    </w:p>
-    <w:p>
-      <w:pPr>
-        <w:pStyle w:val="Heading2"/>
-      </w:pPr>
-      <w:r>
-        <w:t xml:space="preserve">3.3 Text Analysis Model</w:t>
-      </w:r>
-    </w:p>
-    <w:p>
-      <w:pPr>
-        <w:spacing w:after="140" w:line="300"/>
-        <w:jc w:val="both"/>
-      </w:pPr>
-      <w:r>
-        <w:rPr>
-          <w:rFonts w:ascii="Arial" w:cs="Arial" w:eastAsia="Arial" w:hAnsi="Arial"/>
-        </w:rPr>
-        <w:t xml:space="preserve">The whole model is used. Chapter 17 now follows its two levels, linguistic (micro and macro) and external, and Chapter 25 asks students to go back to their analysis when writing the commentary. The source the model is based on, Fairclough (2003), was added to the references. I left out terms such as blending, clipping, frame-modification, re-modelling, Al-ta’reed, monitoring, and intrinsic and extrinsic managing, which are too advanced for a first handbook.</w:t>
-      </w:r>
-    </w:p>
-    <w:p>
-      <w:pPr>
-        <w:pStyle w:val="Heading1"/>
-      </w:pPr>
-      <w:r>
-        <w:t xml:space="preserve">4. Masooma Almesri</w:t>
-      </w:r>
-    </w:p>
-    <w:p>
-      <w:pPr>
-        <w:spacing w:after="140" w:line="300"/>
-        <w:jc w:val="both"/>
-      </w:pPr>
-      <w:r>
-        <w:rPr>
-          <w:rFonts w:ascii="Arial" w:cs="Arial" w:eastAsia="Arial" w:hAnsi="Arial"/>
-        </w:rPr>
-        <w:t xml:space="preserve">Chapter 21 is built on the terminology chapter, which was selected from Masooma’s course slides. It keeps the definition of terminology, the difference between a translator and a terminologist, why terms need to be managed, short forms, what makes a good term, the Arabic language academies, how to translate a term, term lists, termbases, and the rule of one term for one idea.</w:t>
-      </w:r>
-    </w:p>
-    <w:p>
-      <w:pPr>
-        <w:spacing w:after="140" w:line="300"/>
-        <w:jc w:val="both"/>
-      </w:pPr>
-      <w:r>
-        <w:rPr>
-          <w:rFonts w:ascii="Arial" w:cs="Arial" w:eastAsia="Arial" w:hAnsi="Arial"/>
-        </w:rPr>
-        <w:t xml:space="preserve">I corrected the definition of a terminologist and a few historical details, then cut the history and schools of terminology, the categories of terms, most of the nine naming rules and the standardisation bodies, since beginners do not need them. The academies’ detailed methods were also left out as too detailed; I first thought they had no source, but they come from her slides. When the slides reached me, I checked Chapter 21 against them and added a few of their examples: </w:t>
+        <w:t xml:space="preserve">a throbbing headache</w:t>
+      </w:r>
+      <w:r>
+        <w:rPr>
+          <w:rFonts w:ascii="Arial" w:cs="Arial" w:eastAsia="Arial" w:hAnsi="Arial"/>
+        </w:rPr>
+        <w:t xml:space="preserve"> (Chapter 12); </w:t>
       </w:r>
       <w:r>
         <w:rPr>
@@ -1204,21 +1881,7 @@
           <w:szCs w:val="23"/>
           <w:rtl/>
         </w:rPr>
-        <w:t xml:space="preserve">عقارب الساعة</w:t>
-      </w:r>
-      <w:r>
-        <w:rPr>
-          <w:rFonts w:ascii="Arial" w:cs="Arial" w:eastAsia="Arial" w:hAnsi="Arial"/>
-        </w:rPr>
-        <w:t xml:space="preserve">, </w:t>
-      </w:r>
-      <w:r>
-        <w:rPr>
-          <w:rFonts w:ascii="Arial" w:cs="Arial" w:eastAsia="Arial" w:hAnsi="Arial"/>
-          <w:i/>
-          <w:iCs/>
-        </w:rPr>
-        <w:t xml:space="preserve">a throbbing headache</w:t>
+        <w:t xml:space="preserve">الاستمطار</w:t>
       </w:r>
       <w:r>
         <w:rPr>
@@ -1232,13 +1895,41 @@
           <w:szCs w:val="23"/>
           <w:rtl/>
         </w:rPr>
-        <w:t xml:space="preserve">الاستمطار</w:t>
-      </w:r>
-      <w:r>
-        <w:rPr>
-          <w:rFonts w:ascii="Arial" w:cs="Arial" w:eastAsia="Arial" w:hAnsi="Arial"/>
-        </w:rPr>
-        <w:t xml:space="preserve">, </w:t>
+        <w:t xml:space="preserve">قطار</w:t>
+      </w:r>
+      <w:r>
+        <w:rPr>
+          <w:rFonts w:ascii="Arial" w:cs="Arial" w:eastAsia="Arial" w:hAnsi="Arial"/>
+        </w:rPr>
+        <w:t xml:space="preserve">, and affixes such as </w:t>
+      </w:r>
+      <w:r>
+        <w:rPr>
+          <w:rFonts w:ascii="Arial" w:cs="Arial" w:eastAsia="Arial" w:hAnsi="Arial"/>
+          <w:i/>
+          <w:iCs/>
+        </w:rPr>
+        <w:t xml:space="preserve">manageable</w:t>
+      </w:r>
+      <w:r>
+        <w:rPr>
+          <w:rFonts w:ascii="Arial" w:cs="Arial" w:eastAsia="Arial" w:hAnsi="Arial"/>
+        </w:rPr>
+        <w:t xml:space="preserve"> and </w:t>
+      </w:r>
+      <w:r>
+        <w:rPr>
+          <w:rFonts w:ascii="Arial" w:cs="Arial" w:eastAsia="Arial" w:hAnsi="Arial"/>
+          <w:i/>
+          <w:iCs/>
+        </w:rPr>
+        <w:t xml:space="preserve">antibiotic</w:t>
+      </w:r>
+      <w:r>
+        <w:rPr>
+          <w:rFonts w:ascii="Arial" w:cs="Arial" w:eastAsia="Arial" w:hAnsi="Arial"/>
+        </w:rPr>
+        <w:t xml:space="preserve"> (Chapter 17); the redundant term </w:t>
       </w:r>
       <w:r>
         <w:rPr>
@@ -1246,13 +1937,1209 @@
           <w:szCs w:val="23"/>
           <w:rtl/>
         </w:rPr>
-        <w:t xml:space="preserve">قطار</w:t>
-      </w:r>
-      <w:r>
-        <w:rPr>
-          <w:rFonts w:ascii="Arial" w:cs="Arial" w:eastAsia="Arial" w:hAnsi="Arial"/>
-        </w:rPr>
-        <w:t xml:space="preserve">, affixes such as </w:t>
+        <w:t xml:space="preserve">التطرّف الراديكالي</w:t>
+      </w:r>
+      <w:r>
+        <w:rPr>
+          <w:rFonts w:ascii="Arial" w:cs="Arial" w:eastAsia="Arial" w:hAnsi="Arial"/>
+        </w:rPr>
+        <w:t xml:space="preserve"> and the definition of a terminologist, who sometimes creates terms (Chapter 21).</w:t>
+      </w:r>
+    </w:p>
+    <w:p>
+      <w:pPr>
+        <w:pStyle w:val="ListParagraph"/>
+        <w:numPr>
+          <w:ilvl w:val="0"/>
+          <w:numId w:val="2"/>
+        </w:numPr>
+        <w:spacing w:after="80" w:line="290"/>
+      </w:pPr>
+      <w:r>
+        <w:rPr>
+          <w:rFonts w:ascii="Arial" w:cs="Arial" w:eastAsia="Arial" w:hAnsi="Arial"/>
+          <w:b/>
+          <w:bCs/>
+        </w:rPr>
+        <w:t xml:space="preserve">Her suggestion</w:t>
+      </w:r>
+      <w:r>
+        <w:rPr>
+          <w:rFonts w:ascii="Arial" w:cs="Arial" w:eastAsia="Arial" w:hAnsi="Arial"/>
+        </w:rPr>
+        <w:t xml:space="preserve"> of an opening chapter that prepares students before they start: Chapter 2, “Tips, advice and preparation”.</w:t>
+      </w:r>
+    </w:p>
+    <w:p>
+      <w:pPr>
+        <w:spacing w:after="60"/>
+      </w:pPr>
+    </w:p>
+    <w:p>
+      <w:pPr>
+        <w:pStyle w:val="Heading2"/>
+      </w:pPr>
+      <w:r>
+        <w:t xml:space="preserve">4.2 Edited</w:t>
+      </w:r>
+    </w:p>
+    <w:p>
+      <w:pPr>
+        <w:spacing w:after="140" w:line="300"/>
+        <w:jc w:val="both"/>
+      </w:pPr>
+      <w:r>
+        <w:rPr>
+          <w:rFonts w:ascii="Arial" w:cs="Arial" w:eastAsia="Arial" w:hAnsi="Arial"/>
+        </w:rPr>
+        <w:t xml:space="preserve">The chapter was rewritten in plain English and reduced to what a beginner needs. The definition of a terminologist and some historical details were corrected. Sources were added, since the chapter cited none, together with UNTERM, Arabterm, a sample term list and medical examples.</w:t>
+      </w:r>
+    </w:p>
+    <w:p>
+      <w:pPr>
+        <w:pStyle w:val="Heading2"/>
+      </w:pPr>
+      <w:r>
+        <w:t xml:space="preserve">4.3 Removed, and why</w:t>
+      </w:r>
+    </w:p>
+    <w:tbl>
+      <w:tblPr>
+        <w:tblW w:type="dxa" w:w="9071"/>
+        <w:tblBorders>
+          <w:top w:val="single" w:color="auto" w:sz="4"/>
+          <w:left w:val="single" w:color="auto" w:sz="4"/>
+          <w:bottom w:val="single" w:color="auto" w:sz="4"/>
+          <w:right w:val="single" w:color="auto" w:sz="4"/>
+          <w:insideH w:val="single" w:color="auto" w:sz="4"/>
+          <w:insideV w:val="single" w:color="auto" w:sz="4"/>
+        </w:tblBorders>
+      </w:tblPr>
+      <w:tblGrid>
+        <w:gridCol w:w="4989"/>
+        <w:gridCol w:w="4082"/>
+      </w:tblGrid>
+      <w:tr>
+        <w:trPr>
+          <w:tblHeader/>
+        </w:trPr>
+        <w:tc>
+          <w:tcPr>
+            <w:tcW w:type="dxa" w:w="4989"/>
+            <w:tcBorders>
+              <w:top w:val="single" w:color="000000" w:sz="4"/>
+              <w:left w:val="single" w:color="000000" w:sz="4"/>
+              <w:bottom w:val="single" w:color="000000" w:sz="4"/>
+              <w:right w:val="single" w:color="000000" w:sz="4"/>
+            </w:tcBorders>
+            <w:tcMar>
+              <w:top w:type="dxa" w:w="60"/>
+              <w:left w:type="dxa" w:w="100"/>
+              <w:bottom w:type="dxa" w:w="60"/>
+              <w:right w:type="dxa" w:w="100"/>
+            </w:tcMar>
+          </w:tcPr>
+          <w:p>
+            <w:pPr>
+              <w:spacing w:after="0" w:line="260"/>
+            </w:pPr>
+            <w:r>
+              <w:rPr>
+                <w:rFonts w:ascii="Arial" w:cs="Arial" w:eastAsia="Arial" w:hAnsi="Arial"/>
+                <w:b/>
+                <w:bCs/>
+                <w:sz w:val="19"/>
+                <w:szCs w:val="19"/>
+              </w:rPr>
+              <w:t xml:space="preserve">Removed</w:t>
+            </w:r>
+          </w:p>
+        </w:tc>
+        <w:tc>
+          <w:tcPr>
+            <w:tcW w:type="dxa" w:w="4082"/>
+            <w:tcBorders>
+              <w:top w:val="single" w:color="000000" w:sz="4"/>
+              <w:left w:val="single" w:color="000000" w:sz="4"/>
+              <w:bottom w:val="single" w:color="000000" w:sz="4"/>
+              <w:right w:val="single" w:color="000000" w:sz="4"/>
+            </w:tcBorders>
+            <w:tcMar>
+              <w:top w:type="dxa" w:w="60"/>
+              <w:left w:type="dxa" w:w="100"/>
+              <w:bottom w:type="dxa" w:w="60"/>
+              <w:right w:type="dxa" w:w="100"/>
+            </w:tcMar>
+          </w:tcPr>
+          <w:p>
+            <w:pPr>
+              <w:spacing w:after="0" w:line="260"/>
+            </w:pPr>
+            <w:r>
+              <w:rPr>
+                <w:rFonts w:ascii="Arial" w:cs="Arial" w:eastAsia="Arial" w:hAnsi="Arial"/>
+                <w:b/>
+                <w:bCs/>
+                <w:sz w:val="19"/>
+                <w:szCs w:val="19"/>
+              </w:rPr>
+              <w:t xml:space="preserve">Why</w:t>
+            </w:r>
+          </w:p>
+        </w:tc>
+      </w:tr>
+      <w:tr>
+        <w:trPr>
+          <w:cantSplit/>
+        </w:trPr>
+        <w:tc>
+          <w:tcPr>
+            <w:tcW w:type="dxa" w:w="4989"/>
+            <w:tcBorders>
+              <w:top w:val="single" w:color="000000" w:sz="4"/>
+              <w:left w:val="single" w:color="000000" w:sz="4"/>
+              <w:bottom w:val="single" w:color="000000" w:sz="4"/>
+              <w:right w:val="single" w:color="000000" w:sz="4"/>
+            </w:tcBorders>
+            <w:tcMar>
+              <w:top w:type="dxa" w:w="60"/>
+              <w:left w:type="dxa" w:w="100"/>
+              <w:bottom w:type="dxa" w:w="60"/>
+              <w:right w:type="dxa" w:w="100"/>
+            </w:tcMar>
+          </w:tcPr>
+          <w:p>
+            <w:pPr>
+              <w:spacing w:after="0" w:line="260"/>
+            </w:pPr>
+            <w:r>
+              <w:rPr>
+                <w:rFonts w:ascii="Arial" w:cs="Arial" w:eastAsia="Arial" w:hAnsi="Arial"/>
+                <w:sz w:val="19"/>
+                <w:szCs w:val="19"/>
+              </w:rPr>
+              <w:t xml:space="preserve">The history and schools of terminology</w:t>
+            </w:r>
+          </w:p>
+        </w:tc>
+        <w:tc>
+          <w:tcPr>
+            <w:tcW w:type="dxa" w:w="4082"/>
+            <w:tcBorders>
+              <w:top w:val="single" w:color="000000" w:sz="4"/>
+              <w:left w:val="single" w:color="000000" w:sz="4"/>
+              <w:bottom w:val="single" w:color="000000" w:sz="4"/>
+              <w:right w:val="single" w:color="000000" w:sz="4"/>
+            </w:tcBorders>
+            <w:tcMar>
+              <w:top w:type="dxa" w:w="60"/>
+              <w:left w:type="dxa" w:w="100"/>
+              <w:bottom w:type="dxa" w:w="60"/>
+              <w:right w:type="dxa" w:w="100"/>
+            </w:tcMar>
+          </w:tcPr>
+          <w:p>
+            <w:pPr>
+              <w:spacing w:after="0" w:line="260"/>
+            </w:pPr>
+            <w:r>
+              <w:rPr>
+                <w:rFonts w:ascii="Arial" w:cs="Arial" w:eastAsia="Arial" w:hAnsi="Arial"/>
+                <w:sz w:val="19"/>
+                <w:szCs w:val="19"/>
+              </w:rPr>
+              <w:t xml:space="preserve">History is not needed to use terms well.</w:t>
+            </w:r>
+          </w:p>
+        </w:tc>
+      </w:tr>
+      <w:tr>
+        <w:trPr>
+          <w:cantSplit/>
+        </w:trPr>
+        <w:tc>
+          <w:tcPr>
+            <w:tcW w:type="dxa" w:w="4989"/>
+            <w:tcBorders>
+              <w:top w:val="single" w:color="000000" w:sz="4"/>
+              <w:left w:val="single" w:color="000000" w:sz="4"/>
+              <w:bottom w:val="single" w:color="000000" w:sz="4"/>
+              <w:right w:val="single" w:color="000000" w:sz="4"/>
+            </w:tcBorders>
+            <w:tcMar>
+              <w:top w:type="dxa" w:w="60"/>
+              <w:left w:type="dxa" w:w="100"/>
+              <w:bottom w:type="dxa" w:w="60"/>
+              <w:right w:type="dxa" w:w="100"/>
+            </w:tcMar>
+          </w:tcPr>
+          <w:p>
+            <w:pPr>
+              <w:spacing w:after="0" w:line="260"/>
+            </w:pPr>
+            <w:r>
+              <w:rPr>
+                <w:rFonts w:ascii="Arial" w:cs="Arial" w:eastAsia="Arial" w:hAnsi="Arial"/>
+                <w:sz w:val="19"/>
+                <w:szCs w:val="19"/>
+              </w:rPr>
+              <w:t xml:space="preserve">The categories of terms by function, meaning and origin; most of the nine naming rules</w:t>
+            </w:r>
+          </w:p>
+        </w:tc>
+        <w:tc>
+          <w:tcPr>
+            <w:tcW w:type="dxa" w:w="4082"/>
+            <w:tcBorders>
+              <w:top w:val="single" w:color="000000" w:sz="4"/>
+              <w:left w:val="single" w:color="000000" w:sz="4"/>
+              <w:bottom w:val="single" w:color="000000" w:sz="4"/>
+              <w:right w:val="single" w:color="000000" w:sz="4"/>
+            </w:tcBorders>
+            <w:tcMar>
+              <w:top w:type="dxa" w:w="60"/>
+              <w:left w:type="dxa" w:w="100"/>
+              <w:bottom w:type="dxa" w:w="60"/>
+              <w:right w:type="dxa" w:w="100"/>
+            </w:tcMar>
+          </w:tcPr>
+          <w:p>
+            <w:pPr>
+              <w:spacing w:after="0" w:line="260"/>
+            </w:pPr>
+            <w:r>
+              <w:rPr>
+                <w:rFonts w:ascii="Arial" w:cs="Arial" w:eastAsia="Arial" w:hAnsi="Arial"/>
+                <w:sz w:val="19"/>
+                <w:szCs w:val="19"/>
+              </w:rPr>
+              <w:t xml:space="preserve">Too theoretical for beginners; the practical rules are kept.</w:t>
+            </w:r>
+          </w:p>
+        </w:tc>
+      </w:tr>
+      <w:tr>
+        <w:trPr>
+          <w:cantSplit/>
+        </w:trPr>
+        <w:tc>
+          <w:tcPr>
+            <w:tcW w:type="dxa" w:w="4989"/>
+            <w:tcBorders>
+              <w:top w:val="single" w:color="000000" w:sz="4"/>
+              <w:left w:val="single" w:color="000000" w:sz="4"/>
+              <w:bottom w:val="single" w:color="000000" w:sz="4"/>
+              <w:right w:val="single" w:color="000000" w:sz="4"/>
+            </w:tcBorders>
+            <w:tcMar>
+              <w:top w:type="dxa" w:w="60"/>
+              <w:left w:type="dxa" w:w="100"/>
+              <w:bottom w:type="dxa" w:w="60"/>
+              <w:right w:type="dxa" w:w="100"/>
+            </w:tcMar>
+          </w:tcPr>
+          <w:p>
+            <w:pPr>
+              <w:spacing w:after="0" w:line="260"/>
+            </w:pPr>
+            <w:r>
+              <w:rPr>
+                <w:rFonts w:ascii="Arial" w:cs="Arial" w:eastAsia="Arial" w:hAnsi="Arial"/>
+                <w:sz w:val="19"/>
+                <w:szCs w:val="19"/>
+              </w:rPr>
+              <w:t xml:space="preserve">The standardisation bodies (ISO, IEC, ITU) and the academies’ approval procedures</w:t>
+            </w:r>
+          </w:p>
+        </w:tc>
+        <w:tc>
+          <w:tcPr>
+            <w:tcW w:type="dxa" w:w="4082"/>
+            <w:tcBorders>
+              <w:top w:val="single" w:color="000000" w:sz="4"/>
+              <w:left w:val="single" w:color="000000" w:sz="4"/>
+              <w:bottom w:val="single" w:color="000000" w:sz="4"/>
+              <w:right w:val="single" w:color="000000" w:sz="4"/>
+            </w:tcBorders>
+            <w:tcMar>
+              <w:top w:type="dxa" w:w="60"/>
+              <w:left w:type="dxa" w:w="100"/>
+              <w:bottom w:type="dxa" w:w="60"/>
+              <w:right w:type="dxa" w:w="100"/>
+            </w:tcMar>
+          </w:tcPr>
+          <w:p>
+            <w:pPr>
+              <w:spacing w:after="0" w:line="260"/>
+            </w:pPr>
+            <w:r>
+              <w:rPr>
+                <w:rFonts w:ascii="Arial" w:cs="Arial" w:eastAsia="Arial" w:hAnsi="Arial"/>
+                <w:sz w:val="19"/>
+                <w:szCs w:val="19"/>
+              </w:rPr>
+              <w:t xml:space="preserve">Too detailed for a first handbook.</w:t>
+            </w:r>
+          </w:p>
+        </w:tc>
+      </w:tr>
+      <w:tr>
+        <w:trPr>
+          <w:cantSplit/>
+        </w:trPr>
+        <w:tc>
+          <w:tcPr>
+            <w:tcW w:type="dxa" w:w="4989"/>
+            <w:tcBorders>
+              <w:top w:val="single" w:color="000000" w:sz="4"/>
+              <w:left w:val="single" w:color="000000" w:sz="4"/>
+              <w:bottom w:val="single" w:color="000000" w:sz="4"/>
+              <w:right w:val="single" w:color="000000" w:sz="4"/>
+            </w:tcBorders>
+            <w:tcMar>
+              <w:top w:type="dxa" w:w="60"/>
+              <w:left w:type="dxa" w:w="100"/>
+              <w:bottom w:type="dxa" w:w="60"/>
+              <w:right w:type="dxa" w:w="100"/>
+            </w:tcMar>
+          </w:tcPr>
+          <w:p>
+            <w:pPr>
+              <w:spacing w:after="0" w:line="260"/>
+            </w:pPr>
+            <w:r>
+              <w:rPr>
+                <w:rFonts w:ascii="Arial" w:cs="Arial" w:eastAsia="Arial" w:hAnsi="Arial"/>
+                <w:sz w:val="19"/>
+                <w:szCs w:val="19"/>
+              </w:rPr>
+              <w:t xml:space="preserve">The format for citing references</w:t>
+            </w:r>
+          </w:p>
+        </w:tc>
+        <w:tc>
+          <w:tcPr>
+            <w:tcW w:type="dxa" w:w="4082"/>
+            <w:tcBorders>
+              <w:top w:val="single" w:color="000000" w:sz="4"/>
+              <w:left w:val="single" w:color="000000" w:sz="4"/>
+              <w:bottom w:val="single" w:color="000000" w:sz="4"/>
+              <w:right w:val="single" w:color="000000" w:sz="4"/>
+            </w:tcBorders>
+            <w:tcMar>
+              <w:top w:type="dxa" w:w="60"/>
+              <w:left w:type="dxa" w:w="100"/>
+              <w:bottom w:type="dxa" w:w="60"/>
+              <w:right w:type="dxa" w:w="100"/>
+            </w:tcMar>
+          </w:tcPr>
+          <w:p>
+            <w:pPr>
+              <w:spacing w:after="0" w:line="260"/>
+            </w:pPr>
+            <w:r>
+              <w:rPr>
+                <w:rFonts w:ascii="Arial" w:cs="Arial" w:eastAsia="Arial" w:hAnsi="Arial"/>
+                <w:sz w:val="19"/>
+                <w:szCs w:val="19"/>
+              </w:rPr>
+              <w:t xml:space="preserve">It belongs to the References style, not to the text.</w:t>
+            </w:r>
+          </w:p>
+        </w:tc>
+      </w:tr>
+      <w:tr>
+        <w:trPr>
+          <w:cantSplit/>
+        </w:trPr>
+        <w:tc>
+          <w:tcPr>
+            <w:tcW w:type="dxa" w:w="4989"/>
+            <w:tcBorders>
+              <w:top w:val="single" w:color="000000" w:sz="4"/>
+              <w:left w:val="single" w:color="000000" w:sz="4"/>
+              <w:bottom w:val="single" w:color="000000" w:sz="4"/>
+              <w:right w:val="single" w:color="000000" w:sz="4"/>
+            </w:tcBorders>
+            <w:tcMar>
+              <w:top w:type="dxa" w:w="60"/>
+              <w:left w:type="dxa" w:w="100"/>
+              <w:bottom w:type="dxa" w:w="60"/>
+              <w:right w:type="dxa" w:w="100"/>
+            </w:tcMar>
+          </w:tcPr>
+          <w:p>
+            <w:pPr>
+              <w:spacing w:after="0" w:line="260"/>
+            </w:pPr>
+            <w:r>
+              <w:rPr>
+                <w:rFonts w:ascii="Arial" w:cs="Arial" w:eastAsia="Arial" w:hAnsi="Arial"/>
+                <w:sz w:val="19"/>
+                <w:szCs w:val="19"/>
+              </w:rPr>
+              <w:t xml:space="preserve">Most of the idiom list</w:t>
+            </w:r>
+          </w:p>
+        </w:tc>
+        <w:tc>
+          <w:tcPr>
+            <w:tcW w:type="dxa" w:w="4082"/>
+            <w:tcBorders>
+              <w:top w:val="single" w:color="000000" w:sz="4"/>
+              <w:left w:val="single" w:color="000000" w:sz="4"/>
+              <w:bottom w:val="single" w:color="000000" w:sz="4"/>
+              <w:right w:val="single" w:color="000000" w:sz="4"/>
+            </w:tcBorders>
+            <w:tcMar>
+              <w:top w:type="dxa" w:w="60"/>
+              <w:left w:type="dxa" w:w="100"/>
+              <w:bottom w:type="dxa" w:w="60"/>
+              <w:right w:type="dxa" w:w="100"/>
+            </w:tcMar>
+          </w:tcPr>
+          <w:p>
+            <w:pPr>
+              <w:spacing w:after="0" w:line="260"/>
+            </w:pPr>
+            <w:r>
+              <w:rPr>
+                <w:rFonts w:ascii="Arial" w:cs="Arial" w:eastAsia="Arial" w:hAnsi="Arial"/>
+                <w:sz w:val="19"/>
+                <w:szCs w:val="19"/>
+              </w:rPr>
+              <w:t xml:space="preserve">Mostly American slang, and some items concern drinking; the common idioms are already in Chapter 9.</w:t>
+            </w:r>
+          </w:p>
+        </w:tc>
+      </w:tr>
+    </w:tbl>
+    <w:p>
+      <w:pPr>
+        <w:spacing w:after="160"/>
+      </w:pPr>
+    </w:p>
+    <w:p>
+      <w:pPr>
+        <w:pStyle w:val="Heading1"/>
+      </w:pPr>
+      <w:r>
+        <w:t xml:space="preserve">5. Loulwah Bin Saeed</w:t>
+      </w:r>
+    </w:p>
+    <w:p>
+      <w:pPr>
+        <w:pStyle w:val="Heading2"/>
+      </w:pPr>
+      <w:r>
+        <w:t xml:space="preserve">5.1 Added to the handbook</w:t>
+      </w:r>
+    </w:p>
+    <w:p>
+      <w:pPr>
+        <w:pStyle w:val="ListParagraph"/>
+        <w:numPr>
+          <w:ilvl w:val="0"/>
+          <w:numId w:val="2"/>
+        </w:numPr>
+        <w:spacing w:after="80" w:line="290"/>
+      </w:pPr>
+      <w:r>
+        <w:rPr>
+          <w:rFonts w:ascii="Arial" w:cs="Arial" w:eastAsia="Arial" w:hAnsi="Arial"/>
+          <w:b/>
+          <w:bCs/>
+        </w:rPr>
+        <w:t xml:space="preserve">From her audiovisual translation notes</w:t>
+      </w:r>
+      <w:r>
+        <w:rPr>
+          <w:rFonts w:ascii="Arial" w:cs="Arial" w:eastAsia="Arial" w:hAnsi="Arial"/>
+        </w:rPr>
+        <w:t xml:space="preserve">, the core of Chapters 26 and 27: why the field matters; its main types; dubbing; purpose first (Skopos theory); subtitles; the link between words, images and sound; language variety; cultural references; subtitling strategies; taboo language.</w:t>
+      </w:r>
+    </w:p>
+    <w:p>
+      <w:pPr>
+        <w:pStyle w:val="ListParagraph"/>
+        <w:numPr>
+          <w:ilvl w:val="0"/>
+          <w:numId w:val="2"/>
+        </w:numPr>
+        <w:spacing w:after="80" w:line="290"/>
+      </w:pPr>
+      <w:r>
+        <w:rPr>
+          <w:rFonts w:ascii="Arial" w:cs="Arial" w:eastAsia="Arial" w:hAnsi="Arial"/>
+          <w:b/>
+          <w:bCs/>
+        </w:rPr>
+        <w:t xml:space="preserve">Her suggestion</w:t>
+      </w:r>
+      <w:r>
+        <w:rPr>
+          <w:rFonts w:ascii="Arial" w:cs="Arial" w:eastAsia="Arial" w:hAnsi="Arial"/>
+        </w:rPr>
+        <w:t xml:space="preserve"> to include the dictionaries that helped the team, and how to use them: Chapter 3, “Printed and digital dictionaries”, now placed in Part 1 so that students learn to use a dictionary before anything else.</w:t>
+      </w:r>
+    </w:p>
+    <w:p>
+      <w:pPr>
+        <w:spacing w:after="60"/>
+      </w:pPr>
+    </w:p>
+    <w:p>
+      <w:pPr>
+        <w:pStyle w:val="Heading2"/>
+      </w:pPr>
+      <w:r>
+        <w:t xml:space="preserve">5.2 Edited</w:t>
+      </w:r>
+    </w:p>
+    <w:p>
+      <w:pPr>
+        <w:spacing w:after="140" w:line="300"/>
+        <w:jc w:val="both"/>
+      </w:pPr>
+      <w:r>
+        <w:rPr>
+          <w:rFonts w:ascii="Arial" w:cs="Arial" w:eastAsia="Arial" w:hAnsi="Arial"/>
+        </w:rPr>
+        <w:t xml:space="preserve">The two lists of subtitling strategies were merged into one. The spelling of Vermeer, Díaz Cintas and Remael was corrected, and the line length was corrected to about 37 to 39 characters (up to 42 on streaming platforms).</w:t>
+      </w:r>
+    </w:p>
+    <w:p>
+      <w:pPr>
+        <w:pStyle w:val="Heading2"/>
+      </w:pPr>
+      <w:r>
+        <w:t xml:space="preserve">5.3 Removed, and why</w:t>
+      </w:r>
+    </w:p>
+    <w:tbl>
+      <w:tblPr>
+        <w:tblW w:type="dxa" w:w="9071"/>
+        <w:tblBorders>
+          <w:top w:val="single" w:color="auto" w:sz="4"/>
+          <w:left w:val="single" w:color="auto" w:sz="4"/>
+          <w:bottom w:val="single" w:color="auto" w:sz="4"/>
+          <w:right w:val="single" w:color="auto" w:sz="4"/>
+          <w:insideH w:val="single" w:color="auto" w:sz="4"/>
+          <w:insideV w:val="single" w:color="auto" w:sz="4"/>
+        </w:tblBorders>
+      </w:tblPr>
+      <w:tblGrid>
+        <w:gridCol w:w="4989"/>
+        <w:gridCol w:w="4082"/>
+      </w:tblGrid>
+      <w:tr>
+        <w:trPr>
+          <w:tblHeader/>
+        </w:trPr>
+        <w:tc>
+          <w:tcPr>
+            <w:tcW w:type="dxa" w:w="4989"/>
+            <w:tcBorders>
+              <w:top w:val="single" w:color="000000" w:sz="4"/>
+              <w:left w:val="single" w:color="000000" w:sz="4"/>
+              <w:bottom w:val="single" w:color="000000" w:sz="4"/>
+              <w:right w:val="single" w:color="000000" w:sz="4"/>
+            </w:tcBorders>
+            <w:tcMar>
+              <w:top w:type="dxa" w:w="60"/>
+              <w:left w:type="dxa" w:w="100"/>
+              <w:bottom w:type="dxa" w:w="60"/>
+              <w:right w:type="dxa" w:w="100"/>
+            </w:tcMar>
+          </w:tcPr>
+          <w:p>
+            <w:pPr>
+              <w:spacing w:after="0" w:line="260"/>
+            </w:pPr>
+            <w:r>
+              <w:rPr>
+                <w:rFonts w:ascii="Arial" w:cs="Arial" w:eastAsia="Arial" w:hAnsi="Arial"/>
+                <w:b/>
+                <w:bCs/>
+                <w:sz w:val="19"/>
+                <w:szCs w:val="19"/>
+              </w:rPr>
+              <w:t xml:space="preserve">Removed</w:t>
+            </w:r>
+          </w:p>
+        </w:tc>
+        <w:tc>
+          <w:tcPr>
+            <w:tcW w:type="dxa" w:w="4082"/>
+            <w:tcBorders>
+              <w:top w:val="single" w:color="000000" w:sz="4"/>
+              <w:left w:val="single" w:color="000000" w:sz="4"/>
+              <w:bottom w:val="single" w:color="000000" w:sz="4"/>
+              <w:right w:val="single" w:color="000000" w:sz="4"/>
+            </w:tcBorders>
+            <w:tcMar>
+              <w:top w:type="dxa" w:w="60"/>
+              <w:left w:type="dxa" w:w="100"/>
+              <w:bottom w:type="dxa" w:w="60"/>
+              <w:right w:type="dxa" w:w="100"/>
+            </w:tcMar>
+          </w:tcPr>
+          <w:p>
+            <w:pPr>
+              <w:spacing w:after="0" w:line="260"/>
+            </w:pPr>
+            <w:r>
+              <w:rPr>
+                <w:rFonts w:ascii="Arial" w:cs="Arial" w:eastAsia="Arial" w:hAnsi="Arial"/>
+                <w:b/>
+                <w:bCs/>
+                <w:sz w:val="19"/>
+                <w:szCs w:val="19"/>
+              </w:rPr>
+              <w:t xml:space="preserve">Why</w:t>
+            </w:r>
+          </w:p>
+        </w:tc>
+      </w:tr>
+      <w:tr>
+        <w:trPr>
+          <w:cantSplit/>
+        </w:trPr>
+        <w:tc>
+          <w:tcPr>
+            <w:tcW w:type="dxa" w:w="4989"/>
+            <w:tcBorders>
+              <w:top w:val="single" w:color="000000" w:sz="4"/>
+              <w:left w:val="single" w:color="000000" w:sz="4"/>
+              <w:bottom w:val="single" w:color="000000" w:sz="4"/>
+              <w:right w:val="single" w:color="000000" w:sz="4"/>
+            </w:tcBorders>
+            <w:tcMar>
+              <w:top w:type="dxa" w:w="60"/>
+              <w:left w:type="dxa" w:w="100"/>
+              <w:bottom w:type="dxa" w:w="60"/>
+              <w:right w:type="dxa" w:w="100"/>
+            </w:tcMar>
+          </w:tcPr>
+          <w:p>
+            <w:pPr>
+              <w:spacing w:after="0" w:line="260"/>
+            </w:pPr>
+            <w:r>
+              <w:rPr>
+                <w:rFonts w:ascii="Arial" w:cs="Arial" w:eastAsia="Arial" w:hAnsi="Arial"/>
+                <w:sz w:val="19"/>
+                <w:szCs w:val="19"/>
+              </w:rPr>
+              <w:t xml:space="preserve">The history of the field and three of the four theories</w:t>
+            </w:r>
+          </w:p>
+        </w:tc>
+        <w:tc>
+          <w:tcPr>
+            <w:tcW w:type="dxa" w:w="4082"/>
+            <w:tcBorders>
+              <w:top w:val="single" w:color="000000" w:sz="4"/>
+              <w:left w:val="single" w:color="000000" w:sz="4"/>
+              <w:bottom w:val="single" w:color="000000" w:sz="4"/>
+              <w:right w:val="single" w:color="000000" w:sz="4"/>
+            </w:tcBorders>
+            <w:tcMar>
+              <w:top w:type="dxa" w:w="60"/>
+              <w:left w:type="dxa" w:w="100"/>
+              <w:bottom w:type="dxa" w:w="60"/>
+              <w:right w:type="dxa" w:w="100"/>
+            </w:tcMar>
+          </w:tcPr>
+          <w:p>
+            <w:pPr>
+              <w:spacing w:after="0" w:line="260"/>
+            </w:pPr>
+            <w:r>
+              <w:rPr>
+                <w:rFonts w:ascii="Arial" w:cs="Arial" w:eastAsia="Arial" w:hAnsi="Arial"/>
+                <w:sz w:val="19"/>
+                <w:szCs w:val="19"/>
+              </w:rPr>
+              <w:t xml:space="preserve">Theory beyond what a beginner needs.</w:t>
+            </w:r>
+          </w:p>
+        </w:tc>
+      </w:tr>
+      <w:tr>
+        <w:trPr>
+          <w:cantSplit/>
+        </w:trPr>
+        <w:tc>
+          <w:tcPr>
+            <w:tcW w:type="dxa" w:w="4989"/>
+            <w:tcBorders>
+              <w:top w:val="single" w:color="000000" w:sz="4"/>
+              <w:left w:val="single" w:color="000000" w:sz="4"/>
+              <w:bottom w:val="single" w:color="000000" w:sz="4"/>
+              <w:right w:val="single" w:color="000000" w:sz="4"/>
+            </w:tcBorders>
+            <w:tcMar>
+              <w:top w:type="dxa" w:w="60"/>
+              <w:left w:type="dxa" w:w="100"/>
+              <w:bottom w:type="dxa" w:w="60"/>
+              <w:right w:type="dxa" w:w="100"/>
+            </w:tcMar>
+          </w:tcPr>
+          <w:p>
+            <w:pPr>
+              <w:spacing w:after="0" w:line="260"/>
+            </w:pPr>
+            <w:r>
+              <w:rPr>
+                <w:rFonts w:ascii="Arial" w:cs="Arial" w:eastAsia="Arial" w:hAnsi="Arial"/>
+                <w:sz w:val="19"/>
+                <w:szCs w:val="19"/>
+              </w:rPr>
+              <w:t xml:space="preserve">The summary on audiovisual translation in the Arab world; several minor types</w:t>
+            </w:r>
+          </w:p>
+        </w:tc>
+        <w:tc>
+          <w:tcPr>
+            <w:tcW w:type="dxa" w:w="4082"/>
+            <w:tcBorders>
+              <w:top w:val="single" w:color="000000" w:sz="4"/>
+              <w:left w:val="single" w:color="000000" w:sz="4"/>
+              <w:bottom w:val="single" w:color="000000" w:sz="4"/>
+              <w:right w:val="single" w:color="000000" w:sz="4"/>
+            </w:tcBorders>
+            <w:tcMar>
+              <w:top w:type="dxa" w:w="60"/>
+              <w:left w:type="dxa" w:w="100"/>
+              <w:bottom w:type="dxa" w:w="60"/>
+              <w:right w:type="dxa" w:w="100"/>
+            </w:tcMar>
+          </w:tcPr>
+          <w:p>
+            <w:pPr>
+              <w:spacing w:after="0" w:line="260"/>
+            </w:pPr>
+            <w:r>
+              <w:rPr>
+                <w:rFonts w:ascii="Arial" w:cs="Arial" w:eastAsia="Arial" w:hAnsi="Arial"/>
+                <w:sz w:val="19"/>
+                <w:szCs w:val="19"/>
+              </w:rPr>
+              <w:t xml:space="preserve">Kept short so that Part 9 stays practical.</w:t>
+            </w:r>
+          </w:p>
+        </w:tc>
+      </w:tr>
+      <w:tr>
+        <w:trPr>
+          <w:cantSplit/>
+        </w:trPr>
+        <w:tc>
+          <w:tcPr>
+            <w:tcW w:type="dxa" w:w="4989"/>
+            <w:tcBorders>
+              <w:top w:val="single" w:color="000000" w:sz="4"/>
+              <w:left w:val="single" w:color="000000" w:sz="4"/>
+              <w:bottom w:val="single" w:color="000000" w:sz="4"/>
+              <w:right w:val="single" w:color="000000" w:sz="4"/>
+            </w:tcBorders>
+            <w:tcMar>
+              <w:top w:type="dxa" w:w="60"/>
+              <w:left w:type="dxa" w:w="100"/>
+              <w:bottom w:type="dxa" w:w="60"/>
+              <w:right w:type="dxa" w:w="100"/>
+            </w:tcMar>
+          </w:tcPr>
+          <w:p>
+            <w:pPr>
+              <w:spacing w:after="0" w:line="260"/>
+            </w:pPr>
+            <w:r>
+              <w:rPr>
+                <w:rFonts w:ascii="Arial" w:cs="Arial" w:eastAsia="Arial" w:hAnsi="Arial"/>
+                <w:sz w:val="19"/>
+                <w:szCs w:val="19"/>
+              </w:rPr>
+              <w:t xml:space="preserve">The YouTube links</w:t>
+            </w:r>
+          </w:p>
+        </w:tc>
+        <w:tc>
+          <w:tcPr>
+            <w:tcW w:type="dxa" w:w="4082"/>
+            <w:tcBorders>
+              <w:top w:val="single" w:color="000000" w:sz="4"/>
+              <w:left w:val="single" w:color="000000" w:sz="4"/>
+              <w:bottom w:val="single" w:color="000000" w:sz="4"/>
+              <w:right w:val="single" w:color="000000" w:sz="4"/>
+            </w:tcBorders>
+            <w:tcMar>
+              <w:top w:type="dxa" w:w="60"/>
+              <w:left w:type="dxa" w:w="100"/>
+              <w:bottom w:type="dxa" w:w="60"/>
+              <w:right w:type="dxa" w:w="100"/>
+            </w:tcMar>
+          </w:tcPr>
+          <w:p>
+            <w:pPr>
+              <w:spacing w:after="0" w:line="260"/>
+            </w:pPr>
+            <w:r>
+              <w:rPr>
+                <w:rFonts w:ascii="Arial" w:cs="Arial" w:eastAsia="Arial" w:hAnsi="Arial"/>
+                <w:sz w:val="19"/>
+                <w:szCs w:val="19"/>
+              </w:rPr>
+              <w:t xml:space="preserve">Links stop working in a printed book.</w:t>
+            </w:r>
+          </w:p>
+        </w:tc>
+      </w:tr>
+      <w:tr>
+        <w:trPr>
+          <w:cantSplit/>
+        </w:trPr>
+        <w:tc>
+          <w:tcPr>
+            <w:tcW w:type="dxa" w:w="4989"/>
+            <w:tcBorders>
+              <w:top w:val="single" w:color="000000" w:sz="4"/>
+              <w:left w:val="single" w:color="000000" w:sz="4"/>
+              <w:bottom w:val="single" w:color="000000" w:sz="4"/>
+              <w:right w:val="single" w:color="000000" w:sz="4"/>
+            </w:tcBorders>
+            <w:tcMar>
+              <w:top w:type="dxa" w:w="60"/>
+              <w:left w:type="dxa" w:w="100"/>
+              <w:bottom w:type="dxa" w:w="60"/>
+              <w:right w:type="dxa" w:w="100"/>
+            </w:tcMar>
+          </w:tcPr>
+          <w:p>
+            <w:pPr>
+              <w:spacing w:after="0" w:line="260"/>
+            </w:pPr>
+            <w:r>
+              <w:rPr>
+                <w:rFonts w:ascii="Arial" w:cs="Arial" w:eastAsia="Arial" w:hAnsi="Arial"/>
+                <w:sz w:val="19"/>
+                <w:szCs w:val="19"/>
+              </w:rPr>
+              <w:t xml:space="preserve">Her idiom notes</w:t>
+            </w:r>
+          </w:p>
+        </w:tc>
+        <w:tc>
+          <w:tcPr>
+            <w:tcW w:type="dxa" w:w="4082"/>
+            <w:tcBorders>
+              <w:top w:val="single" w:color="000000" w:sz="4"/>
+              <w:left w:val="single" w:color="000000" w:sz="4"/>
+              <w:bottom w:val="single" w:color="000000" w:sz="4"/>
+              <w:right w:val="single" w:color="000000" w:sz="4"/>
+            </w:tcBorders>
+            <w:tcMar>
+              <w:top w:type="dxa" w:w="60"/>
+              <w:left w:type="dxa" w:w="100"/>
+              <w:bottom w:type="dxa" w:w="60"/>
+              <w:right w:type="dxa" w:w="100"/>
+            </w:tcMar>
+          </w:tcPr>
+          <w:p>
+            <w:pPr>
+              <w:spacing w:after="0" w:line="260"/>
+            </w:pPr>
+            <w:r>
+              <w:rPr>
+                <w:rFonts w:ascii="Arial" w:cs="Arial" w:eastAsia="Arial" w:hAnsi="Arial"/>
+                <w:sz w:val="19"/>
+                <w:szCs w:val="19"/>
+              </w:rPr>
+              <w:t xml:space="preserve">Several entries needed correcting (</w:t>
+            </w:r>
+            <w:r>
+              <w:rPr>
+                <w:rFonts w:ascii="Arial" w:cs="Arial" w:eastAsia="Arial" w:hAnsi="Arial"/>
+                <w:i/>
+                <w:iCs/>
+                <w:sz w:val="19"/>
+                <w:szCs w:val="19"/>
+              </w:rPr>
+              <w:t xml:space="preserve">my cup runneth over</w:t>
+            </w:r>
+            <w:r>
+              <w:rPr>
+                <w:rFonts w:ascii="Arial" w:cs="Arial" w:eastAsia="Arial" w:hAnsi="Arial"/>
+                <w:sz w:val="19"/>
+                <w:szCs w:val="19"/>
+              </w:rPr>
+              <w:t xml:space="preserve">, </w:t>
+            </w:r>
+            <w:r>
+              <w:rPr>
+                <w:rFonts w:ascii="Arial" w:cs="Arial" w:eastAsia="Arial" w:hAnsi="Arial"/>
+                <w:i/>
+                <w:iCs/>
+                <w:sz w:val="19"/>
+                <w:szCs w:val="19"/>
+              </w:rPr>
+              <w:t xml:space="preserve">rear-view mirror</w:t>
+            </w:r>
+            <w:r>
+              <w:rPr>
+                <w:rFonts w:ascii="Arial" w:cs="Arial" w:eastAsia="Arial" w:hAnsi="Arial"/>
+                <w:sz w:val="19"/>
+                <w:szCs w:val="19"/>
+              </w:rPr>
+              <w:t xml:space="preserve">, </w:t>
+            </w:r>
+            <w:r>
+              <w:rPr>
+                <w:rFonts w:ascii="Arial" w:cs="Arial" w:eastAsia="Arial" w:hAnsi="Arial"/>
+                <w:i/>
+                <w:iCs/>
+                <w:sz w:val="19"/>
+                <w:szCs w:val="19"/>
+              </w:rPr>
+              <w:t xml:space="preserve">just deserts</w:t>
+            </w:r>
+            <w:r>
+              <w:rPr>
+                <w:rFonts w:ascii="Arial" w:cs="Arial" w:eastAsia="Arial" w:hAnsi="Arial"/>
+                <w:sz w:val="19"/>
+                <w:szCs w:val="19"/>
+              </w:rPr>
+              <w:t xml:space="preserve">) or were incomplete; most equivalents are colloquial.</w:t>
+            </w:r>
+          </w:p>
+        </w:tc>
+      </w:tr>
+      <w:tr>
+        <w:trPr>
+          <w:cantSplit/>
+        </w:trPr>
+        <w:tc>
+          <w:tcPr>
+            <w:tcW w:type="dxa" w:w="4989"/>
+            <w:tcBorders>
+              <w:top w:val="single" w:color="000000" w:sz="4"/>
+              <w:left w:val="single" w:color="000000" w:sz="4"/>
+              <w:bottom w:val="single" w:color="000000" w:sz="4"/>
+              <w:right w:val="single" w:color="000000" w:sz="4"/>
+            </w:tcBorders>
+            <w:tcMar>
+              <w:top w:type="dxa" w:w="60"/>
+              <w:left w:type="dxa" w:w="100"/>
+              <w:bottom w:type="dxa" w:w="60"/>
+              <w:right w:type="dxa" w:w="100"/>
+            </w:tcMar>
+          </w:tcPr>
+          <w:p>
+            <w:pPr>
+              <w:spacing w:after="0" w:line="260"/>
+            </w:pPr>
+            <w:r>
+              <w:rPr>
+                <w:rFonts w:ascii="Arial" w:cs="Arial" w:eastAsia="Arial" w:hAnsi="Arial"/>
+                <w:sz w:val="19"/>
+                <w:szCs w:val="19"/>
+              </w:rPr>
+              <w:t xml:space="preserve">The table of Kuwaiti expressions</w:t>
+            </w:r>
+          </w:p>
+        </w:tc>
+        <w:tc>
+          <w:tcPr>
+            <w:tcW w:type="dxa" w:w="4082"/>
+            <w:tcBorders>
+              <w:top w:val="single" w:color="000000" w:sz="4"/>
+              <w:left w:val="single" w:color="000000" w:sz="4"/>
+              <w:bottom w:val="single" w:color="000000" w:sz="4"/>
+              <w:right w:val="single" w:color="000000" w:sz="4"/>
+            </w:tcBorders>
+            <w:tcMar>
+              <w:top w:type="dxa" w:w="60"/>
+              <w:left w:type="dxa" w:w="100"/>
+              <w:bottom w:type="dxa" w:w="60"/>
+              <w:right w:type="dxa" w:w="100"/>
+            </w:tcMar>
+          </w:tcPr>
+          <w:p>
+            <w:pPr>
+              <w:spacing w:after="0" w:line="260"/>
+            </w:pPr>
+            <w:r>
+              <w:rPr>
+                <w:rFonts w:ascii="Arial" w:cs="Arial" w:eastAsia="Arial" w:hAnsi="Arial"/>
+                <w:sz w:val="19"/>
+                <w:szCs w:val="19"/>
+              </w:rPr>
+              <w:t xml:space="preserve">The handbook uses formal Arabic; the table would suit the website.</w:t>
+            </w:r>
+          </w:p>
+        </w:tc>
+      </w:tr>
+    </w:tbl>
+    <w:p>
+      <w:pPr>
+        <w:spacing w:after="160"/>
+      </w:pPr>
+    </w:p>
+    <w:p>
+      <w:pPr>
+        <w:spacing w:after="140" w:line="300"/>
+        <w:jc w:val="both"/>
+      </w:pPr>
+      <w:r>
+        <w:rPr>
+          <w:rFonts w:ascii="Arial" w:cs="Arial" w:eastAsia="Arial" w:hAnsi="Arial"/>
+        </w:rPr>
+        <w:t xml:space="preserve">Her other notes were lost, and her Principles of Translation notes did not reach the editor, so Chapters 3, 11, 14 and 22 were written from published sources.</w:t>
+      </w:r>
+    </w:p>
+    <w:p>
+      <w:pPr>
+        <w:pStyle w:val="Heading1"/>
+      </w:pPr>
+      <w:r>
+        <w:t xml:space="preserve">6. Shaikhah Alkhaledi</w:t>
+      </w:r>
+    </w:p>
+    <w:p>
+      <w:pPr>
+        <w:spacing w:after="140" w:line="300"/>
+        <w:jc w:val="both"/>
+      </w:pPr>
+      <w:r>
+        <w:rPr>
+          <w:rFonts w:ascii="Arial" w:cs="Arial" w:eastAsia="Arial" w:hAnsi="Arial"/>
+        </w:rPr>
+        <w:t xml:space="preserve">Shaikhah Alkhaledi edited the handbook and coordinated the project. Her work on it was:</w:t>
+      </w:r>
+    </w:p>
+    <w:p>
+      <w:pPr>
+        <w:pStyle w:val="ListParagraph"/>
+        <w:numPr>
+          <w:ilvl w:val="0"/>
+          <w:numId w:val="2"/>
+        </w:numPr>
+        <w:spacing w:after="80" w:line="290"/>
+      </w:pPr>
+      <w:r>
+        <w:rPr>
+          <w:rFonts w:ascii="Arial" w:cs="Arial" w:eastAsia="Arial" w:hAnsi="Arial"/>
+          <w:b/>
+          <w:bCs/>
+        </w:rPr>
+        <w:t xml:space="preserve">Framework</w:t>
+      </w:r>
+      <w:r>
+        <w:rPr>
+          <w:rFonts w:ascii="Arial" w:cs="Arial" w:eastAsia="Arial" w:hAnsi="Arial"/>
+        </w:rPr>
+        <w:t xml:space="preserve">: she compiled the first draft of the framework from the four members’ instructions and the team chat.</w:t>
+      </w:r>
+    </w:p>
+    <w:p>
+      <w:pPr>
+        <w:pStyle w:val="ListParagraph"/>
+        <w:numPr>
+          <w:ilvl w:val="0"/>
+          <w:numId w:val="2"/>
+        </w:numPr>
+        <w:spacing w:after="80" w:line="290"/>
+      </w:pPr>
+      <w:r>
+        <w:rPr>
+          <w:rFonts w:ascii="Arial" w:cs="Arial" w:eastAsia="Arial" w:hAnsi="Arial"/>
+          <w:b/>
+          <w:bCs/>
+        </w:rPr>
+        <w:t xml:space="preserve">Structure</w:t>
+      </w:r>
+      <w:r>
+        <w:rPr>
+          <w:rFonts w:ascii="Arial" w:cs="Arial" w:eastAsia="Arial" w:hAnsi="Arial"/>
+        </w:rPr>
+        <w:t xml:space="preserve">: she planned the 9 parts and 27 chapters in order from easy to hard, and moved the dictionaries chapter into Part 1.</w:t>
+      </w:r>
+    </w:p>
+    <w:p>
+      <w:pPr>
+        <w:pStyle w:val="ListParagraph"/>
+        <w:numPr>
+          <w:ilvl w:val="0"/>
+          <w:numId w:val="2"/>
+        </w:numPr>
+        <w:spacing w:after="80" w:line="290"/>
+      </w:pPr>
+      <w:r>
+        <w:rPr>
+          <w:rFonts w:ascii="Arial" w:cs="Arial" w:eastAsia="Arial" w:hAnsi="Arial"/>
+          <w:b/>
+          <w:bCs/>
+        </w:rPr>
+        <w:t xml:space="preserve">Writing and editing</w:t>
+      </w:r>
+      <w:r>
+        <w:rPr>
+          <w:rFonts w:ascii="Arial" w:cs="Arial" w:eastAsia="Arial" w:hAnsi="Arial"/>
+        </w:rPr>
+        <w:t xml:space="preserve">: she rewrote every chapter as a guided lesson (Where we are, numbered steps, Try it, Remember, Words to remember, Next), wrote </w:t>
+      </w:r>
+      <w:r>
+        <w:rPr>
+          <w:rFonts w:ascii="Arial" w:cs="Arial" w:eastAsia="Arial" w:hAnsi="Arial"/>
+          <w:b/>
+          <w:bCs/>
+        </w:rPr>
+        <w:t xml:space="preserve">Start here</w:t>
+      </w:r>
+      <w:r>
+        <w:rPr>
+          <w:rFonts w:ascii="Arial" w:cs="Arial" w:eastAsia="Arial" w:hAnsi="Arial"/>
+        </w:rPr>
+        <w:t xml:space="preserve"> for complete beginners and the closing section, </w:t>
+      </w:r>
+      <w:r>
+        <w:rPr>
+          <w:rFonts w:ascii="Arial" w:cs="Arial" w:eastAsia="Arial" w:hAnsi="Arial"/>
+          <w:b/>
+          <w:bCs/>
+        </w:rPr>
+        <w:t xml:space="preserve">Your journey continues</w:t>
+      </w:r>
+      <w:r>
+        <w:rPr>
+          <w:rFonts w:ascii="Arial" w:cs="Arial" w:eastAsia="Arial" w:hAnsi="Arial"/>
+        </w:rPr>
+        <w:t xml:space="preserve">, and proofread the whole book.</w:t>
+      </w:r>
+    </w:p>
+    <w:p>
+      <w:pPr>
+        <w:pStyle w:val="ListParagraph"/>
+        <w:numPr>
+          <w:ilvl w:val="0"/>
+          <w:numId w:val="2"/>
+        </w:numPr>
+        <w:spacing w:after="80" w:line="290"/>
+      </w:pPr>
+      <w:r>
+        <w:rPr>
+          <w:rFonts w:ascii="Arial" w:cs="Arial" w:eastAsia="Arial" w:hAnsi="Arial"/>
+          <w:b/>
+          <w:bCs/>
+        </w:rPr>
+        <w:t xml:space="preserve">Her study notes</w:t>
+      </w:r>
+      <w:r>
+        <w:rPr>
+          <w:rFonts w:ascii="Arial" w:cs="Arial" w:eastAsia="Arial" w:hAnsi="Arial"/>
+        </w:rPr>
+        <w:t xml:space="preserve">, used in Chapters 1, 4, 6–9, 14, 17, 19, 21, 22 and 26: for example the three kinds of translation; the verbs </w:t>
       </w:r>
       <w:r>
         <w:rPr>
@@ -1260,13 +3147,13 @@
           <w:i/>
           <w:iCs/>
         </w:rPr>
-        <w:t xml:space="preserve">manageable</w:t>
-      </w:r>
-      <w:r>
-        <w:rPr>
-          <w:rFonts w:ascii="Arial" w:cs="Arial" w:eastAsia="Arial" w:hAnsi="Arial"/>
-        </w:rPr>
-        <w:t xml:space="preserve"> and </w:t>
+        <w:t xml:space="preserve">be</w:t>
+      </w:r>
+      <w:r>
+        <w:rPr>
+          <w:rFonts w:ascii="Arial" w:cs="Arial" w:eastAsia="Arial" w:hAnsi="Arial"/>
+        </w:rPr>
+        <w:t xml:space="preserve">, </w:t>
       </w:r>
       <w:r>
         <w:rPr>
@@ -1274,39 +3161,13 @@
           <w:i/>
           <w:iCs/>
         </w:rPr>
-        <w:t xml:space="preserve">antibiotic</w:t>
-      </w:r>
-      <w:r>
-        <w:rPr>
-          <w:rFonts w:ascii="Arial" w:cs="Arial" w:eastAsia="Arial" w:hAnsi="Arial"/>
-        </w:rPr>
-        <w:t xml:space="preserve">, and the redundant term </w:t>
-      </w:r>
-      <w:r>
-        <w:rPr>
-          <w:rFonts w:ascii="Arial" w:cs="Arial" w:hAnsi="Arial"/>
-          <w:szCs w:val="23"/>
-          <w:rtl/>
-        </w:rPr>
-        <w:t xml:space="preserve">التطرّف الراديكالي</w:t>
-      </w:r>
-      <w:r>
-        <w:rPr>
-          <w:rFonts w:ascii="Arial" w:cs="Arial" w:eastAsia="Arial" w:hAnsi="Arial"/>
-        </w:rPr>
-        <w:t xml:space="preserve">. The chapter itself cited no sources, so I added them, together with UNTERM, Arabterm, a sample term list and medical examples.</w:t>
-      </w:r>
-    </w:p>
-    <w:p>
-      <w:pPr>
-        <w:spacing w:after="140" w:line="300"/>
-        <w:jc w:val="both"/>
-      </w:pPr>
-      <w:r>
-        <w:rPr>
-          <w:rFonts w:ascii="Arial" w:cs="Arial" w:eastAsia="Arial" w:hAnsi="Arial"/>
-        </w:rPr>
-        <w:t xml:space="preserve">Chapter 2, “Tips, advice and preparation”, follows her suggestion of an opening chapter that prepares students before they start. Several idioms on her list, such as </w:t>
+        <w:t xml:space="preserve">do</w:t>
+      </w:r>
+      <w:r>
+        <w:rPr>
+          <w:rFonts w:ascii="Arial" w:cs="Arial" w:eastAsia="Arial" w:hAnsi="Arial"/>
+        </w:rPr>
+        <w:t xml:space="preserve"> and </w:t>
       </w:r>
       <w:r>
         <w:rPr>
@@ -1314,13 +3175,13 @@
           <w:i/>
           <w:iCs/>
         </w:rPr>
-        <w:t xml:space="preserve">spill the beans</w:t>
-      </w:r>
-      <w:r>
-        <w:rPr>
-          <w:rFonts w:ascii="Arial" w:cs="Arial" w:eastAsia="Arial" w:hAnsi="Arial"/>
-        </w:rPr>
-        <w:t xml:space="preserve"> and </w:t>
+        <w:t xml:space="preserve">have</w:t>
+      </w:r>
+      <w:r>
+        <w:rPr>
+          <w:rFonts w:ascii="Arial" w:cs="Arial" w:eastAsia="Arial" w:hAnsi="Arial"/>
+        </w:rPr>
+        <w:t xml:space="preserve">; problems with single words; idioms; news headlines and the inverted pyramid; CAT tools and localisation; the Arabic dubbing of </w:t>
       </w:r>
       <w:r>
         <w:rPr>
@@ -1328,223 +3189,432 @@
           <w:i/>
           <w:iCs/>
         </w:rPr>
-        <w:t xml:space="preserve">raining cats and dogs</w:t>
-      </w:r>
-      <w:r>
-        <w:rPr>
-          <w:rFonts w:ascii="Arial" w:cs="Arial" w:eastAsia="Arial" w:hAnsi="Arial"/>
-        </w:rPr>
-        <w:t xml:space="preserve">, are already in Chapter 8; most of the others are American slang, so I did not add them.</w:t>
-      </w:r>
+        <w:t xml:space="preserve">The Simpsons</w:t>
+      </w:r>
+      <w:r>
+        <w:rPr>
+          <w:rFonts w:ascii="Arial" w:cs="Arial" w:eastAsia="Arial" w:hAnsi="Arial"/>
+        </w:rPr>
+        <w:t xml:space="preserve">.</w:t>
+      </w:r>
+    </w:p>
+    <w:p>
+      <w:pPr>
+        <w:pStyle w:val="ListParagraph"/>
+        <w:numPr>
+          <w:ilvl w:val="0"/>
+          <w:numId w:val="2"/>
+        </w:numPr>
+        <w:spacing w:after="80" w:line="290"/>
+      </w:pPr>
+      <w:r>
+        <w:rPr>
+          <w:rFonts w:ascii="Arial" w:cs="Arial" w:eastAsia="Arial" w:hAnsi="Arial"/>
+          <w:b/>
+          <w:bCs/>
+        </w:rPr>
+        <w:t xml:space="preserve">Her terminology class notes</w:t>
+      </w:r>
+      <w:r>
+        <w:rPr>
+          <w:rFonts w:ascii="Arial" w:cs="Arial" w:eastAsia="Arial" w:hAnsi="Arial"/>
+        </w:rPr>
+        <w:t xml:space="preserve">, extracted by her from the terminology course she took: the practical steps of Chapter 21 (terms of several words; reading about a new field and asking a specialist; checking a term’s parts against its context; confirming an equivalent in an original Arabic text; writing a one-sentence definition; terms with two accepted names).</w:t>
+      </w:r>
+    </w:p>
+    <w:p>
+      <w:pPr>
+        <w:pStyle w:val="ListParagraph"/>
+        <w:numPr>
+          <w:ilvl w:val="0"/>
+          <w:numId w:val="2"/>
+        </w:numPr>
+        <w:spacing w:after="80" w:line="290"/>
+      </w:pPr>
+      <w:r>
+        <w:rPr>
+          <w:rFonts w:ascii="Arial" w:cs="Arial" w:eastAsia="Arial" w:hAnsi="Arial"/>
+          <w:b/>
+          <w:bCs/>
+        </w:rPr>
+        <w:t xml:space="preserve">Additions from published sources</w:t>
+      </w:r>
+      <w:r>
+        <w:rPr>
+          <w:rFonts w:ascii="Arial" w:cs="Arial" w:eastAsia="Arial" w:hAnsi="Arial"/>
+        </w:rPr>
+        <w:t xml:space="preserve">, where the team’s material had gaps: the seven procedures (Chapter 13); communicative translation (Chapter 11); explicitation and implicitation (Chapter 14); genres (Chapter 19); common mistakes (Chapter 23); the risk matrix (Chapter 24).</w:t>
+      </w:r>
+    </w:p>
+    <w:p>
+      <w:pPr>
+        <w:pStyle w:val="ListParagraph"/>
+        <w:numPr>
+          <w:ilvl w:val="0"/>
+          <w:numId w:val="2"/>
+        </w:numPr>
+        <w:spacing w:after="80" w:line="290"/>
+      </w:pPr>
+      <w:r>
+        <w:rPr>
+          <w:rFonts w:ascii="Arial" w:cs="Arial" w:eastAsia="Arial" w:hAnsi="Arial"/>
+          <w:b/>
+          <w:bCs/>
+        </w:rPr>
+        <w:t xml:space="preserve">Her framework proposals now in the book</w:t>
+      </w:r>
+      <w:r>
+        <w:rPr>
+          <w:rFonts w:ascii="Arial" w:cs="Arial" w:eastAsia="Arial" w:hAnsi="Arial"/>
+        </w:rPr>
+        <w:t xml:space="preserve">: the translation brief (Chapter 2); the terminology guide (Chapters 17 and 21); genre guidance (Chapter 19); common pitfalls (Chapter 23); the risk matrix (Chapter 24); UNTERM and digital tools (Chapters 21 and 22).</w:t>
+      </w:r>
+    </w:p>
+    <w:p>
+      <w:pPr>
+        <w:pStyle w:val="ListParagraph"/>
+        <w:numPr>
+          <w:ilvl w:val="0"/>
+          <w:numId w:val="2"/>
+        </w:numPr>
+        <w:spacing w:after="80" w:line="290"/>
+      </w:pPr>
+      <w:r>
+        <w:rPr>
+          <w:rFonts w:ascii="Arial" w:cs="Arial" w:eastAsia="Arial" w:hAnsi="Arial"/>
+          <w:b/>
+          <w:bCs/>
+        </w:rPr>
+        <w:t xml:space="preserve">Design</w:t>
+      </w:r>
+      <w:r>
+        <w:rPr>
+          <w:rFonts w:ascii="Arial" w:cs="Arial" w:eastAsia="Arial" w:hAnsi="Arial"/>
+        </w:rPr>
+        <w:t xml:space="preserve">: the two covers (Midnight and Light), the page layout, the QR code, and the Translation Team’s website.</w:t>
+      </w:r>
+    </w:p>
+    <w:p>
+      <w:pPr>
+        <w:pStyle w:val="ListParagraph"/>
+        <w:numPr>
+          <w:ilvl w:val="0"/>
+          <w:numId w:val="2"/>
+        </w:numPr>
+        <w:spacing w:after="80" w:line="290"/>
+      </w:pPr>
+      <w:r>
+        <w:rPr>
+          <w:rFonts w:ascii="Arial" w:cs="Arial" w:eastAsia="Arial" w:hAnsi="Arial"/>
+          <w:b/>
+          <w:bCs/>
+        </w:rPr>
+        <w:t xml:space="preserve">The lasting edition</w:t>
+      </w:r>
+      <w:r>
+        <w:rPr>
+          <w:rFonts w:ascii="Arial" w:cs="Arial" w:eastAsia="Arial" w:hAnsi="Arial"/>
+        </w:rPr>
+        <w:t xml:space="preserve">: she reworked the book so that it can be used year after year: nothing in it depends on a date, an event or a product; every chapter ends with the next step; ten “Did you know?” boxes show why translation matters; and the closing section shows students how to keep learning.</w:t>
+      </w:r>
+    </w:p>
+    <w:p>
+      <w:pPr>
+        <w:spacing w:after="60"/>
+      </w:pPr>
+    </w:p>
+    <w:tbl>
+      <w:tblPr>
+        <w:tblW w:type="dxa" w:w="9071"/>
+        <w:tblBorders>
+          <w:top w:val="single" w:color="auto" w:sz="4"/>
+          <w:left w:val="single" w:color="auto" w:sz="4"/>
+          <w:bottom w:val="single" w:color="auto" w:sz="4"/>
+          <w:right w:val="single" w:color="auto" w:sz="4"/>
+          <w:insideH w:val="single" w:color="auto" w:sz="4"/>
+          <w:insideV w:val="single" w:color="auto" w:sz="4"/>
+        </w:tblBorders>
+      </w:tblPr>
+      <w:tblGrid>
+        <w:gridCol w:w="4989"/>
+        <w:gridCol w:w="4082"/>
+      </w:tblGrid>
+      <w:tr>
+        <w:trPr>
+          <w:tblHeader/>
+        </w:trPr>
+        <w:tc>
+          <w:tcPr>
+            <w:tcW w:type="dxa" w:w="4989"/>
+            <w:tcBorders>
+              <w:top w:val="single" w:color="000000" w:sz="4"/>
+              <w:left w:val="single" w:color="000000" w:sz="4"/>
+              <w:bottom w:val="single" w:color="000000" w:sz="4"/>
+              <w:right w:val="single" w:color="000000" w:sz="4"/>
+            </w:tcBorders>
+            <w:tcMar>
+              <w:top w:type="dxa" w:w="60"/>
+              <w:left w:type="dxa" w:w="100"/>
+              <w:bottom w:type="dxa" w:w="60"/>
+              <w:right w:type="dxa" w:w="100"/>
+            </w:tcMar>
+          </w:tcPr>
+          <w:p>
+            <w:pPr>
+              <w:spacing w:after="0" w:line="260"/>
+            </w:pPr>
+            <w:r>
+              <w:rPr>
+                <w:rFonts w:ascii="Arial" w:cs="Arial" w:eastAsia="Arial" w:hAnsi="Arial"/>
+                <w:b/>
+                <w:bCs/>
+                <w:sz w:val="19"/>
+                <w:szCs w:val="19"/>
+              </w:rPr>
+              <w:t xml:space="preserve">Her proposal left out</w:t>
+            </w:r>
+          </w:p>
+        </w:tc>
+        <w:tc>
+          <w:tcPr>
+            <w:tcW w:type="dxa" w:w="4082"/>
+            <w:tcBorders>
+              <w:top w:val="single" w:color="000000" w:sz="4"/>
+              <w:left w:val="single" w:color="000000" w:sz="4"/>
+              <w:bottom w:val="single" w:color="000000" w:sz="4"/>
+              <w:right w:val="single" w:color="000000" w:sz="4"/>
+            </w:tcBorders>
+            <w:tcMar>
+              <w:top w:type="dxa" w:w="60"/>
+              <w:left w:type="dxa" w:w="100"/>
+              <w:bottom w:type="dxa" w:w="60"/>
+              <w:right w:type="dxa" w:w="100"/>
+            </w:tcMar>
+          </w:tcPr>
+          <w:p>
+            <w:pPr>
+              <w:spacing w:after="0" w:line="260"/>
+            </w:pPr>
+            <w:r>
+              <w:rPr>
+                <w:rFonts w:ascii="Arial" w:cs="Arial" w:eastAsia="Arial" w:hAnsi="Arial"/>
+                <w:b/>
+                <w:bCs/>
+                <w:sz w:val="19"/>
+                <w:szCs w:val="19"/>
+              </w:rPr>
+              <w:t xml:space="preserve">Why</w:t>
+            </w:r>
+          </w:p>
+        </w:tc>
+      </w:tr>
+      <w:tr>
+        <w:trPr>
+          <w:cantSplit/>
+        </w:trPr>
+        <w:tc>
+          <w:tcPr>
+            <w:tcW w:type="dxa" w:w="4989"/>
+            <w:tcBorders>
+              <w:top w:val="single" w:color="000000" w:sz="4"/>
+              <w:left w:val="single" w:color="000000" w:sz="4"/>
+              <w:bottom w:val="single" w:color="000000" w:sz="4"/>
+              <w:right w:val="single" w:color="000000" w:sz="4"/>
+            </w:tcBorders>
+            <w:tcMar>
+              <w:top w:type="dxa" w:w="60"/>
+              <w:left w:type="dxa" w:w="100"/>
+              <w:bottom w:type="dxa" w:w="60"/>
+              <w:right w:type="dxa" w:w="100"/>
+            </w:tcMar>
+          </w:tcPr>
+          <w:p>
+            <w:pPr>
+              <w:spacing w:after="0" w:line="260"/>
+            </w:pPr>
+            <w:r>
+              <w:rPr>
+                <w:rFonts w:ascii="Arial" w:cs="Arial" w:eastAsia="Arial" w:hAnsi="Arial"/>
+                <w:sz w:val="19"/>
+                <w:szCs w:val="19"/>
+              </w:rPr>
+              <w:t xml:space="preserve">The parallel-texts step (“Intertextual Mapping Protocol”) and the ethics checklist (“Invisible Translator” audit)</w:t>
+            </w:r>
+          </w:p>
+        </w:tc>
+        <w:tc>
+          <w:tcPr>
+            <w:tcW w:type="dxa" w:w="4082"/>
+            <w:tcBorders>
+              <w:top w:val="single" w:color="000000" w:sz="4"/>
+              <w:left w:val="single" w:color="000000" w:sz="4"/>
+              <w:bottom w:val="single" w:color="000000" w:sz="4"/>
+              <w:right w:val="single" w:color="000000" w:sz="4"/>
+            </w:tcBorders>
+            <w:tcMar>
+              <w:top w:type="dxa" w:w="60"/>
+              <w:left w:type="dxa" w:w="100"/>
+              <w:bottom w:type="dxa" w:w="60"/>
+              <w:right w:type="dxa" w:w="100"/>
+            </w:tcMar>
+          </w:tcPr>
+          <w:p>
+            <w:pPr>
+              <w:spacing w:after="0" w:line="260"/>
+            </w:pPr>
+            <w:r>
+              <w:rPr>
+                <w:rFonts w:ascii="Arial" w:cs="Arial" w:eastAsia="Arial" w:hAnsi="Arial"/>
+                <w:sz w:val="19"/>
+                <w:szCs w:val="19"/>
+              </w:rPr>
+              <w:t xml:space="preserve">Kept for a later stage: they need texts and practice that belong on the website.</w:t>
+            </w:r>
+          </w:p>
+        </w:tc>
+      </w:tr>
+      <w:tr>
+        <w:trPr>
+          <w:cantSplit/>
+        </w:trPr>
+        <w:tc>
+          <w:tcPr>
+            <w:tcW w:type="dxa" w:w="4989"/>
+            <w:tcBorders>
+              <w:top w:val="single" w:color="000000" w:sz="4"/>
+              <w:left w:val="single" w:color="000000" w:sz="4"/>
+              <w:bottom w:val="single" w:color="000000" w:sz="4"/>
+              <w:right w:val="single" w:color="000000" w:sz="4"/>
+            </w:tcBorders>
+            <w:tcMar>
+              <w:top w:type="dxa" w:w="60"/>
+              <w:left w:type="dxa" w:w="100"/>
+              <w:bottom w:type="dxa" w:w="60"/>
+              <w:right w:type="dxa" w:w="100"/>
+            </w:tcMar>
+          </w:tcPr>
+          <w:p>
+            <w:pPr>
+              <w:spacing w:after="0" w:line="260"/>
+            </w:pPr>
+            <w:r>
+              <w:rPr>
+                <w:rFonts w:ascii="Arial" w:cs="Arial" w:eastAsia="Arial" w:hAnsi="Arial"/>
+                <w:sz w:val="19"/>
+                <w:szCs w:val="19"/>
+              </w:rPr>
+              <w:t xml:space="preserve">The practice section, the answer key and the checklists</w:t>
+            </w:r>
+          </w:p>
+        </w:tc>
+        <w:tc>
+          <w:tcPr>
+            <w:tcW w:type="dxa" w:w="4082"/>
+            <w:tcBorders>
+              <w:top w:val="single" w:color="000000" w:sz="4"/>
+              <w:left w:val="single" w:color="000000" w:sz="4"/>
+              <w:bottom w:val="single" w:color="000000" w:sz="4"/>
+              <w:right w:val="single" w:color="000000" w:sz="4"/>
+            </w:tcBorders>
+            <w:tcMar>
+              <w:top w:type="dxa" w:w="60"/>
+              <w:left w:type="dxa" w:w="100"/>
+              <w:bottom w:type="dxa" w:w="60"/>
+              <w:right w:type="dxa" w:w="100"/>
+            </w:tcMar>
+          </w:tcPr>
+          <w:p>
+            <w:pPr>
+              <w:spacing w:after="0" w:line="260"/>
+            </w:pPr>
+            <w:r>
+              <w:rPr>
+                <w:rFonts w:ascii="Arial" w:cs="Arial" w:eastAsia="Arial" w:hAnsi="Arial"/>
+                <w:sz w:val="19"/>
+                <w:szCs w:val="19"/>
+              </w:rPr>
+              <w:t xml:space="preserve">Removed by her decision to keep the handbook short.</w:t>
+            </w:r>
+          </w:p>
+        </w:tc>
+      </w:tr>
+      <w:tr>
+        <w:trPr>
+          <w:cantSplit/>
+        </w:trPr>
+        <w:tc>
+          <w:tcPr>
+            <w:tcW w:type="dxa" w:w="4989"/>
+            <w:tcBorders>
+              <w:top w:val="single" w:color="000000" w:sz="4"/>
+              <w:left w:val="single" w:color="000000" w:sz="4"/>
+              <w:bottom w:val="single" w:color="000000" w:sz="4"/>
+              <w:right w:val="single" w:color="000000" w:sz="4"/>
+            </w:tcBorders>
+            <w:tcMar>
+              <w:top w:type="dxa" w:w="60"/>
+              <w:left w:type="dxa" w:w="100"/>
+              <w:bottom w:type="dxa" w:w="60"/>
+              <w:right w:type="dxa" w:w="100"/>
+            </w:tcMar>
+          </w:tcPr>
+          <w:p>
+            <w:pPr>
+              <w:spacing w:after="0" w:line="260"/>
+            </w:pPr>
+            <w:r>
+              <w:rPr>
+                <w:rFonts w:ascii="Arial" w:cs="Arial" w:eastAsia="Arial" w:hAnsi="Arial"/>
+                <w:sz w:val="19"/>
+                <w:szCs w:val="19"/>
+              </w:rPr>
+              <w:t xml:space="preserve">The Practice Arena and the other website features</w:t>
+            </w:r>
+          </w:p>
+        </w:tc>
+        <w:tc>
+          <w:tcPr>
+            <w:tcW w:type="dxa" w:w="4082"/>
+            <w:tcBorders>
+              <w:top w:val="single" w:color="000000" w:sz="4"/>
+              <w:left w:val="single" w:color="000000" w:sz="4"/>
+              <w:bottom w:val="single" w:color="000000" w:sz="4"/>
+              <w:right w:val="single" w:color="000000" w:sz="4"/>
+            </w:tcBorders>
+            <w:tcMar>
+              <w:top w:type="dxa" w:w="60"/>
+              <w:left w:type="dxa" w:w="100"/>
+              <w:bottom w:type="dxa" w:w="60"/>
+              <w:right w:type="dxa" w:w="100"/>
+            </w:tcMar>
+          </w:tcPr>
+          <w:p>
+            <w:pPr>
+              <w:spacing w:after="0" w:line="260"/>
+            </w:pPr>
+            <w:r>
+              <w:rPr>
+                <w:rFonts w:ascii="Arial" w:cs="Arial" w:eastAsia="Arial" w:hAnsi="Arial"/>
+                <w:sz w:val="19"/>
+                <w:szCs w:val="19"/>
+              </w:rPr>
+              <w:t xml:space="preserve">They belong on the website, which carries what changes; the book carries what lasts.</w:t>
+            </w:r>
+          </w:p>
+        </w:tc>
+      </w:tr>
+    </w:tbl>
+    <w:p>
+      <w:pPr>
+        <w:spacing w:after="160"/>
+      </w:pPr>
     </w:p>
     <w:p>
       <w:pPr>
         <w:pStyle w:val="Heading1"/>
       </w:pPr>
       <w:r>
-        <w:t xml:space="preserve">5. Loulwah Bin Saeed</w:t>
-      </w:r>
-    </w:p>
-    <w:p>
-      <w:pPr>
-        <w:spacing w:after="140" w:line="300"/>
-        <w:jc w:val="both"/>
-      </w:pPr>
-      <w:r>
-        <w:rPr>
-          <w:rFonts w:ascii="Arial" w:cs="Arial" w:eastAsia="Arial" w:hAnsi="Arial"/>
-        </w:rPr>
-        <w:t xml:space="preserve">Chapters 26 and 27 come mainly from the audiovisual translation notes: why the field matters, its main types, dubbing, the idea that purpose comes first, subtitles, the link between words, images and sound, language variety, cultural references, subtitling strategies and taboo language.</w:t>
-      </w:r>
-    </w:p>
-    <w:p>
-      <w:pPr>
-        <w:spacing w:after="140" w:line="300"/>
-        <w:jc w:val="both"/>
-      </w:pPr>
-      <w:r>
-        <w:rPr>
-          <w:rFonts w:ascii="Arial" w:cs="Arial" w:eastAsia="Arial" w:hAnsi="Arial"/>
-        </w:rPr>
-        <w:t xml:space="preserve">I merged the two lists of subtitling strategies into one, corrected the spelling of Vermeer, Díaz Cintas and Remael, and changed the line length to the usual 37 to 39 characters (up to 42 on streaming platforms). The history of the field, three of the four theories, the summary on the Arab world and the YouTube links were not used: the theory goes beyond what a beginner needs, and links stop working in print. I added subtitle timing, subtitles for the deaf and hard of hearing, a five-step method, a worked example and rules for Arabic subtitles.</w:t>
-      </w:r>
-    </w:p>
-    <w:p>
-      <w:pPr>
-        <w:spacing w:after="140" w:line="300"/>
-        <w:jc w:val="both"/>
-      </w:pPr>
-      <w:r>
-        <w:rPr>
-          <w:rFonts w:ascii="Arial" w:cs="Arial" w:eastAsia="Arial" w:hAnsi="Arial"/>
-        </w:rPr>
-        <w:t xml:space="preserve">Loulwah posted the audiovisual files herself, which confirms they are her notes. Her other notes were lost, and her Principles of Translation notes did not reach me, so Chapters 10, 13, 20 and 22 were written from published sources. Her idiom list could not be used without corrections, and Chapter 8 already covers the common idioms.</w:t>
-      </w:r>
-    </w:p>
-    <w:p>
-      <w:pPr>
-        <w:pStyle w:val="Heading1"/>
-      </w:pPr>
-      <w:r>
-        <w:t xml:space="preserve">6. My own part</w:t>
-      </w:r>
-    </w:p>
-    <w:p>
-      <w:pPr>
-        <w:spacing w:after="140" w:line="300"/>
-        <w:jc w:val="both"/>
-      </w:pPr>
-      <w:r>
-        <w:rPr>
-          <w:rFonts w:ascii="Arial" w:cs="Arial" w:eastAsia="Arial" w:hAnsi="Arial"/>
-        </w:rPr>
-        <w:t xml:space="preserve">I planned the structure (9 parts, 27 chapters), rewrote every chapter as a guided lesson, wrote the opening section for complete beginners, and proofread the whole book twice. My study notes went into Chapters 1, 3, 5, 6, 7, 8, 13, 16, 18, 21, 22 and 26, for example the three kinds of translation, the verbs </w:t>
-      </w:r>
-      <w:r>
-        <w:rPr>
-          <w:rFonts w:ascii="Arial" w:cs="Arial" w:eastAsia="Arial" w:hAnsi="Arial"/>
-          <w:i/>
-          <w:iCs/>
-        </w:rPr>
-        <w:t xml:space="preserve">be</w:t>
-      </w:r>
-      <w:r>
-        <w:rPr>
-          <w:rFonts w:ascii="Arial" w:cs="Arial" w:eastAsia="Arial" w:hAnsi="Arial"/>
-        </w:rPr>
-        <w:t xml:space="preserve">, </w:t>
-      </w:r>
-      <w:r>
-        <w:rPr>
-          <w:rFonts w:ascii="Arial" w:cs="Arial" w:eastAsia="Arial" w:hAnsi="Arial"/>
-          <w:i/>
-          <w:iCs/>
-        </w:rPr>
-        <w:t xml:space="preserve">do</w:t>
-      </w:r>
-      <w:r>
-        <w:rPr>
-          <w:rFonts w:ascii="Arial" w:cs="Arial" w:eastAsia="Arial" w:hAnsi="Arial"/>
-        </w:rPr>
-        <w:t xml:space="preserve"> and </w:t>
-      </w:r>
-      <w:r>
-        <w:rPr>
-          <w:rFonts w:ascii="Arial" w:cs="Arial" w:eastAsia="Arial" w:hAnsi="Arial"/>
-          <w:i/>
-          <w:iCs/>
-        </w:rPr>
-        <w:t xml:space="preserve">have</w:t>
-      </w:r>
-      <w:r>
-        <w:rPr>
-          <w:rFonts w:ascii="Arial" w:cs="Arial" w:eastAsia="Arial" w:hAnsi="Arial"/>
-        </w:rPr>
-        <w:t xml:space="preserve">, problems with single words, idioms, news headlines, CAT tools, localisation and the Arabic dubbing of </w:t>
-      </w:r>
-      <w:r>
-        <w:rPr>
-          <w:rFonts w:ascii="Arial" w:cs="Arial" w:eastAsia="Arial" w:hAnsi="Arial"/>
-          <w:i/>
-          <w:iCs/>
-        </w:rPr>
-        <w:t xml:space="preserve">The Simpsons</w:t>
-      </w:r>
-      <w:r>
-        <w:rPr>
-          <w:rFonts w:ascii="Arial" w:cs="Arial" w:eastAsia="Arial" w:hAnsi="Arial"/>
-        </w:rPr>
-        <w:t xml:space="preserve">. Where the team’s material had gaps, I added sections from published sources, among them the seven procedures, communicative translation, explicitation and implicitation, genres, dictionaries, common mistakes and the risk matrix. I also designed the two covers, the layout, the QR code and the team’s website.</w:t>
-      </w:r>
-    </w:p>
-    <w:p>
-      <w:pPr>
-        <w:spacing w:after="140" w:line="300"/>
-        <w:jc w:val="both"/>
-      </w:pPr>
-      <w:r>
-        <w:rPr>
-          <w:rFonts w:ascii="Arial" w:cs="Arial" w:eastAsia="Arial" w:hAnsi="Arial"/>
-        </w:rPr>
-        <w:t xml:space="preserve">I also went through the slides of the terminology course I took and extracted the practical steps a beginner needs, which now guide Chapter 21: a term can be several words (</w:t>
-      </w:r>
-      <w:r>
-        <w:rPr>
-          <w:rFonts w:ascii="Arial" w:cs="Arial" w:eastAsia="Arial" w:hAnsi="Arial"/>
-          <w:i/>
-          <w:iCs/>
-        </w:rPr>
-        <w:t xml:space="preserve">network security</w:t>
-      </w:r>
-      <w:r>
-        <w:rPr>
-          <w:rFonts w:ascii="Arial" w:cs="Arial" w:eastAsia="Arial" w:hAnsi="Arial"/>
-        </w:rPr>
-        <w:t xml:space="preserve">); read a short introduction to a new field, and ask the client or a specialist when the meaning is unclear; do not trust a term’s parts alone (</w:t>
-      </w:r>
-      <w:r>
-        <w:rPr>
-          <w:rFonts w:ascii="Arial" w:cs="Arial" w:eastAsia="Arial" w:hAnsi="Arial"/>
-          <w:i/>
-          <w:iCs/>
-        </w:rPr>
-        <w:t xml:space="preserve">blackboard</w:t>
-      </w:r>
-      <w:r>
-        <w:rPr>
-          <w:rFonts w:ascii="Arial" w:cs="Arial" w:eastAsia="Arial" w:hAnsi="Arial"/>
-        </w:rPr>
-        <w:t xml:space="preserve">); confirm an equivalent in a text written in Arabic, not in a translation; write a one-sentence definition (</w:t>
-      </w:r>
-      <w:r>
-        <w:rPr>
-          <w:rFonts w:ascii="Arial" w:cs="Arial" w:eastAsia="Arial" w:hAnsi="Arial"/>
-          <w:i/>
-          <w:iCs/>
-        </w:rPr>
-        <w:t xml:space="preserve">thermometer</w:t>
-      </w:r>
-      <w:r>
-        <w:rPr>
-          <w:rFonts w:ascii="Arial" w:cs="Arial" w:eastAsia="Arial" w:hAnsi="Arial"/>
-        </w:rPr>
-        <w:t xml:space="preserve">); and choose one of two accepted names (</w:t>
-      </w:r>
-      <w:r>
-        <w:rPr>
-          <w:rFonts w:ascii="Arial" w:cs="Arial" w:eastAsia="Arial" w:hAnsi="Arial"/>
-          <w:i/>
-          <w:iCs/>
-        </w:rPr>
-        <w:t xml:space="preserve">aerial</w:t>
-      </w:r>
-      <w:r>
-        <w:rPr>
-          <w:rFonts w:ascii="Arial" w:cs="Arial" w:eastAsia="Arial" w:hAnsi="Arial"/>
-        </w:rPr>
-        <w:t xml:space="preserve"> / </w:t>
-      </w:r>
-      <w:r>
-        <w:rPr>
-          <w:rFonts w:ascii="Arial" w:cs="Arial" w:eastAsia="Arial" w:hAnsi="Arial"/>
-          <w:i/>
-          <w:iCs/>
-        </w:rPr>
-        <w:t xml:space="preserve">antenna</w:t>
-      </w:r>
-      <w:r>
-        <w:rPr>
-          <w:rFonts w:ascii="Arial" w:cs="Arial" w:eastAsia="Arial" w:hAnsi="Arial"/>
-        </w:rPr>
-        <w:t xml:space="preserve">). I left out the theory, the history of the field and the detailed record formats, which a beginner does not need.</w:t>
-      </w:r>
-    </w:p>
-    <w:p>
-      <w:pPr>
-        <w:pStyle w:val="Heading1"/>
-      </w:pPr>
-      <w:r>
-        <w:t xml:space="preserve">7. What I removed, and why</w:t>
+        <w:t xml:space="preserve">7. What was removed from the whole handbook, and why</w:t>
       </w:r>
     </w:p>
     <w:tbl>
@@ -1627,7 +3697,7 @@
                 <w:sz w:val="19"/>
                 <w:szCs w:val="19"/>
               </w:rPr>
-              <w:t xml:space="preserve">Reason</w:t>
+              <w:t xml:space="preserve">Why</w:t>
             </w:r>
           </w:p>
         </w:tc>
@@ -1662,7 +3732,7 @@
                 <w:sz w:val="19"/>
                 <w:szCs w:val="19"/>
               </w:rPr>
-              <w:t xml:space="preserve">Practice section and answer key</w:t>
+              <w:t xml:space="preserve">The practice section and its answer key</w:t>
             </w:r>
           </w:p>
         </w:tc>
@@ -1692,7 +3762,7 @@
                 <w:sz w:val="19"/>
                 <w:szCs w:val="19"/>
               </w:rPr>
-              <w:t xml:space="preserve">Too long for a handbook; each chapter still ends with questions and answers.</w:t>
+              <w:t xml:space="preserve">Too long for a handbook; each chapter ends with questions and answers.</w:t>
             </w:r>
           </w:p>
         </w:tc>
@@ -1792,7 +3862,7 @@
                 <w:sz w:val="19"/>
                 <w:szCs w:val="19"/>
               </w:rPr>
-              <w:t xml:space="preserve">Note on future editions</w:t>
+              <w:t xml:space="preserve">The note on future editions</w:t>
             </w:r>
           </w:p>
         </w:tc>
@@ -1822,7 +3892,7 @@
                 <w:sz w:val="19"/>
                 <w:szCs w:val="19"/>
               </w:rPr>
-              <w:t xml:space="preserve">A printed book cannot keep being updated; the website carries later material instead.</w:t>
+              <w:t xml:space="preserve">A printed book cannot keep being updated; the website carries later material.</w:t>
             </w:r>
           </w:p>
         </w:tc>
@@ -1887,7 +3957,7 @@
                 <w:sz w:val="19"/>
                 <w:szCs w:val="19"/>
               </w:rPr>
-              <w:t xml:space="preserve">Easier to read; the citations in brackets remain.</w:t>
+              <w:t xml:space="preserve">Easier reading; every idea keeps its citation in brackets.</w:t>
             </w:r>
           </w:p>
         </w:tc>
@@ -1922,7 +3992,7 @@
                 <w:sz w:val="19"/>
                 <w:szCs w:val="19"/>
               </w:rPr>
-              <w:t xml:space="preserve">References to the course and the lecturer</w:t>
+              <w:t xml:space="preserve">References to the course and the lecturers</w:t>
             </w:r>
           </w:p>
         </w:tc>
@@ -1987,7 +4057,7 @@
                 <w:sz w:val="19"/>
                 <w:szCs w:val="19"/>
               </w:rPr>
-              <w:t xml:space="preserve">Part descriptions and about a third of the text</w:t>
+              <w:t xml:space="preserve">Part descriptions and about a third of the running text</w:t>
             </w:r>
           </w:p>
         </w:tc>
@@ -2052,7 +4122,7 @@
                 <w:sz w:val="19"/>
                 <w:szCs w:val="19"/>
               </w:rPr>
-              <w:t xml:space="preserve">Concepts repeated from my notes</w:t>
+              <w:t xml:space="preserve">Examples tied to a date or event</w:t>
             </w:r>
           </w:p>
         </w:tc>
@@ -2082,7 +4152,7 @@
                 <w:sz w:val="19"/>
                 <w:szCs w:val="19"/>
               </w:rPr>
-              <w:t xml:space="preserve">Each concept appears once; the examples were kept.</w:t>
+              <w:t xml:space="preserve">So that the book stays valid every year.</w:t>
             </w:r>
           </w:p>
         </w:tc>
@@ -2117,7 +4187,7 @@
                 <w:sz w:val="19"/>
                 <w:szCs w:val="19"/>
               </w:rPr>
-              <w:t xml:space="preserve">Placeholders, the empty Dr Abdullah checklist, unconfirmed reviewers and the Guild Season</w:t>
+              <w:t xml:space="preserve">Placeholders, the empty checklist for the supervisor’s framework, unconfirmed reviewers and the Guild Season</w:t>
             </w:r>
           </w:p>
         </w:tc>
@@ -2163,7 +4233,7 @@
         <w:pStyle w:val="Heading1"/>
       </w:pPr>
       <w:r>
-        <w:t xml:space="preserve">8. My view</w:t>
+        <w:t xml:space="preserve">8. Assessment</w:t>
       </w:r>
     </w:p>
     <w:p>
@@ -2175,7 +4245,7 @@
         <w:rPr>
           <w:rFonts w:ascii="Arial" w:cs="Arial" w:eastAsia="Arial" w:hAnsi="Arial"/>
         </w:rPr>
-        <w:t xml:space="preserve">The team’s documents covered nearly everything the handbook needed. The draft followed the syllabus closely, and the terminology and audiovisual notes were detailed. What they needed was correction, shortening and a single order. The draft repeated itself, some examples were inaccurate and several claims had no source, while the specialist notes were written at a level above a beginner. Most of my work went into fixing these points and filling the gaps.</w:t>
+        <w:t xml:space="preserve">The team’s documents covered nearly everything the handbook needed. The draft followed the course closely, and the terminology and audiovisual notes were detailed. The work of editing was to correct, shorten and order this material, fill the gaps from published sources, and present it as one guided path for a reader who knows nothing about translation.</w:t>
       </w:r>
     </w:p>
     <w:p>
@@ -2187,7 +4257,7 @@
         <w:rPr>
           <w:rFonts w:ascii="Arial" w:cs="Arial" w:eastAsia="Arial" w:hAnsi="Arial"/>
         </w:rPr>
-        <w:t xml:space="preserve">In my opinion the handbook is ready for a final read by a native Arabic specialist, and for the supervisor’s approval once the points below and those in Section 7 of the Final Report are settled.</w:t>
+        <w:t xml:space="preserve">The handbook is ready for a final read by a native Arabic specialist, and for the supervisor’s approval once the points below and in Section 7 of the Final Report are settled.</w:t>
       </w:r>
     </w:p>
     <w:p>
@@ -2212,7 +4282,7 @@
           <w:rFonts w:ascii="Arial" w:cs="Arial" w:eastAsia="Arial" w:hAnsi="Arial"/>
           <w:color w:val="C00000"/>
         </w:rPr>
-        <w:t xml:space="preserve">Names and roles on the Contributors list (page iv).</w:t>
+        <w:t xml:space="preserve">Whether to list the four contributors alphabetically, as the framework agreed, and whether to name the academic supervisor, Abdullah Bezea.</w:t>
       </w:r>
     </w:p>
     <w:p>
@@ -2229,7 +4299,7 @@
           <w:rFonts w:ascii="Arial" w:cs="Arial" w:eastAsia="Arial" w:hAnsi="Arial"/>
           <w:color w:val="C00000"/>
         </w:rPr>
-        <w:t xml:space="preserve">Whether to list all four contributors alphabetically, as the framework agreed, and whether to name the academic supervisor, Abdullah Bezea.</w:t>
+        <w:t xml:space="preserve">The club’s official name: the handbook says “Guild Professional Club”; the team’s main document says “The Professional English Club: Guild”.</w:t>
       </w:r>
     </w:p>
     <w:p>
@@ -2246,7 +4316,7 @@
           <w:rFonts w:ascii="Arial" w:cs="Arial" w:eastAsia="Arial" w:hAnsi="Arial"/>
           <w:color w:val="C00000"/>
         </w:rPr>
-        <w:t xml:space="preserve">The club’s official name: the handbook says “Guild Professional Club”; the team’s main document says “The Professional English Club: Guild”.</w:t>
+        <w:t xml:space="preserve">The ten “Did you know?” facts: check each against a reference work before printing.</w:t>
       </w:r>
     </w:p>
     <w:p>
@@ -2263,41 +4333,7 @@
           <w:rFonts w:ascii="Arial" w:cs="Arial" w:eastAsia="Arial" w:hAnsi="Arial"/>
           <w:color w:val="C00000"/>
         </w:rPr>
-        <w:t xml:space="preserve">Whether Samiuallah Mohammad should be listed under supervision.</w:t>
-      </w:r>
-    </w:p>
-    <w:p>
-      <w:pPr>
-        <w:pStyle w:val="ListParagraph"/>
-        <w:numPr>
-          <w:ilvl w:val="0"/>
-          <w:numId w:val="2"/>
-        </w:numPr>
-        <w:spacing w:after="80" w:line="290"/>
-      </w:pPr>
-      <w:r>
-        <w:rPr>
-          <w:rFonts w:ascii="Arial" w:cs="Arial" w:eastAsia="Arial" w:hAnsi="Arial"/>
-          <w:color w:val="C00000"/>
-        </w:rPr>
-        <w:t xml:space="preserve">Any member not yet listed, and their contribution.</w:t>
-      </w:r>
-    </w:p>
-    <w:p>
-      <w:pPr>
-        <w:pStyle w:val="ListParagraph"/>
-        <w:numPr>
-          <w:ilvl w:val="0"/>
-          <w:numId w:val="2"/>
-        </w:numPr>
-        <w:spacing w:after="80" w:line="290"/>
-      </w:pPr>
-      <w:r>
-        <w:rPr>
-          <w:rFonts w:ascii="Arial" w:cs="Arial" w:eastAsia="Arial" w:hAnsi="Arial"/>
-          <w:color w:val="C00000"/>
-        </w:rPr>
-        <w:t xml:space="preserve">Whether the material not yet received should go into this edition.</w:t>
+        <w:t xml:space="preserve">Whether the material not yet received (Loulwah’s Principles of Translation notes, the Gamal article, Masooma’s Translation Texts, the sample analyses) should go into this edition.</w:t>
       </w:r>
     </w:p>
     <w:p>

</xml_diff>